<commit_message>
Review round 1: PEV calibration diagnostic, species-level tests, wording fixes
Co-Authored-By: Claude Opus 5.5 <noreply@anthropic.com>
Claude-Session: https://claude.ai/code/session_01CEw45wY536Kpddzc67ktHR
</commit_message>
<xml_diff>
--- a/Target_Journal_Submission/manuscript/Final_Manuscript.docx
+++ b/Target_Journal_Submission/manuscript/Final_Manuscript.docx
@@ -67,7 +67,7 @@
     </w:p>
     <w:p>
       <w:r>
-        <w:t>Genomic prediction guides selection in plant and animal breeding, but breeders acting on an individual prediction also need honest uncertainty. Distribution-free conformal prediction intervals assume that calibration individuals are exchangeable with selection candidates; we show that relatedness to the training population breaks this assumption. We measure each candidate's relatedness by the prediction error variance of genomic best linear unbiased prediction and propose kinship-aware conformal prediction, which calibrates on residuals from random and genomic-cluster cross-fitting, normalises them by this variance and localises the conformal quantile in relatedness. We compared it with seven alternatives on 24 traits from barley, common bean, lentil, loblolly pine, eastern oyster, maize, pig, rice, soybean and wheat, under random and cluster-out validation, with three prediction models, and in simulations on real genotypes. Intervals ignoring relatedness over-covered close relatives and under-covered distant candidates; for held-out clusters, split-conformal and cross-validation-plus intervals covered 0.828 and 0.838 of phenotypes at nominal 0.90, and the classical Gaussian interval 0.881. Kinship-aware intervals covered 0.894, with relatedness-conditional coverage error 0.036 against 0.079 and 0.052, and the smallest or joint-smallest error for all three predictors. Ablation showed that the calibration pool spanning distant relatives was decisive: a parametric calibration fitted to the same pool performed equally well. Prediction intervals for selection candidates should be calibrated along the relatedness axis, at the cost of about ten additional model fits.</w:t>
+        <w:t>Genomic prediction guides selection in plant and animal breeding, but breeders acting on an individual prediction also need honest uncertainty. Distribution-free conformal prediction intervals assume that calibration individuals are exchangeable with selection candidates; we show that relatedness to the training population breaks this assumption. We measure each candidate's relatedness by the prediction error variance of genomic best linear unbiased prediction and propose kinship-aware conformal prediction, which calibrates on residuals from random and genomic-cluster cross-fitting, normalises them by this variance and localises the conformal quantile in relatedness. We compared it with seven alternatives on 24 traits from barley, common bean, lentil, loblolly pine, eastern oyster, maize, pig, rice, soybean and wheat, under random and cluster-out validation, with three prediction models, and in simulations on real genotypes. Intervals ignoring relatedness over-covered close relatives and under-covered distant candidates; for held-out clusters, split-conformal and cross-validation-plus intervals covered 0.828 and 0.838 of phenotypes at nominal 0.90, and the classical Gaussian interval 0.881. Kinship-aware intervals covered 0.894, with relatedness-conditional coverage error 0.036 against 0.079 for cross-validation-plus and 0.052 for the Gaussian interval, and the smallest or joint-smallest error for all three predictors. Ablation showed that the calibration pool spanning distant relatives was decisive: a parametric calibration fitted to the same pool performed equally well. Prediction intervals for selection candidates should be calibrated along the relatedness axis, at the cost of about ten additional model fits.</w:t>
       </w:r>
     </w:p>
     <w:p>
@@ -290,6 +290,11 @@
     </w:p>
     <w:p>
       <w:r>
+        <w:t>Throughout, intervals are for the phenotype a candidate will express, which is the quantity breeders observe when validating predictions. The relatedness covariate is also shown, by simulation, to calibrate the error of the genetic-value prediction. We regard the calibration design as the main contribution: a relatedness-diverse calibration pool together with the PEV covariate. KinCP is its distribution-free implementation.</w:t>
+      </w:r>
+    </w:p>
+    <w:p>
+      <w:r>
         <w:t xml:space="preserve">We evaluate KinCP against seven alternatives across ten plant and animal species from the EasyGeSe resource (Quesada-Traver </w:t>
       </w:r>
       <w:r>
@@ -1241,7 +1246,7 @@
         <w:t>d</w:t>
       </w:r>
       <w:r>
-        <w:t xml:space="preserve"> + σ̂²_e)^{1/2}. The nominal coverage was 1 − α = 0.90; α = 0.05 and 0.20 were used for sensitivity analyses. Eight methods were compared:</w:t>
+        <w:t xml:space="preserve"> + σ̂²_e)^{1/2}. The nominal coverage was 1 − α = 0.90; α = 0.05 and 0.20 were used for sensitivity analyses. Eight methods were compared: KinCP and seven alternatives. CalPred-style calibration was fitted in two variants, which are counted as one alternative.</w:t>
       </w:r>
     </w:p>
     <w:p>
@@ -2499,7 +2504,16 @@
     </w:p>
     <w:p>
       <w:r>
-        <w:t>A perfectly calibrated method still shows a conditional error from binomial sampling within quintiles. As a reference, we report the expected value of this noise floor for one pass over the data.</w:t>
+        <w:t xml:space="preserve">A perfectly calibrated method still shows a conditional error from binomial sampling within quintiles. As a reference, we report the expected value of this noise floor for one pass over the data, with quintiles of </w:t>
+      </w:r>
+      <w:r>
+        <w:rPr>
+          <w:i/>
+        </w:rPr>
+        <w:t>n</w:t>
+      </w:r>
+      <w:r>
+        <w:t>/5 individuals. Under R1 each individual is tested in five repeats with different training sets. Pooled R1 errors can therefore fall below this single-pass floor, so the floor is only an approximate yardstick.</w:t>
       </w:r>
     </w:p>
     <w:p>
@@ -2792,7 +2806,7 @@
         <w:t>Calibration of KinCP.</w:t>
       </w:r>
       <w:r>
-        <w:t xml:space="preserve"> KinCP had the lowest mean relatedness-conditional coverage error of all methods in every regime (Table 2): 0.017 under R1, 0.036 under R2 and 0.014 under R3. Under R2 its marginal coverage was 0.894 (SD over units 0.024; minimum 0.845). Its intervals were wider than those of the relatedness-blind conformal methods (2.83 </w:t>
+        <w:t xml:space="preserve"> With GBLUP as the base predictor, KinCP had the lowest mean relatedness-conditional coverage error of the eight compared methods in every regime (Table 2): 0.017 under R1, 0.036 under R2 and 0.014 under R3. Under R2 its marginal coverage was 0.894 (SD over units 0.024; minimum 0.845). Its intervals were wider than those of the relatedness-blind conformal methods (2.83 </w:t>
       </w:r>
       <w:r>
         <w:rPr>
@@ -2801,7 +2815,7 @@
         <w:t>vs.</w:t>
       </w:r>
       <w:r>
-        <w:t xml:space="preserve"> 2.46 phenotypic SD for CV+), as required to reach coverage. Its interval score was lower (3.91 </w:t>
+        <w:t xml:space="preserve"> 2.46 phenotypic SD for CV+), as required to reach coverage. Its interval score was also lower (3.91 </w:t>
       </w:r>
       <w:r>
         <w:rPr>
@@ -2810,7 +2824,34 @@
         <w:t>vs.</w:t>
       </w:r>
       <w:r>
-        <w:t xml:space="preserve"> 4.06).</w:t>
+        <w:t xml:space="preserve"> 4.06; Holm-adjusted </w:t>
+      </w:r>
+      <w:r>
+        <w:rPr>
+          <w:i/>
+        </w:rPr>
+        <w:t>P</w:t>
+      </w:r>
+      <w:r>
+        <w:t xml:space="preserve"> = 0.983). Against Gauss-PEV, the interval-score difference had </w:t>
+      </w:r>
+      <w:r>
+        <w:rPr>
+          <w:i/>
+        </w:rPr>
+        <w:t>P</w:t>
+      </w:r>
+      <w:r>
+        <w:t xml:space="preserve"> = 1.000; against CalPred-style on pool A, </w:t>
+      </w:r>
+      <w:r>
+        <w:rPr>
+          <w:i/>
+        </w:rPr>
+        <w:t>P</w:t>
+      </w:r>
+      <w:r>
+        <w:t xml:space="preserve"> = 1.000.</w:t>
       </w:r>
     </w:p>
     <w:p>
@@ -2914,6 +2955,53 @@
         <w:rPr>
           <w:b/>
         </w:rPr>
+        <w:t>Species-level analysis.</w:t>
+      </w:r>
+      <w:r>
+        <w:t xml:space="preserve"> Treating species rather than traits as the unit (10 units; traits averaged within species) gave the same direction. Under R2, KinCP had a lower conditional error than CV+ in 9/10 species (unadjusted </w:t>
+      </w:r>
+      <w:r>
+        <w:rPr>
+          <w:i/>
+        </w:rPr>
+        <w:t>P</w:t>
+      </w:r>
+      <w:r>
+        <w:t xml:space="preserve"> = 0.004, Holm </w:t>
+      </w:r>
+      <w:r>
+        <w:rPr>
+          <w:i/>
+        </w:rPr>
+        <w:t>P</w:t>
+      </w:r>
+      <w:r>
+        <w:t xml:space="preserve"> = 0.070) and than Gauss-PEV in 9/10 species (unadjusted </w:t>
+      </w:r>
+      <w:r>
+        <w:rPr>
+          <w:i/>
+        </w:rPr>
+        <w:t>P</w:t>
+      </w:r>
+      <w:r>
+        <w:t xml:space="preserve"> = 0.004, Holm </w:t>
+      </w:r>
+      <w:r>
+        <w:rPr>
+          <w:i/>
+        </w:rPr>
+        <w:t>P</w:t>
+      </w:r>
+      <w:r>
+        <w:t xml:space="preserve"> = 0.070). With 10 units and Holm adjustment over 21 comparisons, these species-level tests have limited power (Supplementary file statistics_species.csv).</w:t>
+      </w:r>
+    </w:p>
+    <w:p>
+      <w:r>
+        <w:rPr>
+          <w:b/>
+        </w:rPr>
         <w:t>Pool A versus conformalisation.</w:t>
       </w:r>
       <w:r>
@@ -3198,7 +3286,25 @@
         <w:t>Simulation with known genetic values</w:t>
       </w:r>
       <w:r>
-        <w:t xml:space="preserve"> (Table 6; Figure 7). In simulations with known additive genetic values on real loblolly pine, pig and maize genotypes (124 analyses), KinCP covered 0.899 under R1 and 0.901 under R2. CV+ covered 0.906 and 0.881, SCP 0.878 under R2, and Gauss-PEV 0.899 under R2. Mean worst-quintile coverage under R2 was 0.874 for KinCP and 0.872 for Gauss-PEV. Because the simulated traits satisfy the Gaussian additive model exactly, Gauss-PEV is the correctly specified reference here. KinCP approached it without using the model's distributional assumptions, whereas relatedness-blind conformal intervals under-covered under R2.</w:t>
+        <w:t xml:space="preserve"> (Table 6; Figure 7). In simulations with known additive genetic values on real loblolly pine, pig and maize genotypes (128 analyses), KinCP covered 0.899 under R1 and 0.901 under R2. CV+ covered 0.906 and 0.881, SCP 0.878 under R2, and Gauss-PEV 0.899 under R2. Mean worst-quintile coverage under R2 was 0.874 for KinCP and 0.872 for Gauss-PEV. Because the simulated traits satisfy the Gaussian additive model exactly, Gauss-PEV is the correctly specified reference here. KinCP approached it without using the model's distributional assumptions, whereas relatedness-blind conformal intervals under-covered under R2. The relatedness covariate itself was calibrated for the genetic values. By quintile of </w:t>
+      </w:r>
+      <w:r>
+        <w:rPr>
+          <w:i/>
+        </w:rPr>
+        <w:t>d</w:t>
+      </w:r>
+      <w:r>
+        <w:t>, the realised mean squared error of the genetic-value prediction divided by σ̂²_g·</w:t>
+      </w:r>
+      <w:r>
+        <w:rPr>
+          <w:i/>
+        </w:rPr>
+        <w:t>d</w:t>
+      </w:r>
+      <w:r>
+        <w:t xml:space="preserve"> ranged from 1.00 to 1.07 under R1 and from 0.98 to 1.06 under R2 (median over analyses; 1 = perfect calibration).</w:t>
       </w:r>
     </w:p>
     <w:p>
@@ -3228,7 +3334,7 @@
         <w:t>Cost</w:t>
       </w:r>
       <w:r>
-        <w:t xml:space="preserve"> (Table 7; Figure 8). Building KinCP's two calibration pools requires ten additional model fits per training set. The median cost relative to one fit was 1.9× for GBLUP, 1.3× for RKHS and 8.3× for LightGBM. For maize (about 3,500 training individuals), one GBLUP fit took 10.6 s on one CPU thread and both pools 7.7 s. Computing all interval methods from the pools took at most 6.27 s per fold. The overhead is therefore that of a standard five-fold cross-validation run twice, and is negligible relative to phenotyping or genotyping.</w:t>
+        <w:t xml:space="preserve"> (Table 7; Figure 8). Building KinCP's two calibration pools requires ten additional model fits per training set. For the kernel models these inner fits reuse the outer-fold variance ratio and need only a Cholesky factorisation, whereas the single outer fit includes REML with an eigendecomposition. The median cost of both pools relative to one outer fit was 1.9× for GBLUP, 1.3× for RKHS and 8.3× for LightGBM. For maize (about 3,500 training individuals), one GBLUP fit took 10.6 s on one CPU thread and both pools 7.7 s. Computing all interval methods from the pools took at most 6.27 s per fold. The overhead is therefore that of a standard five-fold cross-validation run twice, and is negligible relative to phenotyping or genotyping.</w:t>
       </w:r>
     </w:p>
     <w:p>
@@ -3337,7 +3443,12 @@
         <w:t>P</w:t>
       </w:r>
       <w:r>
-        <w:t xml:space="preserve"> = 0.005). Its worst unit was pine c5c6 (coverage 0.778). This is consistent with variance components estimated within the training clusters overstating how much genetic signal transfers to a new cluster. Under that misspecification a Gaussian model-based interval centred on a too-confident prediction is too narrow, whereas an empirically calibrated interval is not affected.</w:t>
+        <w:t xml:space="preserve"> = 0.005; unadjusted, exploratory). Its worst unit was pine c5c6 (coverage 0.778).</w:t>
+      </w:r>
+    </w:p>
+    <w:p>
+      <w:r>
+        <w:t>One explanation consistent with this pattern, which we did not test directly, is that variance components estimated within the training clusters overstate how much genetic signal transfers to a new cluster. Under that misspecification a model-based interval is too narrow, whereas an empirically calibrated interval adjusts. In the simulation, where the additive Gaussian model is correct by construction, Gauss-PEV was calibrated (see above).</w:t>
       </w:r>
     </w:p>
     <w:p>
@@ -3353,7 +3464,7 @@
     </w:p>
     <w:p>
       <w:r>
-        <w:t>Ranking candidates by their lower bound instead of their predicted value did not increase the mean phenotype of the selected set. Under R1 the median difference was -0.011 phenotypic SD (</w:t>
+        <w:t>Ranking candidates by their lower bound instead of their predicted value did not increase the mean phenotype of the selected set, and under R1 it slightly reduced it. Under R1 the median difference was -0.011 phenotypic SD (</w:t>
       </w:r>
       <w:r>
         <w:rPr>
@@ -4128,7 +4239,7 @@
         <w:pStyle w:val="ListBullet"/>
       </w:pPr>
       <w:r>
-        <w:t>KinCP achieved the lowest relatedness-conditional coverage error in all deployment regimes and for all three predictors (GBLUP, RKHS, LightGBM). The classical PEV-based Gaussian interval lost calibration under cluster-out deployment.</w:t>
+        <w:t>KinCP achieved the lowest, or joint-lowest, relatedness-conditional coverage error in all deployment regimes and for all three predictors (GBLUP, RKHS, LightGBM). The classical PEV-based Gaussian interval lost calibration under cluster-out deployment (mean coverage 0.881; KinCP 0.894).</w:t>
       </w:r>
     </w:p>
     <w:p>
@@ -10436,7 +10547,7 @@
         <w:t>Table 3</w:t>
       </w:r>
       <w:r>
-        <w:t xml:space="preserve"> Paired comparisons of KinCP with each alternative (GBLUP). The endpoints are the relatedness-conditional coverage error (cond_err) and the marginal coverage deviation (cov_dev). median_diff is the median paired difference (competitor − KinCP; positive favours KinCP), with its 95% bootstrap confidence interval. P-values are from two-sided Wilcoxon signed-rank tests, with Holm adjustment within each endpoint family. Interval scores and all ablation comparisons are in File S2.</w:t>
+        <w:t xml:space="preserve"> Paired comparisons of KinCP with each alternative (GBLUP) on the relatedness-conditional coverage error (Cond. error) and the marginal coverage deviation (|Cov−0.90|). Median diff. is the median paired difference (competitor − KinCP; positive favours KinCP), with its 95% bootstrap confidence interval (CI low, CI high). P is from a two-sided Wilcoxon signed-rank test; P (Holm) is adjusted within each endpoint family (all regimes × baseline competitors). Interval-score comparisons and all ablation comparisons are in File S2.</w:t>
       </w:r>
     </w:p>
     <w:tbl>
@@ -10476,7 +10587,7 @@
                 <w:b/>
                 <w:sz w:val="13"/>
               </w:rPr>
-              <w:t>regime</w:t>
+              <w:t>Regime</w:t>
             </w:r>
           </w:p>
         </w:tc>
@@ -10491,7 +10602,7 @@
                 <w:b/>
                 <w:sz w:val="13"/>
               </w:rPr>
-              <w:t>endpoint</w:t>
+              <w:t>Endpoint</w:t>
             </w:r>
           </w:p>
         </w:tc>
@@ -10506,7 +10617,7 @@
                 <w:b/>
                 <w:sz w:val="13"/>
               </w:rPr>
-              <w:t>competitor</w:t>
+              <w:t>Competitor</w:t>
             </w:r>
           </w:p>
         </w:tc>
@@ -10521,7 +10632,7 @@
                 <w:b/>
                 <w:sz w:val="13"/>
               </w:rPr>
-              <w:t>n_units</w:t>
+              <w:t>Units</w:t>
             </w:r>
           </w:p>
         </w:tc>
@@ -10536,7 +10647,7 @@
                 <w:b/>
                 <w:sz w:val="13"/>
               </w:rPr>
-              <w:t>ref_median</w:t>
+              <w:t>KinCP median</w:t>
             </w:r>
           </w:p>
         </w:tc>
@@ -10551,7 +10662,7 @@
                 <w:b/>
                 <w:sz w:val="13"/>
               </w:rPr>
-              <w:t>comp_median</w:t>
+              <w:t>Competitor median</w:t>
             </w:r>
           </w:p>
         </w:tc>
@@ -10566,7 +10677,7 @@
                 <w:b/>
                 <w:sz w:val="13"/>
               </w:rPr>
-              <w:t>median_diff</w:t>
+              <w:t>Median diff.</w:t>
             </w:r>
           </w:p>
         </w:tc>
@@ -10581,7 +10692,7 @@
                 <w:b/>
                 <w:sz w:val="13"/>
               </w:rPr>
-              <w:t>ci_low</w:t>
+              <w:t>CI low</w:t>
             </w:r>
           </w:p>
         </w:tc>
@@ -10596,7 +10707,7 @@
                 <w:b/>
                 <w:sz w:val="13"/>
               </w:rPr>
-              <w:t>ci_high</w:t>
+              <w:t>CI high</w:t>
             </w:r>
           </w:p>
         </w:tc>
@@ -10611,7 +10722,7 @@
                 <w:b/>
                 <w:sz w:val="13"/>
               </w:rPr>
-              <w:t>rank_biserial</w:t>
+              <w:t>Rank-biserial r</w:t>
             </w:r>
           </w:p>
         </w:tc>
@@ -10626,7 +10737,7 @@
                 <w:b/>
                 <w:sz w:val="13"/>
               </w:rPr>
-              <w:t>p_value</w:t>
+              <w:t>P</w:t>
             </w:r>
           </w:p>
         </w:tc>
@@ -10641,7 +10752,7 @@
                 <w:b/>
                 <w:sz w:val="13"/>
               </w:rPr>
-              <w:t>p_holm</w:t>
+              <w:t>P (Holm)</w:t>
             </w:r>
           </w:p>
         </w:tc>
@@ -10671,7 +10782,7 @@
               <w:rPr>
                 <w:sz w:val="13"/>
               </w:rPr>
-              <w:t>cond_err</w:t>
+              <w:t>Cond. error</w:t>
             </w:r>
           </w:p>
         </w:tc>
@@ -10841,7 +10952,7 @@
               <w:rPr>
                 <w:sz w:val="13"/>
               </w:rPr>
-              <w:t>cond_err</w:t>
+              <w:t>Cond. error</w:t>
             </w:r>
           </w:p>
         </w:tc>
@@ -11011,7 +11122,7 @@
               <w:rPr>
                 <w:sz w:val="13"/>
               </w:rPr>
-              <w:t>cond_err</w:t>
+              <w:t>Cond. error</w:t>
             </w:r>
           </w:p>
         </w:tc>
@@ -11181,7 +11292,7 @@
               <w:rPr>
                 <w:sz w:val="13"/>
               </w:rPr>
-              <w:t>cond_err</w:t>
+              <w:t>Cond. error</w:t>
             </w:r>
           </w:p>
         </w:tc>
@@ -11351,7 +11462,7 @@
               <w:rPr>
                 <w:sz w:val="13"/>
               </w:rPr>
-              <w:t>cond_err</w:t>
+              <w:t>Cond. error</w:t>
             </w:r>
           </w:p>
         </w:tc>
@@ -11521,7 +11632,7 @@
               <w:rPr>
                 <w:sz w:val="13"/>
               </w:rPr>
-              <w:t>cond_err</w:t>
+              <w:t>Cond. error</w:t>
             </w:r>
           </w:p>
         </w:tc>
@@ -11691,7 +11802,7 @@
               <w:rPr>
                 <w:sz w:val="13"/>
               </w:rPr>
-              <w:t>cond_err</w:t>
+              <w:t>Cond. error</w:t>
             </w:r>
           </w:p>
         </w:tc>
@@ -11861,7 +11972,7 @@
               <w:rPr>
                 <w:sz w:val="13"/>
               </w:rPr>
-              <w:t>cov_dev</w:t>
+              <w:t>|Cov−0.90|</w:t>
             </w:r>
           </w:p>
         </w:tc>
@@ -12031,7 +12142,7 @@
               <w:rPr>
                 <w:sz w:val="13"/>
               </w:rPr>
-              <w:t>cov_dev</w:t>
+              <w:t>|Cov−0.90|</w:t>
             </w:r>
           </w:p>
         </w:tc>
@@ -12201,7 +12312,7 @@
               <w:rPr>
                 <w:sz w:val="13"/>
               </w:rPr>
-              <w:t>cov_dev</w:t>
+              <w:t>|Cov−0.90|</w:t>
             </w:r>
           </w:p>
         </w:tc>
@@ -12371,7 +12482,7 @@
               <w:rPr>
                 <w:sz w:val="13"/>
               </w:rPr>
-              <w:t>cov_dev</w:t>
+              <w:t>|Cov−0.90|</w:t>
             </w:r>
           </w:p>
         </w:tc>
@@ -12541,7 +12652,7 @@
               <w:rPr>
                 <w:sz w:val="13"/>
               </w:rPr>
-              <w:t>cov_dev</w:t>
+              <w:t>|Cov−0.90|</w:t>
             </w:r>
           </w:p>
         </w:tc>
@@ -12711,7 +12822,7 @@
               <w:rPr>
                 <w:sz w:val="13"/>
               </w:rPr>
-              <w:t>cov_dev</w:t>
+              <w:t>|Cov−0.90|</w:t>
             </w:r>
           </w:p>
         </w:tc>
@@ -12881,7 +12992,7 @@
               <w:rPr>
                 <w:sz w:val="13"/>
               </w:rPr>
-              <w:t>cov_dev</w:t>
+              <w:t>|Cov−0.90|</w:t>
             </w:r>
           </w:p>
         </w:tc>
@@ -13051,7 +13162,7 @@
               <w:rPr>
                 <w:sz w:val="13"/>
               </w:rPr>
-              <w:t>cond_err</w:t>
+              <w:t>Cond. error</w:t>
             </w:r>
           </w:p>
         </w:tc>
@@ -13221,7 +13332,7 @@
               <w:rPr>
                 <w:sz w:val="13"/>
               </w:rPr>
-              <w:t>cond_err</w:t>
+              <w:t>Cond. error</w:t>
             </w:r>
           </w:p>
         </w:tc>
@@ -13391,7 +13502,7 @@
               <w:rPr>
                 <w:sz w:val="13"/>
               </w:rPr>
-              <w:t>cond_err</w:t>
+              <w:t>Cond. error</w:t>
             </w:r>
           </w:p>
         </w:tc>
@@ -13561,7 +13672,7 @@
               <w:rPr>
                 <w:sz w:val="13"/>
               </w:rPr>
-              <w:t>cond_err</w:t>
+              <w:t>Cond. error</w:t>
             </w:r>
           </w:p>
         </w:tc>
@@ -13731,7 +13842,7 @@
               <w:rPr>
                 <w:sz w:val="13"/>
               </w:rPr>
-              <w:t>cond_err</w:t>
+              <w:t>Cond. error</w:t>
             </w:r>
           </w:p>
         </w:tc>
@@ -13901,7 +14012,7 @@
               <w:rPr>
                 <w:sz w:val="13"/>
               </w:rPr>
-              <w:t>cond_err</w:t>
+              <w:t>Cond. error</w:t>
             </w:r>
           </w:p>
         </w:tc>
@@ -14071,7 +14182,7 @@
               <w:rPr>
                 <w:sz w:val="13"/>
               </w:rPr>
-              <w:t>cond_err</w:t>
+              <w:t>Cond. error</w:t>
             </w:r>
           </w:p>
         </w:tc>
@@ -14241,7 +14352,7 @@
               <w:rPr>
                 <w:sz w:val="13"/>
               </w:rPr>
-              <w:t>cov_dev</w:t>
+              <w:t>|Cov−0.90|</w:t>
             </w:r>
           </w:p>
         </w:tc>
@@ -14411,7 +14522,7 @@
               <w:rPr>
                 <w:sz w:val="13"/>
               </w:rPr>
-              <w:t>cov_dev</w:t>
+              <w:t>|Cov−0.90|</w:t>
             </w:r>
           </w:p>
         </w:tc>
@@ -14581,7 +14692,7 @@
               <w:rPr>
                 <w:sz w:val="13"/>
               </w:rPr>
-              <w:t>cov_dev</w:t>
+              <w:t>|Cov−0.90|</w:t>
             </w:r>
           </w:p>
         </w:tc>
@@ -14751,7 +14862,7 @@
               <w:rPr>
                 <w:sz w:val="13"/>
               </w:rPr>
-              <w:t>cov_dev</w:t>
+              <w:t>|Cov−0.90|</w:t>
             </w:r>
           </w:p>
         </w:tc>
@@ -14921,7 +15032,7 @@
               <w:rPr>
                 <w:sz w:val="13"/>
               </w:rPr>
-              <w:t>cov_dev</w:t>
+              <w:t>|Cov−0.90|</w:t>
             </w:r>
           </w:p>
         </w:tc>
@@ -15091,7 +15202,7 @@
               <w:rPr>
                 <w:sz w:val="13"/>
               </w:rPr>
-              <w:t>cov_dev</w:t>
+              <w:t>|Cov−0.90|</w:t>
             </w:r>
           </w:p>
         </w:tc>
@@ -15261,7 +15372,7 @@
               <w:rPr>
                 <w:sz w:val="13"/>
               </w:rPr>
-              <w:t>cov_dev</w:t>
+              <w:t>|Cov−0.90|</w:t>
             </w:r>
           </w:p>
         </w:tc>
@@ -15431,7 +15542,7 @@
               <w:rPr>
                 <w:sz w:val="13"/>
               </w:rPr>
-              <w:t>cond_err</w:t>
+              <w:t>Cond. error</w:t>
             </w:r>
           </w:p>
         </w:tc>
@@ -15601,7 +15712,7 @@
               <w:rPr>
                 <w:sz w:val="13"/>
               </w:rPr>
-              <w:t>cond_err</w:t>
+              <w:t>Cond. error</w:t>
             </w:r>
           </w:p>
         </w:tc>
@@ -15771,7 +15882,7 @@
               <w:rPr>
                 <w:sz w:val="13"/>
               </w:rPr>
-              <w:t>cond_err</w:t>
+              <w:t>Cond. error</w:t>
             </w:r>
           </w:p>
         </w:tc>
@@ -15941,7 +16052,7 @@
               <w:rPr>
                 <w:sz w:val="13"/>
               </w:rPr>
-              <w:t>cond_err</w:t>
+              <w:t>Cond. error</w:t>
             </w:r>
           </w:p>
         </w:tc>
@@ -16111,7 +16222,7 @@
               <w:rPr>
                 <w:sz w:val="13"/>
               </w:rPr>
-              <w:t>cond_err</w:t>
+              <w:t>Cond. error</w:t>
             </w:r>
           </w:p>
         </w:tc>
@@ -16281,7 +16392,7 @@
               <w:rPr>
                 <w:sz w:val="13"/>
               </w:rPr>
-              <w:t>cond_err</w:t>
+              <w:t>Cond. error</w:t>
             </w:r>
           </w:p>
         </w:tc>
@@ -16451,7 +16562,7 @@
               <w:rPr>
                 <w:sz w:val="13"/>
               </w:rPr>
-              <w:t>cond_err</w:t>
+              <w:t>Cond. error</w:t>
             </w:r>
           </w:p>
         </w:tc>
@@ -16621,7 +16732,7 @@
               <w:rPr>
                 <w:sz w:val="13"/>
               </w:rPr>
-              <w:t>cov_dev</w:t>
+              <w:t>|Cov−0.90|</w:t>
             </w:r>
           </w:p>
         </w:tc>
@@ -16791,7 +16902,7 @@
               <w:rPr>
                 <w:sz w:val="13"/>
               </w:rPr>
-              <w:t>cov_dev</w:t>
+              <w:t>|Cov−0.90|</w:t>
             </w:r>
           </w:p>
         </w:tc>
@@ -16961,7 +17072,7 @@
               <w:rPr>
                 <w:sz w:val="13"/>
               </w:rPr>
-              <w:t>cov_dev</w:t>
+              <w:t>|Cov−0.90|</w:t>
             </w:r>
           </w:p>
         </w:tc>
@@ -17131,7 +17242,7 @@
               <w:rPr>
                 <w:sz w:val="13"/>
               </w:rPr>
-              <w:t>cov_dev</w:t>
+              <w:t>|Cov−0.90|</w:t>
             </w:r>
           </w:p>
         </w:tc>
@@ -17301,7 +17412,7 @@
               <w:rPr>
                 <w:sz w:val="13"/>
               </w:rPr>
-              <w:t>cov_dev</w:t>
+              <w:t>|Cov−0.90|</w:t>
             </w:r>
           </w:p>
         </w:tc>
@@ -17471,7 +17582,7 @@
               <w:rPr>
                 <w:sz w:val="13"/>
               </w:rPr>
-              <w:t>cov_dev</w:t>
+              <w:t>|Cov−0.90|</w:t>
             </w:r>
           </w:p>
         </w:tc>
@@ -17641,7 +17752,7 @@
               <w:rPr>
                 <w:sz w:val="13"/>
               </w:rPr>
-              <w:t>cov_dev</w:t>
+              <w:t>|Cov−0.90|</w:t>
             </w:r>
           </w:p>
         </w:tc>
@@ -24398,63 +24509,63 @@
               <w:rPr>
                 <w:sz w:val="13"/>
               </w:rPr>
-              <w:t>10</w:t>
-            </w:r>
-          </w:p>
-        </w:tc>
-        <w:tc>
-          <w:tcPr>
-            <w:tcW w:type="dxa" w:w="1040"/>
-          </w:tcPr>
-          <w:p>
-            <w:r/>
-            <w:r>
-              <w:rPr>
-                <w:sz w:val="13"/>
-              </w:rPr>
-              <w:t>0.903 ± 0.009</w:t>
-            </w:r>
-          </w:p>
-        </w:tc>
-        <w:tc>
-          <w:tcPr>
-            <w:tcW w:type="dxa" w:w="1040"/>
-          </w:tcPr>
-          <w:p>
-            <w:r/>
-            <w:r>
-              <w:rPr>
-                <w:sz w:val="13"/>
-              </w:rPr>
-              <w:t>0.018 ± 0.005</w:t>
-            </w:r>
-          </w:p>
-        </w:tc>
-        <w:tc>
-          <w:tcPr>
-            <w:tcW w:type="dxa" w:w="1040"/>
-          </w:tcPr>
-          <w:p>
-            <w:r/>
-            <w:r>
-              <w:rPr>
-                <w:sz w:val="13"/>
-              </w:rPr>
-              <w:t>0.875 ± 0.016</w:t>
-            </w:r>
-          </w:p>
-        </w:tc>
-        <w:tc>
-          <w:tcPr>
-            <w:tcW w:type="dxa" w:w="1040"/>
-          </w:tcPr>
-          <w:p>
-            <w:r/>
-            <w:r>
-              <w:rPr>
-                <w:sz w:val="13"/>
-              </w:rPr>
-              <w:t>3.240 ± 0.093</w:t>
+              <w:t>14</w:t>
+            </w:r>
+          </w:p>
+        </w:tc>
+        <w:tc>
+          <w:tcPr>
+            <w:tcW w:type="dxa" w:w="1040"/>
+          </w:tcPr>
+          <w:p>
+            <w:r/>
+            <w:r>
+              <w:rPr>
+                <w:sz w:val="13"/>
+              </w:rPr>
+              <w:t>0.902 ± 0.007</w:t>
+            </w:r>
+          </w:p>
+        </w:tc>
+        <w:tc>
+          <w:tcPr>
+            <w:tcW w:type="dxa" w:w="1040"/>
+          </w:tcPr>
+          <w:p>
+            <w:r/>
+            <w:r>
+              <w:rPr>
+                <w:sz w:val="13"/>
+              </w:rPr>
+              <w:t>0.016 ± 0.007</w:t>
+            </w:r>
+          </w:p>
+        </w:tc>
+        <w:tc>
+          <w:tcPr>
+            <w:tcW w:type="dxa" w:w="1040"/>
+          </w:tcPr>
+          <w:p>
+            <w:r/>
+            <w:r>
+              <w:rPr>
+                <w:sz w:val="13"/>
+              </w:rPr>
+              <w:t>0.878 ± 0.014</w:t>
+            </w:r>
+          </w:p>
+        </w:tc>
+        <w:tc>
+          <w:tcPr>
+            <w:tcW w:type="dxa" w:w="1040"/>
+          </w:tcPr>
+          <w:p>
+            <w:r/>
+            <w:r>
+              <w:rPr>
+                <w:sz w:val="13"/>
+              </w:rPr>
+              <w:t>3.190 ± 0.114</w:t>
             </w:r>
           </w:p>
         </w:tc>
@@ -24526,63 +24637,63 @@
               <w:rPr>
                 <w:sz w:val="13"/>
               </w:rPr>
-              <w:t>10</w:t>
-            </w:r>
-          </w:p>
-        </w:tc>
-        <w:tc>
-          <w:tcPr>
-            <w:tcW w:type="dxa" w:w="1040"/>
-          </w:tcPr>
-          <w:p>
-            <w:r/>
-            <w:r>
-              <w:rPr>
-                <w:sz w:val="13"/>
-              </w:rPr>
-              <w:t>0.901 ± 0.003</w:t>
-            </w:r>
-          </w:p>
-        </w:tc>
-        <w:tc>
-          <w:tcPr>
-            <w:tcW w:type="dxa" w:w="1040"/>
-          </w:tcPr>
-          <w:p>
-            <w:r/>
-            <w:r>
-              <w:rPr>
-                <w:sz w:val="13"/>
-              </w:rPr>
-              <w:t>0.016 ± 0.007</w:t>
-            </w:r>
-          </w:p>
-        </w:tc>
-        <w:tc>
-          <w:tcPr>
-            <w:tcW w:type="dxa" w:w="1040"/>
-          </w:tcPr>
-          <w:p>
-            <w:r/>
-            <w:r>
-              <w:rPr>
-                <w:sz w:val="13"/>
-              </w:rPr>
-              <w:t>0.878 ± 0.014</w:t>
-            </w:r>
-          </w:p>
-        </w:tc>
-        <w:tc>
-          <w:tcPr>
-            <w:tcW w:type="dxa" w:w="1040"/>
-          </w:tcPr>
-          <w:p>
-            <w:r/>
-            <w:r>
-              <w:rPr>
-                <w:sz w:val="13"/>
-              </w:rPr>
-              <w:t>3.201 ± 0.054</w:t>
+              <w:t>14</w:t>
+            </w:r>
+          </w:p>
+        </w:tc>
+        <w:tc>
+          <w:tcPr>
+            <w:tcW w:type="dxa" w:w="1040"/>
+          </w:tcPr>
+          <w:p>
+            <w:r/>
+            <w:r>
+              <w:rPr>
+                <w:sz w:val="13"/>
+              </w:rPr>
+              <w:t>0.902 ± 0.003</w:t>
+            </w:r>
+          </w:p>
+        </w:tc>
+        <w:tc>
+          <w:tcPr>
+            <w:tcW w:type="dxa" w:w="1040"/>
+          </w:tcPr>
+          <w:p>
+            <w:r/>
+            <w:r>
+              <w:rPr>
+                <w:sz w:val="13"/>
+              </w:rPr>
+              <w:t>0.014 ± 0.007</w:t>
+            </w:r>
+          </w:p>
+        </w:tc>
+        <w:tc>
+          <w:tcPr>
+            <w:tcW w:type="dxa" w:w="1040"/>
+          </w:tcPr>
+          <w:p>
+            <w:r/>
+            <w:r>
+              <w:rPr>
+                <w:sz w:val="13"/>
+              </w:rPr>
+              <w:t>0.881 ± 0.013</w:t>
+            </w:r>
+          </w:p>
+        </w:tc>
+        <w:tc>
+          <w:tcPr>
+            <w:tcW w:type="dxa" w:w="1040"/>
+          </w:tcPr>
+          <w:p>
+            <w:r/>
+            <w:r>
+              <w:rPr>
+                <w:sz w:val="13"/>
+              </w:rPr>
+              <w:t>3.162 ± 0.079</w:t>
             </w:r>
           </w:p>
         </w:tc>
@@ -24654,63 +24765,63 @@
               <w:rPr>
                 <w:sz w:val="13"/>
               </w:rPr>
-              <w:t>10</w:t>
-            </w:r>
-          </w:p>
-        </w:tc>
-        <w:tc>
-          <w:tcPr>
-            <w:tcW w:type="dxa" w:w="1040"/>
-          </w:tcPr>
-          <w:p>
-            <w:r/>
-            <w:r>
-              <w:rPr>
-                <w:sz w:val="13"/>
-              </w:rPr>
-              <w:t>0.898 ± 0.004</w:t>
-            </w:r>
-          </w:p>
-        </w:tc>
-        <w:tc>
-          <w:tcPr>
-            <w:tcW w:type="dxa" w:w="1040"/>
-          </w:tcPr>
-          <w:p>
-            <w:r/>
-            <w:r>
-              <w:rPr>
-                <w:sz w:val="13"/>
-              </w:rPr>
-              <w:t>0.016 ± 0.007</w:t>
-            </w:r>
-          </w:p>
-        </w:tc>
-        <w:tc>
-          <w:tcPr>
-            <w:tcW w:type="dxa" w:w="1040"/>
-          </w:tcPr>
-          <w:p>
-            <w:r/>
-            <w:r>
-              <w:rPr>
-                <w:sz w:val="13"/>
-              </w:rPr>
-              <w:t>0.874 ± 0.012</w:t>
-            </w:r>
-          </w:p>
-        </w:tc>
-        <w:tc>
-          <w:tcPr>
-            <w:tcW w:type="dxa" w:w="1040"/>
-          </w:tcPr>
-          <w:p>
-            <w:r/>
-            <w:r>
-              <w:rPr>
-                <w:sz w:val="13"/>
-              </w:rPr>
-              <w:t>3.183 ± 0.042</w:t>
+              <w:t>14</w:t>
+            </w:r>
+          </w:p>
+        </w:tc>
+        <w:tc>
+          <w:tcPr>
+            <w:tcW w:type="dxa" w:w="1040"/>
+          </w:tcPr>
+          <w:p>
+            <w:r/>
+            <w:r>
+              <w:rPr>
+                <w:sz w:val="13"/>
+              </w:rPr>
+              <w:t>0.899 ± 0.004</w:t>
+            </w:r>
+          </w:p>
+        </w:tc>
+        <w:tc>
+          <w:tcPr>
+            <w:tcW w:type="dxa" w:w="1040"/>
+          </w:tcPr>
+          <w:p>
+            <w:r/>
+            <w:r>
+              <w:rPr>
+                <w:sz w:val="13"/>
+              </w:rPr>
+              <w:t>0.014 ± 0.007</w:t>
+            </w:r>
+          </w:p>
+        </w:tc>
+        <w:tc>
+          <w:tcPr>
+            <w:tcW w:type="dxa" w:w="1040"/>
+          </w:tcPr>
+          <w:p>
+            <w:r/>
+            <w:r>
+              <w:rPr>
+                <w:sz w:val="13"/>
+              </w:rPr>
+              <w:t>0.877 ± 0.011</w:t>
+            </w:r>
+          </w:p>
+        </w:tc>
+        <w:tc>
+          <w:tcPr>
+            <w:tcW w:type="dxa" w:w="1040"/>
+          </w:tcPr>
+          <w:p>
+            <w:r/>
+            <w:r>
+              <w:rPr>
+                <w:sz w:val="13"/>
+              </w:rPr>
+              <w:t>3.144 ± 0.074</w:t>
             </w:r>
           </w:p>
         </w:tc>
@@ -24782,63 +24893,63 @@
               <w:rPr>
                 <w:sz w:val="13"/>
               </w:rPr>
-              <w:t>10</w:t>
-            </w:r>
-          </w:p>
-        </w:tc>
-        <w:tc>
-          <w:tcPr>
-            <w:tcW w:type="dxa" w:w="1040"/>
-          </w:tcPr>
-          <w:p>
-            <w:r/>
-            <w:r>
-              <w:rPr>
-                <w:sz w:val="13"/>
-              </w:rPr>
-              <w:t>0.895 ± 0.007</w:t>
-            </w:r>
-          </w:p>
-        </w:tc>
-        <w:tc>
-          <w:tcPr>
-            <w:tcW w:type="dxa" w:w="1040"/>
-          </w:tcPr>
-          <w:p>
-            <w:r/>
-            <w:r>
-              <w:rPr>
-                <w:sz w:val="13"/>
-              </w:rPr>
-              <w:t>0.017 ± 0.010</w:t>
-            </w:r>
-          </w:p>
-        </w:tc>
-        <w:tc>
-          <w:tcPr>
-            <w:tcW w:type="dxa" w:w="1040"/>
-          </w:tcPr>
-          <w:p>
-            <w:r/>
-            <w:r>
-              <w:rPr>
-                <w:sz w:val="13"/>
-              </w:rPr>
-              <w:t>0.872 ± 0.015</w:t>
-            </w:r>
-          </w:p>
-        </w:tc>
-        <w:tc>
-          <w:tcPr>
-            <w:tcW w:type="dxa" w:w="1040"/>
-          </w:tcPr>
-          <w:p>
-            <w:r/>
-            <w:r>
-              <w:rPr>
-                <w:sz w:val="13"/>
-              </w:rPr>
-              <w:t>3.152 ± 0.061</w:t>
+              <w:t>14</w:t>
+            </w:r>
+          </w:p>
+        </w:tc>
+        <w:tc>
+          <w:tcPr>
+            <w:tcW w:type="dxa" w:w="1040"/>
+          </w:tcPr>
+          <w:p>
+            <w:r/>
+            <w:r>
+              <w:rPr>
+                <w:sz w:val="13"/>
+              </w:rPr>
+              <w:t>0.897 ± 0.007</w:t>
+            </w:r>
+          </w:p>
+        </w:tc>
+        <w:tc>
+          <w:tcPr>
+            <w:tcW w:type="dxa" w:w="1040"/>
+          </w:tcPr>
+          <w:p>
+            <w:r/>
+            <w:r>
+              <w:rPr>
+                <w:sz w:val="13"/>
+              </w:rPr>
+              <w:t>0.014 ± 0.009</w:t>
+            </w:r>
+          </w:p>
+        </w:tc>
+        <w:tc>
+          <w:tcPr>
+            <w:tcW w:type="dxa" w:w="1040"/>
+          </w:tcPr>
+          <w:p>
+            <w:r/>
+            <w:r>
+              <w:rPr>
+                <w:sz w:val="13"/>
+              </w:rPr>
+              <w:t>0.877 ± 0.015</w:t>
+            </w:r>
+          </w:p>
+        </w:tc>
+        <w:tc>
+          <w:tcPr>
+            <w:tcW w:type="dxa" w:w="1040"/>
+          </w:tcPr>
+          <w:p>
+            <w:r/>
+            <w:r>
+              <w:rPr>
+                <w:sz w:val="13"/>
+              </w:rPr>
+              <w:t>3.125 ± 0.071</w:t>
             </w:r>
           </w:p>
         </w:tc>
@@ -24910,63 +25021,63 @@
               <w:rPr>
                 <w:sz w:val="13"/>
               </w:rPr>
-              <w:t>10</w:t>
-            </w:r>
-          </w:p>
-        </w:tc>
-        <w:tc>
-          <w:tcPr>
-            <w:tcW w:type="dxa" w:w="1040"/>
-          </w:tcPr>
-          <w:p>
-            <w:r/>
-            <w:r>
-              <w:rPr>
-                <w:sz w:val="13"/>
-              </w:rPr>
-              <w:t>0.899 ± 0.004</w:t>
-            </w:r>
-          </w:p>
-        </w:tc>
-        <w:tc>
-          <w:tcPr>
-            <w:tcW w:type="dxa" w:w="1040"/>
-          </w:tcPr>
-          <w:p>
-            <w:r/>
-            <w:r>
-              <w:rPr>
-                <w:sz w:val="13"/>
-              </w:rPr>
-              <w:t>0.016 ± 0.008</w:t>
-            </w:r>
-          </w:p>
-        </w:tc>
-        <w:tc>
-          <w:tcPr>
-            <w:tcW w:type="dxa" w:w="1040"/>
-          </w:tcPr>
-          <w:p>
-            <w:r/>
-            <w:r>
-              <w:rPr>
-                <w:sz w:val="13"/>
-              </w:rPr>
-              <w:t>0.874 ± 0.012</w:t>
-            </w:r>
-          </w:p>
-        </w:tc>
-        <w:tc>
-          <w:tcPr>
-            <w:tcW w:type="dxa" w:w="1040"/>
-          </w:tcPr>
-          <w:p>
-            <w:r/>
-            <w:r>
-              <w:rPr>
-                <w:sz w:val="13"/>
-              </w:rPr>
-              <w:t>3.179 ± 0.053</w:t>
+              <w:t>14</w:t>
+            </w:r>
+          </w:p>
+        </w:tc>
+        <w:tc>
+          <w:tcPr>
+            <w:tcW w:type="dxa" w:w="1040"/>
+          </w:tcPr>
+          <w:p>
+            <w:r/>
+            <w:r>
+              <w:rPr>
+                <w:sz w:val="13"/>
+              </w:rPr>
+              <w:t>0.900 ± 0.004</w:t>
+            </w:r>
+          </w:p>
+        </w:tc>
+        <w:tc>
+          <w:tcPr>
+            <w:tcW w:type="dxa" w:w="1040"/>
+          </w:tcPr>
+          <w:p>
+            <w:r/>
+            <w:r>
+              <w:rPr>
+                <w:sz w:val="13"/>
+              </w:rPr>
+              <w:t>0.014 ± 0.008</w:t>
+            </w:r>
+          </w:p>
+        </w:tc>
+        <w:tc>
+          <w:tcPr>
+            <w:tcW w:type="dxa" w:w="1040"/>
+          </w:tcPr>
+          <w:p>
+            <w:r/>
+            <w:r>
+              <w:rPr>
+                <w:sz w:val="13"/>
+              </w:rPr>
+              <w:t>0.879 ± 0.012</w:t>
+            </w:r>
+          </w:p>
+        </w:tc>
+        <w:tc>
+          <w:tcPr>
+            <w:tcW w:type="dxa" w:w="1040"/>
+          </w:tcPr>
+          <w:p>
+            <w:r/>
+            <w:r>
+              <w:rPr>
+                <w:sz w:val="13"/>
+              </w:rPr>
+              <w:t>3.143 ± 0.074</w:t>
             </w:r>
           </w:p>
         </w:tc>
@@ -28238,63 +28349,63 @@
               <w:rPr>
                 <w:sz w:val="13"/>
               </w:rPr>
-              <w:t>10</w:t>
-            </w:r>
-          </w:p>
-        </w:tc>
-        <w:tc>
-          <w:tcPr>
-            <w:tcW w:type="dxa" w:w="1040"/>
-          </w:tcPr>
-          <w:p>
-            <w:r/>
-            <w:r>
-              <w:rPr>
-                <w:sz w:val="13"/>
-              </w:rPr>
-              <w:t>0.897 ± 0.015</w:t>
-            </w:r>
-          </w:p>
-        </w:tc>
-        <w:tc>
-          <w:tcPr>
-            <w:tcW w:type="dxa" w:w="1040"/>
-          </w:tcPr>
-          <w:p>
-            <w:r/>
-            <w:r>
-              <w:rPr>
-                <w:sz w:val="13"/>
-              </w:rPr>
-              <w:t>0.020 ± 0.008</w:t>
-            </w:r>
-          </w:p>
-        </w:tc>
-        <w:tc>
-          <w:tcPr>
-            <w:tcW w:type="dxa" w:w="1040"/>
-          </w:tcPr>
-          <w:p>
-            <w:r/>
-            <w:r>
-              <w:rPr>
-                <w:sz w:val="13"/>
-              </w:rPr>
-              <w:t>0.873 ± 0.018</w:t>
-            </w:r>
-          </w:p>
-        </w:tc>
-        <w:tc>
-          <w:tcPr>
-            <w:tcW w:type="dxa" w:w="1040"/>
-          </w:tcPr>
-          <w:p>
-            <w:r/>
-            <w:r>
-              <w:rPr>
-                <w:sz w:val="13"/>
-              </w:rPr>
-              <w:t>3.245 ± 0.116</w:t>
+              <w:t>14</w:t>
+            </w:r>
+          </w:p>
+        </w:tc>
+        <w:tc>
+          <w:tcPr>
+            <w:tcW w:type="dxa" w:w="1040"/>
+          </w:tcPr>
+          <w:p>
+            <w:r/>
+            <w:r>
+              <w:rPr>
+                <w:sz w:val="13"/>
+              </w:rPr>
+              <w:t>0.894 ± 0.014</w:t>
+            </w:r>
+          </w:p>
+        </w:tc>
+        <w:tc>
+          <w:tcPr>
+            <w:tcW w:type="dxa" w:w="1040"/>
+          </w:tcPr>
+          <w:p>
+            <w:r/>
+            <w:r>
+              <w:rPr>
+                <w:sz w:val="13"/>
+              </w:rPr>
+              <w:t>0.019 ± 0.008</w:t>
+            </w:r>
+          </w:p>
+        </w:tc>
+        <w:tc>
+          <w:tcPr>
+            <w:tcW w:type="dxa" w:w="1040"/>
+          </w:tcPr>
+          <w:p>
+            <w:r/>
+            <w:r>
+              <w:rPr>
+                <w:sz w:val="13"/>
+              </w:rPr>
+              <w:t>0.870 ± 0.018</w:t>
+            </w:r>
+          </w:p>
+        </w:tc>
+        <w:tc>
+          <w:tcPr>
+            <w:tcW w:type="dxa" w:w="1040"/>
+          </w:tcPr>
+          <w:p>
+            <w:r/>
+            <w:r>
+              <w:rPr>
+                <w:sz w:val="13"/>
+              </w:rPr>
+              <w:t>3.195 ± 0.128</w:t>
             </w:r>
           </w:p>
         </w:tc>
@@ -28366,21 +28477,21 @@
               <w:rPr>
                 <w:sz w:val="13"/>
               </w:rPr>
-              <w:t>10</w:t>
-            </w:r>
-          </w:p>
-        </w:tc>
-        <w:tc>
-          <w:tcPr>
-            <w:tcW w:type="dxa" w:w="1040"/>
-          </w:tcPr>
-          <w:p>
-            <w:r/>
-            <w:r>
-              <w:rPr>
-                <w:sz w:val="13"/>
-              </w:rPr>
-              <w:t>0.895 ± 0.007</w:t>
+              <w:t>14</w:t>
+            </w:r>
+          </w:p>
+        </w:tc>
+        <w:tc>
+          <w:tcPr>
+            <w:tcW w:type="dxa" w:w="1040"/>
+          </w:tcPr>
+          <w:p>
+            <w:r/>
+            <w:r>
+              <w:rPr>
+                <w:sz w:val="13"/>
+              </w:rPr>
+              <w:t>0.893 ± 0.009</w:t>
             </w:r>
           </w:p>
         </w:tc>
@@ -28408,21 +28519,21 @@
               <w:rPr>
                 <w:sz w:val="13"/>
               </w:rPr>
-              <w:t>0.871 ± 0.015</w:t>
-            </w:r>
-          </w:p>
-        </w:tc>
-        <w:tc>
-          <w:tcPr>
-            <w:tcW w:type="dxa" w:w="1040"/>
-          </w:tcPr>
-          <w:p>
-            <w:r/>
-            <w:r>
-              <w:rPr>
-                <w:sz w:val="13"/>
-              </w:rPr>
-              <w:t>3.192 ± 0.078</w:t>
+              <w:t>0.871 ± 0.014</w:t>
+            </w:r>
+          </w:p>
+        </w:tc>
+        <w:tc>
+          <w:tcPr>
+            <w:tcW w:type="dxa" w:w="1040"/>
+          </w:tcPr>
+          <w:p>
+            <w:r/>
+            <w:r>
+              <w:rPr>
+                <w:sz w:val="13"/>
+              </w:rPr>
+              <w:t>3.159 ± 0.086</w:t>
             </w:r>
           </w:p>
         </w:tc>
@@ -28494,63 +28605,63 @@
               <w:rPr>
                 <w:sz w:val="13"/>
               </w:rPr>
-              <w:t>10</w:t>
-            </w:r>
-          </w:p>
-        </w:tc>
-        <w:tc>
-          <w:tcPr>
-            <w:tcW w:type="dxa" w:w="1040"/>
-          </w:tcPr>
-          <w:p>
-            <w:r/>
-            <w:r>
-              <w:rPr>
-                <w:sz w:val="13"/>
-              </w:rPr>
-              <w:t>0.901 ± 0.005</w:t>
-            </w:r>
-          </w:p>
-        </w:tc>
-        <w:tc>
-          <w:tcPr>
-            <w:tcW w:type="dxa" w:w="1040"/>
-          </w:tcPr>
-          <w:p>
-            <w:r/>
-            <w:r>
-              <w:rPr>
-                <w:sz w:val="13"/>
-              </w:rPr>
-              <w:t>0.015 ± 0.006</w:t>
-            </w:r>
-          </w:p>
-        </w:tc>
-        <w:tc>
-          <w:tcPr>
-            <w:tcW w:type="dxa" w:w="1040"/>
-          </w:tcPr>
-          <w:p>
-            <w:r/>
-            <w:r>
-              <w:rPr>
-                <w:sz w:val="13"/>
-              </w:rPr>
-              <w:t>0.876 ± 0.012</w:t>
-            </w:r>
-          </w:p>
-        </w:tc>
-        <w:tc>
-          <w:tcPr>
-            <w:tcW w:type="dxa" w:w="1040"/>
-          </w:tcPr>
-          <w:p>
-            <w:r/>
-            <w:r>
-              <w:rPr>
-                <w:sz w:val="13"/>
-              </w:rPr>
-              <w:t>3.240 ± 0.037</w:t>
+              <w:t>14</w:t>
+            </w:r>
+          </w:p>
+        </w:tc>
+        <w:tc>
+          <w:tcPr>
+            <w:tcW w:type="dxa" w:w="1040"/>
+          </w:tcPr>
+          <w:p>
+            <w:r/>
+            <w:r>
+              <w:rPr>
+                <w:sz w:val="13"/>
+              </w:rPr>
+              <w:t>0.900 ± 0.007</w:t>
+            </w:r>
+          </w:p>
+        </w:tc>
+        <w:tc>
+          <w:tcPr>
+            <w:tcW w:type="dxa" w:w="1040"/>
+          </w:tcPr>
+          <w:p>
+            <w:r/>
+            <w:r>
+              <w:rPr>
+                <w:sz w:val="13"/>
+              </w:rPr>
+              <w:t>0.014 ± 0.006</w:t>
+            </w:r>
+          </w:p>
+        </w:tc>
+        <w:tc>
+          <w:tcPr>
+            <w:tcW w:type="dxa" w:w="1040"/>
+          </w:tcPr>
+          <w:p>
+            <w:r/>
+            <w:r>
+              <w:rPr>
+                <w:sz w:val="13"/>
+              </w:rPr>
+              <w:t>0.878 ± 0.011</w:t>
+            </w:r>
+          </w:p>
+        </w:tc>
+        <w:tc>
+          <w:tcPr>
+            <w:tcW w:type="dxa" w:w="1040"/>
+          </w:tcPr>
+          <w:p>
+            <w:r/>
+            <w:r>
+              <w:rPr>
+                <w:sz w:val="13"/>
+              </w:rPr>
+              <w:t>3.215 ± 0.052</w:t>
             </w:r>
           </w:p>
         </w:tc>
@@ -28622,63 +28733,63 @@
               <w:rPr>
                 <w:sz w:val="13"/>
               </w:rPr>
-              <w:t>10</w:t>
-            </w:r>
-          </w:p>
-        </w:tc>
-        <w:tc>
-          <w:tcPr>
-            <w:tcW w:type="dxa" w:w="1040"/>
-          </w:tcPr>
-          <w:p>
-            <w:r/>
-            <w:r>
-              <w:rPr>
-                <w:sz w:val="13"/>
-              </w:rPr>
-              <w:t>0.901 ± 0.007</w:t>
-            </w:r>
-          </w:p>
-        </w:tc>
-        <w:tc>
-          <w:tcPr>
-            <w:tcW w:type="dxa" w:w="1040"/>
-          </w:tcPr>
-          <w:p>
-            <w:r/>
-            <w:r>
-              <w:rPr>
-                <w:sz w:val="13"/>
-              </w:rPr>
-              <w:t>0.014 ± 0.005</w:t>
-            </w:r>
-          </w:p>
-        </w:tc>
-        <w:tc>
-          <w:tcPr>
-            <w:tcW w:type="dxa" w:w="1040"/>
-          </w:tcPr>
-          <w:p>
-            <w:r/>
-            <w:r>
-              <w:rPr>
-                <w:sz w:val="13"/>
-              </w:rPr>
-              <w:t>0.879 ± 0.011</w:t>
-            </w:r>
-          </w:p>
-        </w:tc>
-        <w:tc>
-          <w:tcPr>
-            <w:tcW w:type="dxa" w:w="1040"/>
-          </w:tcPr>
-          <w:p>
-            <w:r/>
-            <w:r>
-              <w:rPr>
-                <w:sz w:val="13"/>
-              </w:rPr>
-              <w:t>3.248 ± 0.049</w:t>
+              <w:t>14</w:t>
+            </w:r>
+          </w:p>
+        </w:tc>
+        <w:tc>
+          <w:tcPr>
+            <w:tcW w:type="dxa" w:w="1040"/>
+          </w:tcPr>
+          <w:p>
+            <w:r/>
+            <w:r>
+              <w:rPr>
+                <w:sz w:val="13"/>
+              </w:rPr>
+              <w:t>0.900 ± 0.006</w:t>
+            </w:r>
+          </w:p>
+        </w:tc>
+        <w:tc>
+          <w:tcPr>
+            <w:tcW w:type="dxa" w:w="1040"/>
+          </w:tcPr>
+          <w:p>
+            <w:r/>
+            <w:r>
+              <w:rPr>
+                <w:sz w:val="13"/>
+              </w:rPr>
+              <w:t>0.013 ± 0.005</w:t>
+            </w:r>
+          </w:p>
+        </w:tc>
+        <w:tc>
+          <w:tcPr>
+            <w:tcW w:type="dxa" w:w="1040"/>
+          </w:tcPr>
+          <w:p>
+            <w:r/>
+            <w:r>
+              <w:rPr>
+                <w:sz w:val="13"/>
+              </w:rPr>
+              <w:t>0.880 ± 0.009</w:t>
+            </w:r>
+          </w:p>
+        </w:tc>
+        <w:tc>
+          <w:tcPr>
+            <w:tcW w:type="dxa" w:w="1040"/>
+          </w:tcPr>
+          <w:p>
+            <w:r/>
+            <w:r>
+              <w:rPr>
+                <w:sz w:val="13"/>
+              </w:rPr>
+              <w:t>3.226 ± 0.070</w:t>
             </w:r>
           </w:p>
         </w:tc>
@@ -28750,63 +28861,63 @@
               <w:rPr>
                 <w:sz w:val="13"/>
               </w:rPr>
-              <w:t>10</w:t>
-            </w:r>
-          </w:p>
-        </w:tc>
-        <w:tc>
-          <w:tcPr>
-            <w:tcW w:type="dxa" w:w="1040"/>
-          </w:tcPr>
-          <w:p>
-            <w:r/>
-            <w:r>
-              <w:rPr>
-                <w:sz w:val="13"/>
-              </w:rPr>
-              <w:t>0.903 ± 0.006</w:t>
-            </w:r>
-          </w:p>
-        </w:tc>
-        <w:tc>
-          <w:tcPr>
-            <w:tcW w:type="dxa" w:w="1040"/>
-          </w:tcPr>
-          <w:p>
-            <w:r/>
-            <w:r>
-              <w:rPr>
-                <w:sz w:val="13"/>
-              </w:rPr>
-              <w:t>0.015 ± 0.006</w:t>
-            </w:r>
-          </w:p>
-        </w:tc>
-        <w:tc>
-          <w:tcPr>
-            <w:tcW w:type="dxa" w:w="1040"/>
-          </w:tcPr>
-          <w:p>
-            <w:r/>
-            <w:r>
-              <w:rPr>
-                <w:sz w:val="13"/>
-              </w:rPr>
-              <w:t>0.876 ± 0.016</w:t>
-            </w:r>
-          </w:p>
-        </w:tc>
-        <w:tc>
-          <w:tcPr>
-            <w:tcW w:type="dxa" w:w="1040"/>
-          </w:tcPr>
-          <w:p>
-            <w:r/>
-            <w:r>
-              <w:rPr>
-                <w:sz w:val="13"/>
-              </w:rPr>
-              <w:t>3.260 ± 0.075</w:t>
+              <w:t>14</w:t>
+            </w:r>
+          </w:p>
+        </w:tc>
+        <w:tc>
+          <w:tcPr>
+            <w:tcW w:type="dxa" w:w="1040"/>
+          </w:tcPr>
+          <w:p>
+            <w:r/>
+            <w:r>
+              <w:rPr>
+                <w:sz w:val="13"/>
+              </w:rPr>
+              <w:t>0.902 ± 0.005</w:t>
+            </w:r>
+          </w:p>
+        </w:tc>
+        <w:tc>
+          <w:tcPr>
+            <w:tcW w:type="dxa" w:w="1040"/>
+          </w:tcPr>
+          <w:p>
+            <w:r/>
+            <w:r>
+              <w:rPr>
+                <w:sz w:val="13"/>
+              </w:rPr>
+              <w:t>0.013 ± 0.006</w:t>
+            </w:r>
+          </w:p>
+        </w:tc>
+        <w:tc>
+          <w:tcPr>
+            <w:tcW w:type="dxa" w:w="1040"/>
+          </w:tcPr>
+          <w:p>
+            <w:r/>
+            <w:r>
+              <w:rPr>
+                <w:sz w:val="13"/>
+              </w:rPr>
+              <w:t>0.879 ± 0.014</w:t>
+            </w:r>
+          </w:p>
+        </w:tc>
+        <w:tc>
+          <w:tcPr>
+            <w:tcW w:type="dxa" w:w="1040"/>
+          </w:tcPr>
+          <w:p>
+            <w:r/>
+            <w:r>
+              <w:rPr>
+                <w:sz w:val="13"/>
+              </w:rPr>
+              <w:t>3.239 ± 0.080</w:t>
             </w:r>
           </w:p>
         </w:tc>
@@ -40039,7 +40150,7 @@
               <w:rPr>
                 <w:sz w:val="13"/>
               </w:rPr>
-              <w:t>21</w:t>
+              <w:t>24</w:t>
             </w:r>
           </w:p>
         </w:tc>
@@ -40067,7 +40178,7 @@
               <w:rPr>
                 <w:sz w:val="13"/>
               </w:rPr>
-              <w:t>0.044</w:t>
+              <w:t>0.045</w:t>
             </w:r>
           </w:p>
         </w:tc>
@@ -40081,7 +40192,7 @@
               <w:rPr>
                 <w:sz w:val="13"/>
               </w:rPr>
-              <w:t>0.994</w:t>
+              <w:t>1.020</w:t>
             </w:r>
           </w:p>
         </w:tc>
@@ -40095,7 +40206,7 @@
               <w:rPr>
                 <w:sz w:val="13"/>
               </w:rPr>
-              <w:t>1.003</w:t>
+              <w:t>1.031</w:t>
             </w:r>
           </w:p>
         </w:tc>
@@ -40109,7 +40220,7 @@
               <w:rPr>
                 <w:sz w:val="13"/>
               </w:rPr>
-              <w:t>0.002</w:t>
+              <w:t>0.001</w:t>
             </w:r>
           </w:p>
         </w:tc>
@@ -40123,7 +40234,7 @@
               <w:rPr>
                 <w:sz w:val="13"/>
               </w:rPr>
-              <w:t>0.633</w:t>
+              <w:t>0.833</w:t>
             </w:r>
           </w:p>
         </w:tc>
@@ -40137,7 +40248,7 @@
               <w:rPr>
                 <w:sz w:val="13"/>
               </w:rPr>
-              <w:t>0.913</w:t>
+              <w:t>0.921</w:t>
             </w:r>
           </w:p>
         </w:tc>
@@ -40181,7 +40292,7 @@
               <w:rPr>
                 <w:sz w:val="13"/>
               </w:rPr>
-              <w:t>21</w:t>
+              <w:t>24</w:t>
             </w:r>
           </w:p>
         </w:tc>
@@ -40195,7 +40306,7 @@
               <w:rPr>
                 <w:sz w:val="13"/>
               </w:rPr>
-              <w:t>0.902</w:t>
+              <w:t>0.903</w:t>
             </w:r>
           </w:p>
         </w:tc>
@@ -40209,7 +40320,7 @@
               <w:rPr>
                 <w:sz w:val="13"/>
               </w:rPr>
-              <w:t>0.056</w:t>
+              <w:t>0.053</w:t>
             </w:r>
           </w:p>
         </w:tc>
@@ -40223,7 +40334,7 @@
               <w:rPr>
                 <w:sz w:val="13"/>
               </w:rPr>
-              <w:t>0.994</w:t>
+              <w:t>1.020</w:t>
             </w:r>
           </w:p>
         </w:tc>
@@ -40237,7 +40348,7 @@
               <w:rPr>
                 <w:sz w:val="13"/>
               </w:rPr>
-              <w:t>0.988</w:t>
+              <w:t>1.019</w:t>
             </w:r>
           </w:p>
         </w:tc>
@@ -40265,7 +40376,7 @@
               <w:rPr>
                 <w:sz w:val="13"/>
               </w:rPr>
-              <w:t>0.042</w:t>
+              <w:t>0.037</w:t>
             </w:r>
           </w:p>
         </w:tc>
@@ -40279,7 +40390,7 @@
               <w:rPr>
                 <w:sz w:val="13"/>
               </w:rPr>
-              <w:t>0.874</w:t>
+              <w:t>0.903</w:t>
             </w:r>
           </w:p>
         </w:tc>
@@ -40323,7 +40434,7 @@
               <w:rPr>
                 <w:sz w:val="13"/>
               </w:rPr>
-              <w:t>21</w:t>
+              <w:t>24</w:t>
             </w:r>
           </w:p>
         </w:tc>
@@ -40337,7 +40448,7 @@
               <w:rPr>
                 <w:sz w:val="13"/>
               </w:rPr>
-              <w:t>0.886</w:t>
+              <w:t>0.891</w:t>
             </w:r>
           </w:p>
         </w:tc>
@@ -40351,7 +40462,7 @@
               <w:rPr>
                 <w:sz w:val="13"/>
               </w:rPr>
-              <w:t>0.046</w:t>
+              <w:t>0.050</w:t>
             </w:r>
           </w:p>
         </w:tc>
@@ -40365,7 +40476,7 @@
               <w:rPr>
                 <w:sz w:val="13"/>
               </w:rPr>
-              <w:t>0.994</w:t>
+              <w:t>1.020</w:t>
             </w:r>
           </w:p>
         </w:tc>
@@ -40379,7 +40490,7 @@
               <w:rPr>
                 <w:sz w:val="13"/>
               </w:rPr>
-              <w:t>0.990</w:t>
+              <w:t>1.010</w:t>
             </w:r>
           </w:p>
         </w:tc>
@@ -40393,7 +40504,7 @@
               <w:rPr>
                 <w:sz w:val="13"/>
               </w:rPr>
-              <w:t>-0.005</w:t>
+              <w:t>-0.006</w:t>
             </w:r>
           </w:p>
         </w:tc>
@@ -40407,7 +40518,7 @@
               <w:rPr>
                 <w:sz w:val="13"/>
               </w:rPr>
-              <w:t>0.179</w:t>
+              <w:t>0.121</w:t>
             </w:r>
           </w:p>
         </w:tc>
@@ -40421,7 +40532,7 @@
               <w:rPr>
                 <w:sz w:val="13"/>
               </w:rPr>
-              <w:t>0.898</w:t>
+              <w:t>0.931</w:t>
             </w:r>
           </w:p>
         </w:tc>
@@ -40465,7 +40576,7 @@
               <w:rPr>
                 <w:sz w:val="13"/>
               </w:rPr>
-              <w:t>21</w:t>
+              <w:t>24</w:t>
             </w:r>
           </w:p>
         </w:tc>
@@ -40479,7 +40590,7 @@
               <w:rPr>
                 <w:sz w:val="13"/>
               </w:rPr>
-              <w:t>0.891</w:t>
+              <w:t>0.894</w:t>
             </w:r>
           </w:p>
         </w:tc>
@@ -40493,7 +40604,7 @@
               <w:rPr>
                 <w:sz w:val="13"/>
               </w:rPr>
-              <w:t>0.053</w:t>
+              <w:t>0.050</w:t>
             </w:r>
           </w:p>
         </w:tc>
@@ -40507,7 +40618,7 @@
               <w:rPr>
                 <w:sz w:val="13"/>
               </w:rPr>
-              <w:t>0.994</w:t>
+              <w:t>1.020</w:t>
             </w:r>
           </w:p>
         </w:tc>
@@ -40521,7 +40632,7 @@
               <w:rPr>
                 <w:sz w:val="13"/>
               </w:rPr>
-              <w:t>0.929</w:t>
+              <w:t>1.009</w:t>
             </w:r>
           </w:p>
         </w:tc>
@@ -40535,7 +40646,7 @@
               <w:rPr>
                 <w:sz w:val="13"/>
               </w:rPr>
-              <w:t>-0.013</w:t>
+              <w:t>-0.011</w:t>
             </w:r>
           </w:p>
         </w:tc>
@@ -40549,7 +40660,7 @@
               <w:rPr>
                 <w:sz w:val="13"/>
               </w:rPr>
-              <w:t>0.009</w:t>
+              <w:t>0.005</w:t>
             </w:r>
           </w:p>
         </w:tc>
@@ -40563,7 +40674,7 @@
               <w:rPr>
                 <w:sz w:val="13"/>
               </w:rPr>
-              <w:t>0.869</w:t>
+              <w:t>0.874</w:t>
             </w:r>
           </w:p>
         </w:tc>
@@ -40607,7 +40718,7 @@
               <w:rPr>
                 <w:sz w:val="13"/>
               </w:rPr>
-              <w:t>21</w:t>
+              <w:t>24</w:t>
             </w:r>
           </w:p>
         </w:tc>
@@ -40621,7 +40732,7 @@
               <w:rPr>
                 <w:sz w:val="13"/>
               </w:rPr>
-              <w:t>0.891</w:t>
+              <w:t>0.894</w:t>
             </w:r>
           </w:p>
         </w:tc>
@@ -40649,7 +40760,7 @@
               <w:rPr>
                 <w:sz w:val="13"/>
               </w:rPr>
-              <w:t>0.994</w:t>
+              <w:t>1.020</w:t>
             </w:r>
           </w:p>
         </w:tc>
@@ -40663,7 +40774,7 @@
               <w:rPr>
                 <w:sz w:val="13"/>
               </w:rPr>
-              <w:t>0.994</w:t>
+              <w:t>1.020</w:t>
             </w:r>
           </w:p>
         </w:tc>
@@ -40749,7 +40860,7 @@
               <w:rPr>
                 <w:sz w:val="13"/>
               </w:rPr>
-              <w:t>21</w:t>
+              <w:t>24</w:t>
             </w:r>
           </w:p>
         </w:tc>
@@ -40763,7 +40874,7 @@
               <w:rPr>
                 <w:sz w:val="13"/>
               </w:rPr>
-              <w:t>0.884</w:t>
+              <w:t>0.891</w:t>
             </w:r>
           </w:p>
         </w:tc>
@@ -40777,7 +40888,7 @@
               <w:rPr>
                 <w:sz w:val="13"/>
               </w:rPr>
-              <w:t>0.046</w:t>
+              <w:t>0.048</w:t>
             </w:r>
           </w:p>
         </w:tc>
@@ -40791,7 +40902,7 @@
               <w:rPr>
                 <w:sz w:val="13"/>
               </w:rPr>
-              <w:t>0.994</w:t>
+              <w:t>1.020</w:t>
             </w:r>
           </w:p>
         </w:tc>
@@ -40805,7 +40916,7 @@
               <w:rPr>
                 <w:sz w:val="13"/>
               </w:rPr>
-              <w:t>0.966</w:t>
+              <w:t>1.017</w:t>
             </w:r>
           </w:p>
         </w:tc>
@@ -40819,7 +40930,7 @@
               <w:rPr>
                 <w:sz w:val="13"/>
               </w:rPr>
-              <w:t>-0.002</w:t>
+              <w:t>-0.004</w:t>
             </w:r>
           </w:p>
         </w:tc>
@@ -40833,7 +40944,7 @@
               <w:rPr>
                 <w:sz w:val="13"/>
               </w:rPr>
-              <w:t>0.432</w:t>
+              <w:t>0.136</w:t>
             </w:r>
           </w:p>
         </w:tc>
@@ -40847,7 +40958,7 @@
               <w:rPr>
                 <w:sz w:val="13"/>
               </w:rPr>
-              <w:t>0.844</w:t>
+              <w:t>0.845</w:t>
             </w:r>
           </w:p>
         </w:tc>
@@ -40891,7 +41002,7 @@
               <w:rPr>
                 <w:sz w:val="13"/>
               </w:rPr>
-              <w:t>21</w:t>
+              <w:t>24</w:t>
             </w:r>
           </w:p>
         </w:tc>
@@ -40905,7 +41016,7 @@
               <w:rPr>
                 <w:sz w:val="13"/>
               </w:rPr>
-              <w:t>0.865</w:t>
+              <w:t>0.857</w:t>
             </w:r>
           </w:p>
         </w:tc>
@@ -40919,7 +41030,7 @@
               <w:rPr>
                 <w:sz w:val="13"/>
               </w:rPr>
-              <w:t>0.041</w:t>
+              <w:t>0.047</w:t>
             </w:r>
           </w:p>
         </w:tc>
@@ -40933,7 +41044,7 @@
               <w:rPr>
                 <w:sz w:val="13"/>
               </w:rPr>
-              <w:t>0.408</w:t>
+              <w:t>0.525</w:t>
             </w:r>
           </w:p>
         </w:tc>
@@ -40947,7 +41058,7 @@
               <w:rPr>
                 <w:sz w:val="13"/>
               </w:rPr>
-              <w:t>0.421</w:t>
+              <w:t>0.458</w:t>
             </w:r>
           </w:p>
         </w:tc>
@@ -40961,7 +41072,7 @@
               <w:rPr>
                 <w:sz w:val="13"/>
               </w:rPr>
-              <w:t>0.015</w:t>
+              <w:t>0.006</w:t>
             </w:r>
           </w:p>
         </w:tc>
@@ -40975,7 +41086,7 @@
               <w:rPr>
                 <w:sz w:val="13"/>
               </w:rPr>
-              <w:t>0.562</w:t>
+              <w:t>0.663</w:t>
             </w:r>
           </w:p>
         </w:tc>
@@ -40989,7 +41100,7 @@
               <w:rPr>
                 <w:sz w:val="13"/>
               </w:rPr>
-              <w:t>0.906</w:t>
+              <w:t>0.909</w:t>
             </w:r>
           </w:p>
         </w:tc>
@@ -41033,7 +41144,7 @@
               <w:rPr>
                 <w:sz w:val="13"/>
               </w:rPr>
-              <w:t>21</w:t>
+              <w:t>24</w:t>
             </w:r>
           </w:p>
         </w:tc>
@@ -41047,7 +41158,7 @@
               <w:rPr>
                 <w:sz w:val="13"/>
               </w:rPr>
-              <w:t>0.917</w:t>
+              <w:t>0.899</w:t>
             </w:r>
           </w:p>
         </w:tc>
@@ -41061,7 +41172,7 @@
               <w:rPr>
                 <w:sz w:val="13"/>
               </w:rPr>
-              <w:t>0.040</w:t>
+              <w:t>0.042</w:t>
             </w:r>
           </w:p>
         </w:tc>
@@ -41075,7 +41186,7 @@
               <w:rPr>
                 <w:sz w:val="13"/>
               </w:rPr>
-              <w:t>0.408</w:t>
+              <w:t>0.525</w:t>
             </w:r>
           </w:p>
         </w:tc>
@@ -41089,7 +41200,7 @@
               <w:rPr>
                 <w:sz w:val="13"/>
               </w:rPr>
-              <w:t>0.462</w:t>
+              <w:t>0.580</w:t>
             </w:r>
           </w:p>
         </w:tc>
@@ -41103,7 +41214,7 @@
               <w:rPr>
                 <w:sz w:val="13"/>
               </w:rPr>
-              <w:t>-0.015</w:t>
+              <w:t>-0.013</w:t>
             </w:r>
           </w:p>
         </w:tc>
@@ -41117,7 +41228,7 @@
               <w:rPr>
                 <w:sz w:val="13"/>
               </w:rPr>
-              <w:t>0.433</w:t>
+              <w:t>0.330</w:t>
             </w:r>
           </w:p>
         </w:tc>
@@ -41131,7 +41242,7 @@
               <w:rPr>
                 <w:sz w:val="13"/>
               </w:rPr>
-              <w:t>0.860</w:t>
+              <w:t>0.903</w:t>
             </w:r>
           </w:p>
         </w:tc>
@@ -41175,7 +41286,7 @@
               <w:rPr>
                 <w:sz w:val="13"/>
               </w:rPr>
-              <w:t>21</w:t>
+              <w:t>24</w:t>
             </w:r>
           </w:p>
         </w:tc>
@@ -41189,7 +41300,7 @@
               <w:rPr>
                 <w:sz w:val="13"/>
               </w:rPr>
-              <w:t>0.902</w:t>
+              <w:t>0.889</w:t>
             </w:r>
           </w:p>
         </w:tc>
@@ -41203,7 +41314,7 @@
               <w:rPr>
                 <w:sz w:val="13"/>
               </w:rPr>
-              <w:t>0.037</w:t>
+              <w:t>0.042</w:t>
             </w:r>
           </w:p>
         </w:tc>
@@ -41217,7 +41328,7 @@
               <w:rPr>
                 <w:sz w:val="13"/>
               </w:rPr>
-              <w:t>0.408</w:t>
+              <w:t>0.525</w:t>
             </w:r>
           </w:p>
         </w:tc>
@@ -41231,7 +41342,7 @@
               <w:rPr>
                 <w:sz w:val="13"/>
               </w:rPr>
-              <w:t>0.595</w:t>
+              <w:t>0.630</w:t>
             </w:r>
           </w:p>
         </w:tc>
@@ -41245,7 +41356,7 @@
               <w:rPr>
                 <w:sz w:val="13"/>
               </w:rPr>
-              <w:t>9.23e-04</w:t>
+              <w:t>-0.002</w:t>
             </w:r>
           </w:p>
         </w:tc>
@@ -41259,7 +41370,7 @@
               <w:rPr>
                 <w:sz w:val="13"/>
               </w:rPr>
-              <w:t>0.892</w:t>
+              <w:t>0.989</w:t>
             </w:r>
           </w:p>
         </w:tc>
@@ -41273,7 +41384,7 @@
               <w:rPr>
                 <w:sz w:val="13"/>
               </w:rPr>
-              <w:t>0.877</w:t>
+              <w:t>0.925</w:t>
             </w:r>
           </w:p>
         </w:tc>
@@ -41317,7 +41428,7 @@
               <w:rPr>
                 <w:sz w:val="13"/>
               </w:rPr>
-              <w:t>21</w:t>
+              <w:t>24</w:t>
             </w:r>
           </w:p>
         </w:tc>
@@ -41331,7 +41442,7 @@
               <w:rPr>
                 <w:sz w:val="13"/>
               </w:rPr>
-              <w:t>0.901</w:t>
+              <w:t>0.891</w:t>
             </w:r>
           </w:p>
         </w:tc>
@@ -41345,7 +41456,7 @@
               <w:rPr>
                 <w:sz w:val="13"/>
               </w:rPr>
-              <w:t>0.040</w:t>
+              <w:t>0.043</w:t>
             </w:r>
           </w:p>
         </w:tc>
@@ -41359,7 +41470,7 @@
               <w:rPr>
                 <w:sz w:val="13"/>
               </w:rPr>
-              <w:t>0.408</w:t>
+              <w:t>0.525</w:t>
             </w:r>
           </w:p>
         </w:tc>
@@ -41373,7 +41484,7 @@
               <w:rPr>
                 <w:sz w:val="13"/>
               </w:rPr>
-              <w:t>0.530</w:t>
+              <w:t>0.552</w:t>
             </w:r>
           </w:p>
         </w:tc>
@@ -41387,7 +41498,7 @@
               <w:rPr>
                 <w:sz w:val="13"/>
               </w:rPr>
-              <w:t>-0.006</w:t>
+              <w:t>-0.007</w:t>
             </w:r>
           </w:p>
         </w:tc>
@@ -41401,7 +41512,7 @@
               <w:rPr>
                 <w:sz w:val="13"/>
               </w:rPr>
-              <w:t>0.393</w:t>
+              <w:t>0.422</w:t>
             </w:r>
           </w:p>
         </w:tc>
@@ -41415,7 +41526,7 @@
               <w:rPr>
                 <w:sz w:val="13"/>
               </w:rPr>
-              <w:t>0.860</w:t>
+              <w:t>0.867</w:t>
             </w:r>
           </w:p>
         </w:tc>
@@ -41459,7 +41570,7 @@
               <w:rPr>
                 <w:sz w:val="13"/>
               </w:rPr>
-              <w:t>21</w:t>
+              <w:t>24</w:t>
             </w:r>
           </w:p>
         </w:tc>
@@ -41473,7 +41584,7 @@
               <w:rPr>
                 <w:sz w:val="13"/>
               </w:rPr>
-              <w:t>0.839</w:t>
+              <w:t>0.828</w:t>
             </w:r>
           </w:p>
         </w:tc>
@@ -41487,7 +41598,7 @@
               <w:rPr>
                 <w:sz w:val="13"/>
               </w:rPr>
-              <w:t>0.067</w:t>
+              <w:t>0.069</w:t>
             </w:r>
           </w:p>
         </w:tc>
@@ -41501,7 +41612,7 @@
               <w:rPr>
                 <w:sz w:val="13"/>
               </w:rPr>
-              <w:t>0.408</w:t>
+              <w:t>0.525</w:t>
             </w:r>
           </w:p>
         </w:tc>
@@ -41515,7 +41626,7 @@
               <w:rPr>
                 <w:sz w:val="13"/>
               </w:rPr>
-              <w:t>0.408</w:t>
+              <w:t>0.525</w:t>
             </w:r>
           </w:p>
         </w:tc>
@@ -41601,7 +41712,7 @@
               <w:rPr>
                 <w:sz w:val="13"/>
               </w:rPr>
-              <w:t>21</w:t>
+              <w:t>24</w:t>
             </w:r>
           </w:p>
         </w:tc>
@@ -41615,7 +41726,7 @@
               <w:rPr>
                 <w:sz w:val="13"/>
               </w:rPr>
-              <w:t>0.864</w:t>
+              <w:t>0.834</w:t>
             </w:r>
           </w:p>
         </w:tc>
@@ -41629,7 +41740,7 @@
               <w:rPr>
                 <w:sz w:val="13"/>
               </w:rPr>
-              <w:t>0.047</w:t>
+              <w:t>0.055</w:t>
             </w:r>
           </w:p>
         </w:tc>
@@ -41643,7 +41754,7 @@
               <w:rPr>
                 <w:sz w:val="13"/>
               </w:rPr>
-              <w:t>0.408</w:t>
+              <w:t>0.525</w:t>
             </w:r>
           </w:p>
         </w:tc>
@@ -41657,7 +41768,7 @@
               <w:rPr>
                 <w:sz w:val="13"/>
               </w:rPr>
-              <w:t>0.375</w:t>
+              <w:t>0.460</w:t>
             </w:r>
           </w:p>
         </w:tc>
@@ -41671,7 +41782,7 @@
               <w:rPr>
                 <w:sz w:val="13"/>
               </w:rPr>
-              <w:t>-3.43e-04</w:t>
+              <w:t>-0.006</w:t>
             </w:r>
           </w:p>
         </w:tc>
@@ -41685,7 +41796,7 @@
               <w:rPr>
                 <w:sz w:val="13"/>
               </w:rPr>
-              <w:t>0.452</w:t>
+              <w:t>0.317</w:t>
             </w:r>
           </w:p>
         </w:tc>
@@ -41699,7 +41810,7 @@
               <w:rPr>
                 <w:sz w:val="13"/>
               </w:rPr>
-              <w:t>0.762</w:t>
+              <w:t>0.778</w:t>
             </w:r>
           </w:p>
         </w:tc>

</xml_diff>

<commit_message>
Review round 3: independent relatedness endpoint (maxkin), fairness/leakage statements
Co-Authored-By: Claude Opus 5.5 <noreply@anthropic.com>
Claude-Session: https://claude.ai/code/session_01CEw45wY536Kpddzc67ktHR
</commit_message>
<xml_diff>
--- a/Target_Journal_Submission/manuscript/Final_Manuscript.docx
+++ b/Target_Journal_Submission/manuscript/Final_Manuscript.docx
@@ -193,7 +193,7 @@
         <w:t>et al.</w:t>
       </w:r>
       <w:r>
-        <w:t xml:space="preserve"> 2018; Angelopoulos and Bates 2023). The guarantee rests on exchangeability between calibration residuals and the residual of the new observation. Conformal and related calibrated intervals have recently been proposed for polygenic scores in human populations (Hou </w:t>
+        <w:t xml:space="preserve"> 2018; Angelopoulos and Bates 2023). The guarantee rests on exchangeability between calibration residuals and the residual of the new observation. Conformal and related calibrated intervals have recently been proposed for polygenic scores in human populations (Sun </w:t>
       </w:r>
       <w:r>
         <w:rPr>
@@ -202,7 +202,7 @@
         <w:t>et al.</w:t>
       </w:r>
       <w:r>
-        <w:t xml:space="preserve"> 2024; Xu </w:t>
+        <w:t xml:space="preserve"> 2021; Hou </w:t>
       </w:r>
       <w:r>
         <w:rPr>
@@ -211,7 +211,7 @@
         <w:t>et al.</w:t>
       </w:r>
       <w:r>
-        <w:t xml:space="preserve"> 2025), and split-conformal intervals have been suggested for genomic selection on simulated data (Kumar 2026). In human polygenic scores, accuracy decays continuously with the genetic distance of an individual from the training data (Ding </w:t>
+        <w:t xml:space="preserve"> 2024; Xu </w:t>
       </w:r>
       <w:r>
         <w:rPr>
@@ -220,7 +220,7 @@
         <w:t>et al.</w:t>
       </w:r>
       <w:r>
-        <w:t xml:space="preserve"> 2023). This motivated context-specific calibration (Hou </w:t>
+        <w:t xml:space="preserve"> 2025; Kodji </w:t>
       </w:r>
       <w:r>
         <w:rPr>
@@ -229,7 +229,7 @@
         <w:t>et al.</w:t>
       </w:r>
       <w:r>
-        <w:t xml:space="preserve"> 2024). Breeding populations are more extreme. They consist of families and closely related lines, and in the scenarios that matter most the selection candidates belong to new crosses, new families or new sub-populations. A calibration hold-out drawn at random from the training population is then systematically more closely related to the remaining training individuals than the candidates are. Exchangeability fails along a known and measurable axis: relatedness to the training set. The statistical literature provides general tools for this situation, including weighted conformal prediction under covariate shift (Tibshirani </w:t>
+        <w:t xml:space="preserve"> 2026). Some of these use group-conditional (Mondrian) calibration across ancestry groups (Sun </w:t>
       </w:r>
       <w:r>
         <w:rPr>
@@ -238,7 +238,7 @@
         <w:t>et al.</w:t>
       </w:r>
       <w:r>
-        <w:t xml:space="preserve"> 2019; Barber </w:t>
+        <w:t xml:space="preserve"> 2021; Kodji </w:t>
       </w:r>
       <w:r>
         <w:rPr>
@@ -247,7 +247,7 @@
         <w:t>et al.</w:t>
       </w:r>
       <w:r>
-        <w:t xml:space="preserve"> 2023), localized conformal prediction (Guan 2023) and conditional guarantees (Gibbs </w:t>
+        <w:t xml:space="preserve"> 2026). Split-conformal intervals have been suggested for genomic selection on simulated data (Kumar 2026). In human polygenic scores, accuracy decays continuously with the genetic distance of an individual from the training data (Ding </w:t>
       </w:r>
       <w:r>
         <w:rPr>
@@ -256,12 +256,16 @@
         <w:t>et al.</w:t>
       </w:r>
       <w:r>
-        <w:t xml:space="preserve"> 2025). These tools must be given the right covariate and a calibration design in which their assumptions are plausible.</w:t>
-      </w:r>
-    </w:p>
-    <w:p>
-      <w:r>
-        <w:t>Here we connect these two lines of work. We use the GBLUP prediction error variance, scaled by the genetic variance, as a genotype-only measure of each candidate's relatedness to the training set. We propose kinship-aware conformal prediction (KinCP), which has three components:</w:t>
+        <w:t xml:space="preserve"> 2023). This motivated context-specific calibration (Hou </w:t>
+      </w:r>
+      <w:r>
+        <w:rPr>
+          <w:i/>
+        </w:rPr>
+        <w:t>et al.</w:t>
+      </w:r>
+      <w:r>
+        <w:t xml:space="preserve"> 2024). Breeding populations are more extreme. They consist of families and closely related lines, and in the scenarios that matter most the selection candidates belong to new crosses, new families or new sub-populations. A calibration hold-out drawn at random from the training population is then systematically more closely related to the remaining training individuals than the candidates are. Exchangeability fails along a known and measurable axis: relatedness to the training set. The statistical literature provides general tools for this situation:</w:t>
       </w:r>
     </w:p>
     <w:p>
@@ -269,7 +273,25 @@
         <w:pStyle w:val="ListBullet"/>
       </w:pPr>
       <w:r>
-        <w:t>(A) a calibration pool of out-of-fold residuals from random and genomic-cluster cross-fitting, spanning close and distant relatives;</w:t>
+        <w:t xml:space="preserve">normalised or locally weighted scores (Papadopoulos </w:t>
+      </w:r>
+      <w:r>
+        <w:rPr>
+          <w:i/>
+        </w:rPr>
+        <w:t>et al.</w:t>
+      </w:r>
+      <w:r>
+        <w:t xml:space="preserve"> 2002; Lei </w:t>
+      </w:r>
+      <w:r>
+        <w:rPr>
+          <w:i/>
+        </w:rPr>
+        <w:t>et al.</w:t>
+      </w:r>
+      <w:r>
+        <w:t xml:space="preserve"> 2018);</w:t>
       </w:r>
     </w:p>
     <w:p>
@@ -277,7 +299,25 @@
         <w:pStyle w:val="ListBullet"/>
       </w:pPr>
       <w:r>
-        <w:t>(B) nonconformity scores normalised by the PEV-implied predictive standard deviation;</w:t>
+        <w:t xml:space="preserve">weighted conformal prediction under covariate shift (Tibshirani </w:t>
+      </w:r>
+      <w:r>
+        <w:rPr>
+          <w:i/>
+        </w:rPr>
+        <w:t>et al.</w:t>
+      </w:r>
+      <w:r>
+        <w:t xml:space="preserve"> 2019; Barber </w:t>
+      </w:r>
+      <w:r>
+        <w:rPr>
+          <w:i/>
+        </w:rPr>
+        <w:t>et al.</w:t>
+      </w:r>
+      <w:r>
+        <w:t xml:space="preserve"> 2023);</w:t>
       </w:r>
     </w:p>
     <w:p>
@@ -285,26 +325,7 @@
         <w:pStyle w:val="ListBullet"/>
       </w:pPr>
       <w:r>
-        <w:t>(C) localisation of the conformal quantile in the relatedness metric.</w:t>
-      </w:r>
-    </w:p>
-    <w:p>
-      <w:r>
-        <w:t>Throughout, intervals are for the phenotype a candidate will express, which is the quantity breeders observe when validating predictions. The relatedness covariate is also shown, by simulation, to calibrate the error of the genetic-value prediction. We regard the calibration design as the main contribution: a relatedness-diverse calibration pool together with the PEV covariate. KinCP is its distribution-free implementation.</w:t>
-      </w:r>
-    </w:p>
-    <w:p>
-      <w:r>
-        <w:t xml:space="preserve">We evaluate KinCP against seven alternatives across ten plant and animal species from the EasyGeSe resource (Quesada-Traver </w:t>
-      </w:r>
-      <w:r>
-        <w:rPr>
-          <w:i/>
-        </w:rPr>
-        <w:t>et al.</w:t>
-      </w:r>
-      <w:r>
-        <w:t xml:space="preserve"> 2025). The design covers three deployment regimes, three base predictors, an ablation of every component, and a simulation on real genotypes with known genetic values. It addresses five questions:</w:t>
+        <w:t>localized conformal prediction (Guan 2023);</w:t>
       </w:r>
     </w:p>
     <w:p>
@@ -312,7 +333,16 @@
         <w:pStyle w:val="ListBullet"/>
       </w:pPr>
       <w:r>
-        <w:t>RQ1: how miscalibrated are standard intervals across relatedness levels and deployment regimes?</w:t>
+        <w:t xml:space="preserve">group-conditional and hierarchical guarantees (Vovk 2013; Dunn </w:t>
+      </w:r>
+      <w:r>
+        <w:rPr>
+          <w:i/>
+        </w:rPr>
+        <w:t>et al.</w:t>
+      </w:r>
+      <w:r>
+        <w:t xml:space="preserve"> 2023; Bhattacharyya and Barber 2026);</w:t>
       </w:r>
     </w:p>
     <w:p>
@@ -320,7 +350,26 @@
         <w:pStyle w:val="ListBullet"/>
       </w:pPr>
       <w:r>
-        <w:t>RQ2: does KinCP restore marginal and relatedness-conditional coverage, and which components are responsible?</w:t>
+        <w:t xml:space="preserve">conditional guarantees over function classes (Gibbs </w:t>
+      </w:r>
+      <w:r>
+        <w:rPr>
+          <w:i/>
+        </w:rPr>
+        <w:t>et al.</w:t>
+      </w:r>
+      <w:r>
+        <w:t xml:space="preserve"> 2025).</w:t>
+      </w:r>
+    </w:p>
+    <w:p>
+      <w:r>
+        <w:t>These tools must be given the right covariate and a calibration design in which their assumptions are plausible.</w:t>
+      </w:r>
+    </w:p>
+    <w:p>
+      <w:r>
+        <w:t>Here we connect these two lines of work. We use the GBLUP prediction error variance, scaled by the genetic variance, as a genotype-only measure of each candidate's genomic relatedness to the training set (we call the approach "kinship-aware", where kinship refers to genomic relationships). We propose kinship-aware conformal prediction (KinCP), which has three components:</w:t>
       </w:r>
     </w:p>
     <w:p>
@@ -328,7 +377,7 @@
         <w:pStyle w:val="ListBullet"/>
       </w:pPr>
       <w:r>
-        <w:t>RQ3: does this hold across species, traits, predictors and genetic architectures?</w:t>
+        <w:t>(A) a calibration pool of out-of-fold residuals from random and genomic-cluster cross-fitting, spanning close and distant relatives;</w:t>
       </w:r>
     </w:p>
     <w:p>
@@ -336,7 +385,7 @@
         <w:pStyle w:val="ListBullet"/>
       </w:pPr>
       <w:r>
-        <w:t>RQ4: what does it cost, and how sensitive is it to its tuning choices?</w:t>
+        <w:t>(B) nonconformity scores normalised by the PEV-implied predictive standard deviation;</w:t>
       </w:r>
     </w:p>
     <w:p>
@@ -344,6 +393,94 @@
         <w:pStyle w:val="ListBullet"/>
       </w:pPr>
       <w:r>
+        <w:t>(C) localisation of the conformal quantile in the relatedness metric.</w:t>
+      </w:r>
+    </w:p>
+    <w:p>
+      <w:r>
+        <w:t>Throughout, intervals are for the phenotype a candidate will express, which is the quantity breeders observe when validating predictions. The relatedness covariate is also shown, by simulation, to calibrate the error of the genetic-value prediction. We regard the calibration design as the main contribution: a relatedness-diverse calibration pool together with the PEV covariate. KinCP is its distribution-free implementation. The conformal components themselves are established tools; what is new is:</w:t>
+      </w:r>
+    </w:p>
+    <w:p>
+      <w:pPr>
+        <w:pStyle w:val="ListBullet"/>
+      </w:pPr>
+      <w:r>
+        <w:t>the identification and measurement of relatedness as the variable along which genomic-prediction intervals lose calibration;</w:t>
+      </w:r>
+    </w:p>
+    <w:p>
+      <w:pPr>
+        <w:pStyle w:val="ListBullet"/>
+      </w:pPr>
+      <w:r>
+        <w:t>a calibration-pool design that makes the relevant shift assumption plausible without phenotypes of the candidates;</w:t>
+      </w:r>
+    </w:p>
+    <w:p>
+      <w:pPr>
+        <w:pStyle w:val="ListBullet"/>
+      </w:pPr>
+      <w:r>
+        <w:t>a pre-specified, multi-species evaluation.</w:t>
+      </w:r>
+    </w:p>
+    <w:p>
+      <w:r>
+        <w:t>We do not claim a new conformal theorem, nor superiority over a parametric calibration fitted to the same pool.</w:t>
+      </w:r>
+    </w:p>
+    <w:p>
+      <w:r>
+        <w:t xml:space="preserve">We evaluate KinCP against seven alternatives across ten plant and animal species from the EasyGeSe resource (Quesada-Traver </w:t>
+      </w:r>
+      <w:r>
+        <w:rPr>
+          <w:i/>
+        </w:rPr>
+        <w:t>et al.</w:t>
+      </w:r>
+      <w:r>
+        <w:t xml:space="preserve"> 2025). The design covers three deployment regimes, three base predictors, an ablation of every component, and a simulation on real genotypes with known genetic values. It addresses five questions:</w:t>
+      </w:r>
+    </w:p>
+    <w:p>
+      <w:pPr>
+        <w:pStyle w:val="ListBullet"/>
+      </w:pPr>
+      <w:r>
+        <w:t>RQ1: how miscalibrated are standard intervals across relatedness levels and deployment regimes?</w:t>
+      </w:r>
+    </w:p>
+    <w:p>
+      <w:pPr>
+        <w:pStyle w:val="ListBullet"/>
+      </w:pPr>
+      <w:r>
+        <w:t>RQ2: does KinCP restore marginal and relatedness-conditional coverage, and which components are responsible?</w:t>
+      </w:r>
+    </w:p>
+    <w:p>
+      <w:pPr>
+        <w:pStyle w:val="ListBullet"/>
+      </w:pPr>
+      <w:r>
+        <w:t>RQ3: does this hold across species, traits, predictors and genetic architectures?</w:t>
+      </w:r>
+    </w:p>
+    <w:p>
+      <w:pPr>
+        <w:pStyle w:val="ListBullet"/>
+      </w:pPr>
+      <w:r>
+        <w:t>RQ4: what does it cost, and how sensitive is it to its tuning choices?</w:t>
+      </w:r>
+    </w:p>
+    <w:p>
+      <w:pPr>
+        <w:pStyle w:val="ListBullet"/>
+      </w:pPr>
+      <w:r>
         <w:t>RQ5: where does it fail, and how does calibration affect selection?</w:t>
       </w:r>
     </w:p>
@@ -2308,7 +2445,12 @@
         <w:t>d</w:t>
       </w:r>
       <w:r>
-        <w:t>) used outer-training individuals only. Inner cross-fitting reused the outer-fold δ (deviation D3). Seeds {11, 22, 33, 44, 55} were fixed in advance and tied to repeats. No seed was selected after viewing results.</w:t>
+        <w:t>) used outer-training individuals only. Inner cross-fitting reused the outer-fold δ (deviation D3). Seeds {11, 22, 33, 44, 55} were fixed in advance and tied to repeats. No seed was selected after viewing results. The R1 repeats re-use the same individuals, and the R2 seeds share identical outer folds and differ only in inner randomness, so neither is an independent replicate. Test folds with fewer than five individuals were skipped. This affected only one loblolly-pine cluster of three trees, leaving 20 of 25 R2 folds per pine trait.</w:t>
+      </w:r>
+    </w:p>
+    <w:p>
+      <w:r>
+        <w:t>Split conformal fits its model on 80% of the training set by construction. LightGBM hyper-parameters were not tuned, which may limit its point accuracy but affects all interval methods equally, because they share the same base predictor.</w:t>
       </w:r>
     </w:p>
     <w:p>
@@ -2535,7 +2677,12 @@
         <w:t>P</w:t>
       </w:r>
       <w:r>
-        <w:t>-values were Holm-adjusted (Holm 1979) within each family, defined by base predictor × endpoint × comparison set (baselines or ablations). Effect sizes were the median paired difference (competitor minus KinCP; positive values favour KinCP), with 95% percentile-bootstrap confidence intervals (10,000 resamples; Efron 1979), and the matched-pairs rank-biserial correlation (Kerby 2014).</w:t>
+        <w:t>-values were Holm-adjusted (Holm 1979) within each family, defined by base predictor × endpoint × comparison set (baselines or ablations). Each baseline family spans three regimes and seven competitors (21 tests), which is conservative. Effect sizes were the median paired difference (competitor minus KinCP; positive values favour KinCP), with 95% percentile-bootstrap confidence intervals (10,000 resamples; Efron 1979), and the matched-pairs rank-biserial correlation (Kerby 2014). With 24 heterogeneous units these intervals can be asymmetric and mainly reflect heterogeneity between units.</w:t>
+      </w:r>
+    </w:p>
+    <w:p>
+      <w:r>
+        <w:t>As a robustness check on the primary endpoint, conditional coverage error was also computed on quintiles of the maximum standardised genomic relationship to the training set, a relatedness measure that KinCP does not use.</w:t>
       </w:r>
     </w:p>
     <w:p>
@@ -2603,6 +2750,65 @@
         <w:pStyle w:val="Heading2"/>
       </w:pPr>
       <w:r>
+        <w:t>Exploratory analyses (not pre-specified)</w:t>
+      </w:r>
+    </w:p>
+    <w:p>
+      <w:r>
+        <w:t>Two variants were added after the main results had been seen, and are reported separately as exploratory (File S1, deviation D6). Both were run with GBLUP for R1 (first repeat) and R2 (first seed) on all units.</w:t>
+      </w:r>
+    </w:p>
+    <w:p>
+      <w:pPr>
+        <w:pStyle w:val="ListNumber"/>
+      </w:pPr>
+      <w:r>
+        <w:rPr>
+          <w:b/>
+        </w:rPr>
+        <w:t>KinCP-G.</w:t>
+      </w:r>
+      <w:r>
+        <w:t xml:space="preserve"> The cluster folds of pool A are the </w:t>
+      </w:r>
+      <w:r>
+        <w:rPr>
+          <w:i/>
+        </w:rPr>
+        <w:t>global</w:t>
+      </w:r>
+      <w:r>
+        <w:t xml:space="preserve"> genomic clusters present in the training set rather than a re-clustering of it. This matches the granularity of the calibration shifts to cluster-out deployment.</w:t>
+      </w:r>
+    </w:p>
+    <w:p>
+      <w:pPr>
+        <w:pStyle w:val="ListNumber"/>
+      </w:pPr>
+      <w:r>
+        <w:rPr>
+          <w:b/>
+        </w:rPr>
+        <w:t>Mondrian-d.</w:t>
+      </w:r>
+      <w:r>
+        <w:t xml:space="preserve"> This is a group-conditional alternative to localisation C (Vovk 2013). It uses pool A and normalised scores, with separate conformal quantiles within quintile bins of log </w:t>
+      </w:r>
+      <w:r>
+        <w:rPr>
+          <w:i/>
+        </w:rPr>
+        <w:t>d</w:t>
+      </w:r>
+      <w:r>
+        <w:t>.</w:t>
+      </w:r>
+    </w:p>
+    <w:p>
+      <w:pPr>
+        <w:pStyle w:val="Heading2"/>
+      </w:pPr>
+      <w:r>
         <w:t>Software, reproducibility and pre-specification</w:t>
       </w:r>
     </w:p>
@@ -3125,6 +3331,104 @@
         <w:rPr>
           <w:b/>
         </w:rPr>
+        <w:t>Robustness of the endpoint to the relatedness measure.</w:t>
+      </w:r>
+      <w:r>
+        <w:t xml:space="preserve"> The primary endpoint bins candidates by </w:t>
+      </w:r>
+      <w:r>
+        <w:rPr>
+          <w:i/>
+        </w:rPr>
+        <w:t>d</w:t>
+      </w:r>
+      <w:r>
+        <w:t>, which is also KinCP's localisation variable. We therefore repeated the analysis on quintiles of an independent measure: the maximum standardised genomic relationship of each candidate to the training set.</w:t>
+      </w:r>
+    </w:p>
+    <w:p>
+      <w:pPr>
+        <w:pStyle w:val="ListBullet"/>
+      </w:pPr>
+      <w:r>
+        <w:rPr>
+          <w:i/>
+        </w:rPr>
+        <w:t>Under R2,</w:t>
+      </w:r>
+      <w:r>
+        <w:t xml:space="preserve"> KinCP again had the smallest conditional error (0.032, against 0.076 for CV+ and 0.050 for Gauss-PEV). It was better than Gauss-PEV in 23/24 units (Holm </w:t>
+      </w:r>
+      <w:r>
+        <w:rPr>
+          <w:i/>
+        </w:rPr>
+        <w:t>P</w:t>
+      </w:r>
+      <w:r>
+        <w:t xml:space="preserve"> &lt; 0.001) and than CV+ in 21/24 (Holm </w:t>
+      </w:r>
+      <w:r>
+        <w:rPr>
+          <w:i/>
+        </w:rPr>
+        <w:t>P</w:t>
+      </w:r>
+      <w:r>
+        <w:t xml:space="preserve"> &lt; 0.001). It did not differ significantly from CalPred-style calibration on pool A (Holm </w:t>
+      </w:r>
+      <w:r>
+        <w:rPr>
+          <w:i/>
+        </w:rPr>
+        <w:t>P</w:t>
+      </w:r>
+      <w:r>
+        <w:t xml:space="preserve"> = 0.094).</w:t>
+      </w:r>
+    </w:p>
+    <w:p>
+      <w:pPr>
+        <w:pStyle w:val="ListBullet"/>
+      </w:pPr>
+      <w:r>
+        <w:rPr>
+          <w:i/>
+        </w:rPr>
+        <w:t>Under R1,</w:t>
+      </w:r>
+      <w:r>
+        <w:t xml:space="preserve"> all methods were similar on this measure (KinCP 0.022, CV+ 0.026, Gauss-PEV 0.023; all Holm </w:t>
+      </w:r>
+      <w:r>
+        <w:rPr>
+          <w:i/>
+        </w:rPr>
+        <w:t>P</w:t>
+      </w:r>
+      <w:r>
+        <w:t xml:space="preserve"> ≥ 0.15). Relatedness-blind intervals still over-covered the candidates with the closest relatives in the training set (CV+ 0.928).</w:t>
+      </w:r>
+    </w:p>
+    <w:p>
+      <w:r>
+        <w:t xml:space="preserve">KinCP's advantage under random cross-validation is therefore specific to calibration along </w:t>
+      </w:r>
+      <w:r>
+        <w:rPr>
+          <w:i/>
+        </w:rPr>
+        <w:t>d</w:t>
+      </w:r>
+      <w:r>
+        <w:t xml:space="preserve"> and is small. Its advantage under cluster-out deployment does not depend on how relatedness is measured.</w:t>
+      </w:r>
+    </w:p>
+    <w:p>
+      <w:r>
+        <w:rPr>
+          <w:b/>
+        </w:rPr>
         <w:t>Remaining gap.</w:t>
       </w:r>
       <w:r>
@@ -3596,7 +3900,30 @@
         <w:t>et al.</w:t>
       </w:r>
       <w:r>
-        <w:t xml:space="preserve"> 2024). In breeding populations, however, the dominant structure is family relatedness rather than continental ancestry. Our results show that adopting this covariate is not enough. Normalising scores by it (NormCP) or fitting a heteroscedastic model to random-fold residuals (CalPred-style with a random pool) still left large errors under cluster-out deployment. Calibration residuals must also </w:t>
+        <w:t xml:space="preserve"> 2024). In breeding populations, however, the dominant structure is family relatedness rather than continental ancestry. The training set typically contains full- and half-sibs of some candidates and no relatives of others, so relatedness to the training set varies far more within a single deployment than in largely unrelated human cohorts.</w:t>
+      </w:r>
+    </w:p>
+    <w:p>
+      <w:r>
+        <w:t xml:space="preserve">The point here goes beyond the known optimism of random cross-validation for </w:t>
+      </w:r>
+      <w:r>
+        <w:rPr>
+          <w:i/>
+        </w:rPr>
+        <w:t>accuracy</w:t>
+      </w:r>
+      <w:r>
+        <w:t xml:space="preserve"> (Werner </w:t>
+      </w:r>
+      <w:r>
+        <w:rPr>
+          <w:i/>
+        </w:rPr>
+        <w:t>et al.</w:t>
+      </w:r>
+      <w:r>
+        <w:t xml:space="preserve"> 2020). Uncertainty statements calibrated on random hold-outs are miscalibrated in a relatedness-dependent way even when their marginal coverage is nominal. This can be corrected using genotypes alone. Our results show that adopting this covariate is not enough. Normalising scores by it (NormCP) or fitting a heteroscedastic model to random-fold residuals (CalPred-style with a random pool) still left large errors under cluster-out deployment. Calibration residuals must also </w:t>
       </w:r>
       <w:r>
         <w:rPr>
@@ -3851,10 +4178,10 @@
         <w:rPr>
           <w:b/>
         </w:rPr>
-        <w:t>Statistical units.</w:t>
-      </w:r>
-      <w:r>
-        <w:t xml:space="preserve"> Traits from the same species share genotypes, so the 24 units are not fully independent. The pattern was, however, consistent across species (Figure 4).</w:t>
+        <w:t>Phenotype preprocessing.</w:t>
+      </w:r>
+      <w:r>
+        <w:t xml:space="preserve"> Some EasyGeSe phenotypes are BLUEs adjusted across all lines and environments (e.g. maize, barley). Test and training phenotypes may therefore share adjusted environmental effects. This mild preprocessing leakage applies equally to all methods.</w:t>
       </w:r>
     </w:p>
     <w:p>
@@ -3865,10 +4192,19 @@
         <w:rPr>
           <w:b/>
         </w:rPr>
-        <w:t>Trait choice.</w:t>
-      </w:r>
-      <w:r>
-        <w:t xml:space="preserve"> Traits were chosen by a rule fixed in advance. In loblolly pine this selected two closely related root traits.</w:t>
+        <w:t>R1 advantage.</w:t>
+      </w:r>
+      <w:r>
+        <w:t xml:space="preserve"> Under random cross-validation, KinCP's advantage was small and specific to calibration along </w:t>
+      </w:r>
+      <w:r>
+        <w:rPr>
+          <w:i/>
+        </w:rPr>
+        <w:t>d</w:t>
+      </w:r>
+      <w:r>
+        <w:t>. It was not significant when relatedness was measured by maximum genomic relationship.</w:t>
       </w:r>
     </w:p>
     <w:p>
@@ -3879,10 +4215,10 @@
         <w:rPr>
           <w:b/>
         </w:rPr>
-        <w:t>Compute.</w:t>
-      </w:r>
-      <w:r>
-        <w:t xml:space="preserve"> LightGBM was not run on maize, and the RKHS and LightGBM analyses used fewer repeats than GBLUP, both for compute reasons.</w:t>
+        <w:t>Statistical units.</w:t>
+      </w:r>
+      <w:r>
+        <w:t xml:space="preserve"> Traits from the same species share genotypes, so the 24 units are not fully independent. The pattern was, however, consistent across species (Figure 4).</w:t>
       </w:r>
     </w:p>
     <w:p>
@@ -3893,6 +4229,34 @@
         <w:rPr>
           <w:b/>
         </w:rPr>
+        <w:t>Trait choice.</w:t>
+      </w:r>
+      <w:r>
+        <w:t xml:space="preserve"> Traits were chosen by a rule fixed in advance. In loblolly pine this selected two closely related root traits.</w:t>
+      </w:r>
+    </w:p>
+    <w:p>
+      <w:pPr>
+        <w:pStyle w:val="ListBullet"/>
+      </w:pPr>
+      <w:r>
+        <w:rPr>
+          <w:b/>
+        </w:rPr>
+        <w:t>Compute.</w:t>
+      </w:r>
+      <w:r>
+        <w:t xml:space="preserve"> LightGBM was not run on maize, and the RKHS and LightGBM analyses used fewer repeats than GBLUP, both for compute reasons.</w:t>
+      </w:r>
+    </w:p>
+    <w:p>
+      <w:pPr>
+        <w:pStyle w:val="ListBullet"/>
+      </w:pPr>
+      <w:r>
+        <w:rPr>
+          <w:b/>
+        </w:rPr>
         <w:t>Scope of the evaluation.</w:t>
       </w:r>
       <w:r>
@@ -4003,147 +4367,177 @@
     </w:p>
     <w:p>
       <w:r>
-        <w:t>Clark SA, Hickey JM, Daetwyler HD, van der Werf JH. 2012. The importance of information on relatives for the prediction of genomic breeding values and the implications for the makeup of reference data sets in livestock breeding schemes. Genetics Selection Evolution. 44(1):4. doi:10.1186/1297-9686-44-4</w:t>
+        <w:t>Bhattacharyya A, Barber RF. 2026. Group-weighted conformal prediction. Electronic Journal of Statistics. 20(1). doi:10.1214/26-ejs2506</w:t>
       </w:r>
     </w:p>
     <w:p>
       <w:r>
-        <w:t>Crossa J, Pérez-Rodríguez P, Cuevas J, Montesinos-López O, Jarquín D, de los Campos G, Burgueño J, González-Camacho JM, Pérez-Elizalde S, Beyene Y, et al. 2017. Genomic Selection in Plant Breeding: Methods, Models, and Perspectives. Trends in Plant Science. 22(11):961–975. doi:10.1016/j.tplants.2017.08.011</w:t>
+        <w:t>Clark SA, Hickey JM, Daetwyler HD, van der Werf JH. 2012. The importance of information on relatives for the prediction of genomic breeding values and the implications for the makeup of reference data sets in livestock breeding schemes. Genetics Selection Evolution. 44(1):4. doi:10.1186/1297-9686-44-4</w:t>
       </w:r>
     </w:p>
     <w:p>
       <w:r>
-        <w:t>de los Campos G, Gianola D, Rosa GJM, Weigel KA, Crossa J. 2010. Semi-parametric genomic-enabled prediction of genetic values using reproducing kernel Hilbert spaces methods. Genetics Research. 92(4):295–308. doi:10.1017/s0016672310000285</w:t>
+        <w:t>Crossa J, Pérez-Rodríguez P, Cuevas J, Montesinos-López O, Jarquín D, de los Campos G, Burgueño J, González-Camacho JM, Pérez-Elizalde S, Beyene Y, et al. 2017. Genomic Selection in Plant Breeding: Methods, Models, and Perspectives. Trends in Plant Science. 22(11):961–975. doi:10.1016/j.tplants.2017.08.011</w:t>
       </w:r>
     </w:p>
     <w:p>
       <w:r>
-        <w:t>Ding Y, Hou K, Xu Z, Pimplaskar A, Petter E, Boulier K, Privé F, Vilhjálmsson BJ, Olde Loohuis LM, Pasaniuc B. 2023. Polygenic scoring accuracy varies across the genetic ancestry continuum. Nature. 618(7966):774–781. doi:10.1038/s41586-023-06079-4</w:t>
+        <w:t>de los Campos G, Gianola D, Rosa GJM, Weigel KA, Crossa J. 2010. Semi-parametric genomic-enabled prediction of genetic values using reproducing kernel Hilbert spaces methods. Genetics Research. 92(4):295–308. doi:10.1017/s0016672310000285</w:t>
       </w:r>
     </w:p>
     <w:p>
       <w:r>
-        <w:t>Efron B. 1979. Bootstrap Methods: Another Look at the Jackknife. The Annals of Statistics. 7(1). doi:10.1214/aos/1176344552</w:t>
+        <w:t>Ding Y, Hou K, Xu Z, Pimplaskar A, Petter E, Boulier K, Privé F, Vilhjálmsson BJ, Olde Loohuis LM, Pasaniuc B. 2023. Polygenic scoring accuracy varies across the genetic ancestry continuum. Nature. 618(7966):774–781. doi:10.1038/s41586-023-06079-4</w:t>
       </w:r>
     </w:p>
     <w:p>
       <w:r>
-        <w:t>Gianola D, van Kaam JBCHM. 2008. Reproducing Kernel Hilbert Spaces Regression Methods for Genomic Assisted Prediction of Quantitative Traits. Genetics. 178(4):2289–2303. doi:10.1534/genetics.107.084285</w:t>
+        <w:t>Dunn R, Wasserman L, Ramdas A. 2023. Distribution-Free Prediction Sets for Two-Layer Hierarchical Models. Journal of the American Statistical Association. 118(544):2491–2502. doi:10.1080/01621459.2022.2060112</w:t>
       </w:r>
     </w:p>
     <w:p>
       <w:r>
-        <w:t>Gibbs I, Cherian JJ, Candès EJ. 2025. Conformal prediction with conditional guarantees. Journal of the Royal Statistical Society Series B: Statistical Methodology. 87(4):1100–1126. doi:10.1093/jrsssb/qkaf008</w:t>
+        <w:t>Efron B. 1979. Bootstrap Methods: Another Look at the Jackknife. The Annals of Statistics. 7(1). doi:10.1214/aos/1176344552</w:t>
       </w:r>
     </w:p>
     <w:p>
       <w:r>
-        <w:t>Gneiting T, Raftery AE. 2007. Strictly Proper Scoring Rules, Prediction, and Estimation. Journal of the American Statistical Association. 102(477):359–378. doi:10.1198/016214506000001437</w:t>
+        <w:t>Gianola D, van Kaam JBCHM. 2008. Reproducing Kernel Hilbert Spaces Regression Methods for Genomic Assisted Prediction of Quantitative Traits. Genetics. 178(4):2289–2303. doi:10.1534/genetics.107.084285</w:t>
       </w:r>
     </w:p>
     <w:p>
       <w:r>
-        <w:t>Gogna A, Schulthess AW, Röder MS, Ganal MW, Reif JC. 2022. Gabi wheat a panel of European elite lines as central stock for wheat genetic research. Scientific Data. 9(1):538. doi:10.1038/s41597-022-01651-5</w:t>
+        <w:t>Gibbs I, Cherian JJ, Candès EJ. 2025. Conformal prediction with conditional guarantees. Journal of the Royal Statistical Society Series B: Statistical Methodology. 87(4):1100–1126. doi:10.1093/jrsssb/qkaf008</w:t>
       </w:r>
     </w:p>
     <w:p>
       <w:r>
-        <w:t>Guan L. 2023. Localized conformal prediction: a generalized inference framework for conformal prediction. Biometrika. 110(1):33–50. doi:10.1093/biomet/asac040</w:t>
+        <w:t>Gneiting T, Raftery AE. 2007. Strictly Proper Scoring Rules, Prediction, and Estimation. Journal of the American Statistical Association. 102(477):359–378. doi:10.1198/016214506000001437</w:t>
       </w:r>
     </w:p>
     <w:p>
       <w:r>
-        <w:t>Habier D, Fernando RL, Dekkers JCM. 2007. The Impact of Genetic Relationship Information on Genome-Assisted Breeding Values. Genetics. 177(4):2389–2397. doi:10.1534/genetics.107.081190</w:t>
+        <w:t>Gogna A, Schulthess AW, Röder MS, Ganal MW, Reif JC. 2022. Gabi wheat a panel of European elite lines as central stock for wheat genetic research. Scientific Data. 9(1):538. doi:10.1038/s41597-022-01651-5</w:t>
       </w:r>
     </w:p>
     <w:p>
       <w:r>
-        <w:t>Haile TA, Heidecker T, Wright D, Neupane S, Ramsay L, Vandenberg A, Bett KE. 2020. Genomic selection for lentil breeding: Empirical evidence. The Plant Genome. 13(1):e20002. doi:10.1002/tpg2.20002</w:t>
+        <w:t>Guan L. 2023. Localized conformal prediction: a generalized inference framework for conformal prediction. Biometrika. 110(1):33–50. doi:10.1093/biomet/asac040</w:t>
       </w:r>
     </w:p>
     <w:p>
       <w:r>
-        <w:t>Henderson CR. 1975. Best Linear Unbiased Estimation and Prediction under a Selection Model. Biometrics. 31(2):423. doi:10.2307/2529430</w:t>
+        <w:t>Habier D, Fernando RL, Dekkers JCM. 2007. The Impact of Genetic Relationship Information on Genome-Assisted Breeding Values. Genetics. 177(4):2389–2397. doi:10.1534/genetics.107.081190</w:t>
       </w:r>
     </w:p>
     <w:p>
       <w:r>
-        <w:t>Holm S. 1979. A simple sequentially rejective multiple test procedure. Scandinavian Journal of Statistics. 6(2):65–70. https://www.jstor.org/stable/4615733</w:t>
+        <w:t>Haile TA, Heidecker T, Wright D, Neupane S, Ramsay L, Vandenberg A, Bett KE. 2020. Genomic selection for lentil breeding: Empirical evidence. The Plant Genome. 13(1):e20002. doi:10.1002/tpg2.20002</w:t>
       </w:r>
     </w:p>
     <w:p>
       <w:r>
-        <w:t>Hou K, Xu Z, Ding Y, Mandla R, Shi Z, Boulier K, Harpak A, Pasaniuc B. 2024. Calibrated prediction intervals for polygenic scores across diverse contexts. Nature Genetics. 56(7):1386–1396. doi:10.1038/s41588-024-01792-w</w:t>
+        <w:t>Henderson CR. 1975. Best Linear Unbiased Estimation and Prediction under a Selection Model. Biometrics. 31(2):423. doi:10.2307/2529430</w:t>
       </w:r>
     </w:p>
     <w:p>
       <w:r>
-        <w:t>Jin Y, Candès EJ. 2023. Selection by prediction with conformal p-values. Journal of Machine Learning Research. 24. https://arxiv.org/abs/2210.01408</w:t>
+        <w:t>Holm S. 1979. A simple sequentially rejective multiple test procedure. Scandinavian Journal of Statistics. 6(2):65–70. https://www.jstor.org/stable/4615733</w:t>
       </w:r>
     </w:p>
     <w:p>
       <w:r>
-        <w:t>Kaler AS, Dhanapal AP, Ray JD, King CA, Fritschi FB, Purcell LC. 2017. Genome‐Wide Association Mapping of Carbon Isotope and Oxygen Isotope Ratios in Diverse Soybean Genotypes. Crop Science. 57(6):3085–3100. doi:10.2135/cropsci2017.03.0160</w:t>
+        <w:t>Hou K, Xu Z, Ding Y, Mandla R, Shi Z, Boulier K, Harpak A, Pasaniuc B. 2024. Calibrated prediction intervals for polygenic scores across diverse contexts. Nature Genetics. 56(7):1386–1396. doi:10.1038/s41588-024-01792-w</w:t>
       </w:r>
     </w:p>
     <w:p>
       <w:r>
-        <w:t>Kang HM, Zaitlen NA, Wade CM, Kirby A, Heckerman D, Daly MJ, Eskin E. 2008. Efficient Control of Population Structure in Model Organism Association Mapping. Genetics. 178(3):1709–1723. doi:10.1534/genetics.107.080101</w:t>
+        <w:t>Jin Y, Candès EJ. 2023. Selection by prediction with conformal p-values. Journal of Machine Learning Research. 24. https://arxiv.org/abs/2210.01408</w:t>
       </w:r>
     </w:p>
     <w:p>
       <w:r>
-        <w:t>Ke G, Meng Q, Finley T, Wang T, Chen W, Ma W, Ye Q, Liu TY. 2017. LightGBM: a highly efficient gradient boosting decision tree. Advances in Neural Information Processing Systems. 30. https://papers.nips.cc/paper_files/paper/2017/hash/6449f44a102fde848669bdd9eb6b76fa-Abstract.html</w:t>
+        <w:t>Kaler AS, Dhanapal AP, Ray JD, King CA, Fritschi FB, Purcell LC. 2017. Genome‐Wide Association Mapping of Carbon Isotope and Oxygen Isotope Ratios in Diverse Soybean Genotypes. Crop Science. 57(6):3085–3100. doi:10.2135/cropsci2017.03.0160</w:t>
       </w:r>
     </w:p>
     <w:p>
       <w:r>
-        <w:t>Kerby DS. 2014. The Simple Difference Formula: An Approach to Teaching Nonparametric Correlation. Comprehensive Psychology. 3:11.IT.3.1. doi:10.2466/11.it.3.1</w:t>
+        <w:t>Kang HM, Zaitlen NA, Wade CM, Kirby A, Heckerman D, Daly MJ, Eskin E. 2008. Efficient Control of Population Structure in Model Organism Association Mapping. Genetics. 178(3):1709–1723. doi:10.1534/genetics.107.080101</w:t>
       </w:r>
     </w:p>
     <w:p>
       <w:r>
-        <w:t>Kumar P. 2026. Calibrated genomic selection [data paper and code]. Zenodo. doi:10.5281/zenodo.22962591</w:t>
+        <w:t>Ke G, Meng Q, Finley T, Wang T, Chen W, Ma W, Ye Q, Liu TY. 2017. LightGBM: a highly efficient gradient boosting decision tree. Advances in Neural Information Processing Systems. 30. https://papers.nips.cc/paper_files/paper/2017/hash/6449f44a102fde848669bdd9eb6b76fa-Abstract.html</w:t>
       </w:r>
     </w:p>
     <w:p>
       <w:r>
-        <w:t>Legarra A, Reverter A. 2018. Semi-parametric estimates of population accuracy and bias of predictions of breeding values and future phenotypes using the LR method. Genetics Selection Evolution. 50(1):53. doi:10.1186/s12711-018-0426-6</w:t>
+        <w:t>Kerby DS. 2014. The Simple Difference Formula: An Approach to Teaching Nonparametric Correlation. Comprehensive Psychology. 3:11.IT.3.1. doi:10.2466/11.it.3.1</w:t>
       </w:r>
     </w:p>
     <w:p>
       <w:r>
-        <w:t>Lei J, G’Sell M, Rinaldo A, Tibshirani RJ, Wasserman L. 2018. Distribution-Free Predictive Inference for Regression. Journal of the American Statistical Association. 113(523):1094–1111. doi:10.1080/01621459.2017.1307116</w:t>
+        <w:t>Kodji E, Attaoua R, Haloui M, Hishmih C, Seitz M, Woodward M, Hussin JG, Hamet P, Tremblay J. 2026. Improving the reliability of polygenic risk score-based prediction for cardiovascular and renal complications across ancestries in type 2 diabetes using Mondrian Cross-Conformal Prediction. PLOS Computational Biology. 22(8):e1014670. doi:10.1371/journal.pcbi.1014670</w:t>
       </w:r>
     </w:p>
     <w:p>
       <w:r>
-        <w:t>Meuwissen THE, Hayes BJ, Goddard ME. 2001. Prediction of Total Genetic Value Using Genome-Wide Dense Marker Maps. Genetics. 157(4):1819–1829. doi:10.1093/genetics/157.4.1819</w:t>
+        <w:t>Kumar P. 2026. Calibrated genomic selection [data paper and code]. Zenodo. doi:10.5281/zenodo.22962591</w:t>
       </w:r>
     </w:p>
     <w:p>
       <w:r>
-        <w:t>Pszczola M, Strabel T, Mulder H, Calus M. 2012. Reliability of direct genomic values for animals with different relationships within and to the reference population. Journal of Dairy Science. 95(1):389–400. doi:10.3168/jds.2011-4338</w:t>
+        <w:t>Legarra A, Reverter A. 2018. Semi-parametric estimates of population accuracy and bias of predictions of breeding values and future phenotypes using the LR method. Genetics Selection Evolution. 50(1):53. doi:10.1186/s12711-018-0426-6</w:t>
       </w:r>
     </w:p>
     <w:p>
       <w:r>
-        <w:t>Quesada-Traver C, Ariza-Suarez D, Studer B, Yates S. 2025. EasyGeSe – a resource for benchmarking genomic prediction methods. BMC Genomics. 26(1):953. doi:10.1186/s12864-025-12129-0</w:t>
+        <w:t>Lei J, G’Sell M, Rinaldo A, Tibshirani RJ, Wasserman L. 2018. Distribution-Free Predictive Inference for Regression. Journal of the American Statistical Association. 113(523):1094–1111. doi:10.1080/01621459.2017.1307116</w:t>
       </w:r>
     </w:p>
     <w:p>
       <w:r>
-        <w:t>Resende MFR, Muñoz P, Resende MDV, Garrick DJ, Fernando RL, Davis JM, Jokela EJ, Martin TA, Peter GF, Kirst M. 2012. Accuracy of Genomic Selection Methods in a Standard Data Set of Loblolly Pine (Pinus taedaL.). Genetics. 190(4):1503–1510. doi:10.1534/genetics.111.137026</w:t>
+        <w:t>Meuwissen THE, Hayes BJ, Goddard ME. 2001. Prediction of Total Genetic Value Using Genome-Wide Dense Marker Maps. Genetics. 157(4):1819–1829. doi:10.1093/genetics/157.4.1819</w:t>
       </w:r>
     </w:p>
     <w:p>
       <w:r>
-        <w:t>Tibshirani RJ, Barber RF, Candès EJ, Ramdas A. 2019. Conformal prediction under covariate shift. Advances in Neural Information Processing Systems. 32. https://papers.nips.cc/paper_files/paper/2019/hash/8fb21ee7a2207526da55a679f0332de2-Abstract.html</w:t>
+        <w:t>Papadopoulos H, Proedrou K, Vovk V, Gammerman A. 2002. Inductive Confidence Machines for Regression. Lecture Notes in Computer Science. 345-356. doi:10.1007/3-540-36755-1_29</w:t>
       </w:r>
     </w:p>
     <w:p>
       <w:r>
+        <w:t>Pszczola M, Strabel T, Mulder H, Calus M. 2012. Reliability of direct genomic values for animals with different relationships within and to the reference population. Journal of Dairy Science. 95(1):389–400. doi:10.3168/jds.2011-4338</w:t>
+      </w:r>
+    </w:p>
+    <w:p>
+      <w:r>
+        <w:t>Quesada-Traver C, Ariza-Suarez D, Studer B, Yates S. 2025. EasyGeSe – a resource for benchmarking genomic prediction methods. BMC Genomics. 26(1):953. doi:10.1186/s12864-025-12129-0</w:t>
+      </w:r>
+    </w:p>
+    <w:p>
+      <w:r>
+        <w:t>Resende MFR, Muñoz P, Resende MDV, Garrick DJ, Fernando RL, Davis JM, Jokela EJ, Martin TA, Peter GF, Kirst M. 2012. Accuracy of Genomic Selection Methods in a Standard Data Set of Loblolly Pine (Pinus taedaL.). Genetics. 190(4):1503–1510. doi:10.1534/genetics.111.137026</w:t>
+      </w:r>
+    </w:p>
+    <w:p>
+      <w:r>
+        <w:t>Sun J, Wang Y, Folkersen L, Borné Y, Amlien I, Buil A, Orho-Melander M, Børglum AD, Hougaard DM, , et al. 2021. Translating polygenic risk scores for clinical use by estimating the confidence bounds of risk prediction. Nature Communications. 12(1):5276. doi:10.1038/s41467-021-25014-7</w:t>
+      </w:r>
+    </w:p>
+    <w:p>
+      <w:r>
+        <w:t>Tibshirani RJ, Barber RF, Candès EJ, Ramdas A. 2019. Conformal prediction under covariate shift. Advances in Neural Information Processing Systems. 32. https://papers.nips.cc/paper_files/paper/2019/hash/8fb21ee7a2207526da55a679f0332de2-Abstract.html</w:t>
+      </w:r>
+    </w:p>
+    <w:p>
+      <w:r>
         <w:t>VanRaden P. 2008. Efficient Methods to Compute Genomic Predictions. Journal of Dairy Science. 91(11):4414–4423. doi:10.3168/jds.2007-0980</w:t>
+      </w:r>
+    </w:p>
+    <w:p>
+      <w:r>
+        <w:t>Vovk V. 2013. Conditional validity of inductive conformal predictors. Machine Learning. 92(2-3):349–376. doi:10.1007/s10994-013-5355-6</w:t>
       </w:r>
     </w:p>
     <w:p>

</xml_diff>

<commit_message>
PDF builder via headless Chromium; fix table header with pipe characters
Co-Authored-By: Claude Opus 5.5 <noreply@anthropic.com>
Claude-Session: https://claude.ai/code/session_01CEw45wY536Kpddzc67ktHR
</commit_message>
<xml_diff>
--- a/Target_Journal_Submission/manuscript/Final_Manuscript.docx
+++ b/Target_Journal_Submission/manuscript/Final_Manuscript.docx
@@ -67,7 +67,7 @@
     </w:p>
     <w:p>
       <w:r>
-        <w:t>Genomic prediction guides selection in plant and animal breeding, but breeders acting on an individual prediction also need honest uncertainty. Distribution-free conformal prediction intervals assume that calibration individuals are exchangeable with selection candidates; we show that relatedness to the training population breaks this assumption. We measure each candidate's relatedness by the prediction error variance of genomic best linear unbiased prediction and propose kinship-aware conformal prediction, which calibrates on residuals from random and genomic-cluster cross-fitting, normalises them by this variance and localises the conformal quantile in relatedness. We compared it with seven alternatives on 24 traits from barley, common bean, lentil, loblolly pine, eastern oyster, maize, pig, rice, soybean and wheat, under random and cluster-out validation, with three prediction models, and in simulations on real genotypes. Intervals ignoring relatedness over-covered close relatives and under-covered distant candidates; for held-out clusters, split-conformal and cross-validation-plus intervals covered 0.828 and 0.838 of phenotypes at nominal 0.90, and the classical Gaussian interval 0.881. Kinship-aware intervals covered 0.894, with relatedness-conditional coverage error 0.036 against 0.079 for cross-validation-plus and 0.052 for the Gaussian interval, and the smallest or joint-smallest error for all three predictors. Ablation showed that the calibration pool spanning distant relatives was decisive: a parametric calibration fitted to the same pool performed equally well. Prediction intervals for selection candidates should be calibrated along the relatedness axis, at the cost of about ten additional model fits.</w:t>
+        <w:t>Genomic prediction guides selection in plant and animal breeding, but breeders acting on an individual prediction also need honest uncertainty. Distribution-free conformal prediction intervals assume that calibration individuals are exchangeable with selection candidates; we show that relatedness to the training population breaks this assumption. We measure each candidate's relatedness by the prediction error variance of genomic best linear unbiased prediction and propose kinship-aware conformal prediction, which calibrates on residuals from random and genomic-cluster cross-fitting, normalises them by this variance and localises the conformal quantile in relatedness. We compared it with seven alternatives on 24 traits from barley, common bean, lentil, loblolly pine, eastern oyster, maize, pig, rice, soybean and wheat, under random and cluster-out validation, with three prediction models, and in simulations on real genotypes. Intervals ignoring relatedness over-covered close relatives and under-covered distant candidates; for held-out clusters, split-conformal and cross-validation-plus intervals covered 0.828 and 0.838 of phenotypes at nominal 0.90, and the classical Gaussian interval 0.881. Kinship-aware intervals covered 0.894, with relatedness-conditional coverage error 0.036 against 0.079 for cross-validation-plus and 0.052 for the Gaussian interval, and the smallest or joint-smallest error for all three predictors. The gains were in calibration, not in interval score. Ablation showed that the calibration pool spanning distant relatives was decisive: a parametric calibration fitted to the same pool performed equally well. Prediction intervals for selection candidates should be calibrated along the relatedness axis, at the cost of about ten additional model fits.</w:t>
       </w:r>
     </w:p>
     <w:p>
@@ -745,7 +745,7 @@
     </w:p>
     <w:p>
       <w:r>
-        <w:t>Genotypes were recoded as allele dosages 0/1/2. The wheat file, coded −2/0/2, was shifted to this scale; inbred panels coded 0/2 were kept as is. Monomorphic markers were dropped. No further marker filtering or imputation was applied. The files were verified against the Zenodo MD5 checksums.</w:t>
+        <w:t>Genotypes were recoded as allele dosages 0/1/2. The wheat file, coded −2/0/2, was shifted to this scale; inbred panels coded 0/2 were kept as is. Monomorphic markers were dropped. No further marker filtering or imputation was applied. All 30 files were verified against the Zenodo MD5 checksums.</w:t>
       </w:r>
     </w:p>
     <w:p>
@@ -1107,7 +1107,7 @@
         <w:t>et al.</w:t>
       </w:r>
       <w:r>
-        <w:t xml:space="preserve"> 2017) were fitted with hyper-parameters fixed in advance: 500 trees, learning rate 0.05, 31 leaves, column subsampling 0.3, row subsampling 0.8 and at least 10 samples per leaf. Inputs were at most 10,000 evenly spaced markers.</w:t>
+        <w:t xml:space="preserve"> 2017) were fitted with hyper-parameters fixed in advance: 500 trees, learning rate 0.05, 31 leaves, column subsampling 0.3, row subsampling 0.8 and at least 10 samples per leaf. Inputs were at most 10,000 evenly spaced markers of the dosage matrix. These may include a few monomorphic markers, which trees ignore.</w:t>
       </w:r>
     </w:p>
     <w:p>
@@ -1488,7 +1488,7 @@
         <w:t>T</w:t>
       </w:r>
       <w:r>
-        <w:t xml:space="preserve">. With absolute residuals </w:t>
+        <w:t xml:space="preserve"> (at least 10 individuals are kept for calibration). With absolute residuals </w:t>
       </w:r>
       <w:r>
         <w:rPr>
@@ -1862,7 +1862,7 @@
         <w:t>k</w:t>
       </w:r>
       <w:r>
-        <w:t xml:space="preserve">-means with </w:t>
+        <w:t xml:space="preserve">-means (10 restarts) with </w:t>
       </w:r>
       <w:r>
         <w:rPr>
@@ -1880,7 +1880,7 @@
         <w:t>T</w:t>
       </w:r>
       <w:r>
-        <w:t xml:space="preserve">|/20⌋)} is applied to the principal components of the training individuals. Each scheme yields an out-of-fold residual </w:t>
+        <w:t xml:space="preserve">|/20⌋)} is applied to the training individuals' scores on the global genotype principal components, which are computed once from all genotyped individuals. Each scheme yields an out-of-fold residual </w:t>
       </w:r>
       <w:r>
         <w:rPr>
@@ -2170,7 +2170,7 @@
         <w:t>d</w:t>
       </w:r>
       <w:r>
-        <w:t xml:space="preserve">ᵢ). It is widened multiplicatively (×1.25) for each candidate until Σᵢ </w:t>
+        <w:t xml:space="preserve">ᵢ). It is widened multiplicatively (×1.25, at most 60 times) for each candidate until Σᵢ </w:t>
       </w:r>
       <w:r>
         <w:rPr>
@@ -2305,25 +2305,7 @@
     </w:p>
     <w:p>
       <w:r>
-        <w:t xml:space="preserve">Our implementation uses a deterministic kernel. The pool residuals come from models trained on subsets of </w:t>
-      </w:r>
-      <w:r>
-        <w:rPr>
-          <w:i/>
-        </w:rPr>
-        <w:t>T</w:t>
-      </w:r>
-      <w:r>
-        <w:t xml:space="preserve"> (as in CV+; Barber </w:t>
-      </w:r>
-      <w:r>
-        <w:rPr>
-          <w:i/>
-        </w:rPr>
-        <w:t>et al.</w:t>
-      </w:r>
-      <w:r>
-        <w:t xml:space="preserve"> 2021), and the invariance assumption is only approximately met. KinCP therefore inherits no exact finite-sample guarantee. Its two design choices make the invariance assumption more plausible:</w:t>
+        <w:t>KinCP departs from these conditions in four ways:</w:t>
       </w:r>
     </w:p>
     <w:p>
@@ -2331,16 +2313,7 @@
         <w:pStyle w:val="ListBullet"/>
       </w:pPr>
       <w:r>
-        <w:t xml:space="preserve">cross-fitting with genomic clusters places calibration residuals at the levels of </w:t>
-      </w:r>
-      <w:r>
-        <w:rPr>
-          <w:i/>
-        </w:rPr>
-        <w:t>d</w:t>
-      </w:r>
-      <w:r>
-        <w:t xml:space="preserve"> that candidates actually reach;</w:t>
+        <w:t>it uses a deterministic kernel;</w:t>
       </w:r>
     </w:p>
     <w:p>
@@ -2348,6 +2321,70 @@
         <w:pStyle w:val="ListBullet"/>
       </w:pPr>
       <w:r>
+        <w:t xml:space="preserve">the pool residuals come from models trained on subsets of </w:t>
+      </w:r>
+      <w:r>
+        <w:rPr>
+          <w:i/>
+        </w:rPr>
+        <w:t>T</w:t>
+      </w:r>
+      <w:r>
+        <w:t xml:space="preserve"> (as in CV+; Barber </w:t>
+      </w:r>
+      <w:r>
+        <w:rPr>
+          <w:i/>
+        </w:rPr>
+        <w:t>et al.</w:t>
+      </w:r>
+      <w:r>
+        <w:t xml:space="preserve"> 2021), while the interval is centred on the full-training-set prediction (the cross-validated residual-quantile construction of PredInterval, which has no CV+-type guarantee);</w:t>
+      </w:r>
+    </w:p>
+    <w:p>
+      <w:pPr>
+        <w:pStyle w:val="ListBullet"/>
+      </w:pPr>
+      <w:r>
+        <w:t>each training individual contributes two dependent residuals, one per cross-fitting scheme;</w:t>
+      </w:r>
+    </w:p>
+    <w:p>
+      <w:pPr>
+        <w:pStyle w:val="ListBullet"/>
+      </w:pPr>
+      <w:r>
+        <w:t>the invariance assumption is only approximately met.</w:t>
+      </w:r>
+    </w:p>
+    <w:p>
+      <w:r>
+        <w:t>KinCP therefore inherits no exact finite-sample guarantee. Its two design choices make the invariance assumption more plausible:</w:t>
+      </w:r>
+    </w:p>
+    <w:p>
+      <w:pPr>
+        <w:pStyle w:val="ListBullet"/>
+      </w:pPr>
+      <w:r>
+        <w:t xml:space="preserve">cross-fitting with genomic clusters places calibration residuals at the levels of </w:t>
+      </w:r>
+      <w:r>
+        <w:rPr>
+          <w:i/>
+        </w:rPr>
+        <w:t>d</w:t>
+      </w:r>
+      <w:r>
+        <w:t xml:space="preserve"> that candidates actually reach;</w:t>
+      </w:r>
+    </w:p>
+    <w:p>
+      <w:pPr>
+        <w:pStyle w:val="ListBullet"/>
+      </w:pPr>
+      <w:r>
         <w:t>normalisation by σ(</w:t>
       </w:r>
       <w:r>
@@ -3021,16 +3058,25 @@
         <w:t>vs.</w:t>
       </w:r>
       <w:r>
-        <w:t xml:space="preserve"> 2.46 phenotypic SD for CV+), as required to reach coverage. Its interval score was also lower (3.91 </w:t>
+        <w:t xml:space="preserve"> 2.46 phenotypic SD for CV+), as required to reach coverage. </w:t>
+      </w:r>
+      <w:r>
+        <w:rPr>
+          <w:b/>
+        </w:rPr>
+        <w:t>Interval score.</w:t>
+      </w:r>
+      <w:r>
+        <w:t xml:space="preserve"> On the interval score, which trades width against misses (a proper scoring rule; Gneiting and Raftery 2007), KinCP was </w:t>
       </w:r>
       <w:r>
         <w:rPr>
           <w:i/>
         </w:rPr>
-        <w:t>vs.</w:t>
-      </w:r>
-      <w:r>
-        <w:t xml:space="preserve"> 4.06; Holm-adjusted </w:t>
+        <w:t>not</w:t>
+      </w:r>
+      <w:r>
+        <w:t xml:space="preserve"> better than the main alternatives. The mean scores were 3.91 for KinCP and 4.06 for CV+ under R2. The Holm-adjusted </w:t>
       </w:r>
       <w:r>
         <w:rPr>
@@ -3039,7 +3085,7 @@
         <w:t>P</w:t>
       </w:r>
       <w:r>
-        <w:t xml:space="preserve"> = 0.983). Against Gauss-PEV, the interval-score difference had </w:t>
+        <w:t>-values were = 0.983 against CV+, = 1.000 against Gauss-PEV and = 1.000 against CalPred-style on pool A. KinCP was significantly better only than SCP (</w:t>
       </w:r>
       <w:r>
         <w:rPr>
@@ -3048,7 +3094,7 @@
         <w:t>P</w:t>
       </w:r>
       <w:r>
-        <w:t xml:space="preserve"> = 1.000; against CalPred-style on pool A, </w:t>
+        <w:t xml:space="preserve"> &lt; 0.001) and NormCP (</w:t>
       </w:r>
       <w:r>
         <w:rPr>
@@ -3057,7 +3103,25 @@
         <w:t>P</w:t>
       </w:r>
       <w:r>
-        <w:t xml:space="preserve"> = 1.000.</w:t>
+        <w:t xml:space="preserve"> = 0.034). Under R3, Gauss-PEV had a slightly lower interval score than KinCP (Holm </w:t>
+      </w:r>
+      <w:r>
+        <w:rPr>
+          <w:i/>
+        </w:rPr>
+        <w:t>P</w:t>
+      </w:r>
+      <w:r>
+        <w:t xml:space="preserve"> = 0.032). The intervals of relatedness-blind methods were narrower and missed more often, and the interval score weighs these two effects against each other. The benefit of KinCP is therefore </w:t>
+      </w:r>
+      <w:r>
+        <w:rPr>
+          <w:i/>
+        </w:rPr>
+        <w:t>validity</w:t>
+      </w:r>
+      <w:r>
+        <w:t>: coverage close to the nominal level, including for weakly related candidates. It is not a better sharpness–coverage trade-off.</w:t>
       </w:r>
     </w:p>
     <w:p>
@@ -3984,7 +4048,7 @@
     </w:p>
     <w:p>
       <w:r>
-        <w:t>Practitioners who prefer a parametric calibration can obtain most of the gain by fitting it to the same pool. We therefore regard pool A as the main methodological recommendation and KinCP as a convenient, assumption-light way to use it.</w:t>
+        <w:t>Practitioners who prefer a parametric calibration can obtain most of the gain by fitting it to the same pool. Neither approach improved the interval score relative to relatedness-blind conformal intervals or the Gaussian PEV interval. Narrower, under-covering intervals can score similarly, because the interval score trades width against misses. When the purpose of an interval is a statement of risk that holds for the candidates at hand, coverage validity is the relevant criterion, and that is what calibration along relatedness delivers. We therefore regard pool A as the main methodological recommendation and KinCP as a convenient, assumption-light way to use it.</w:t>
       </w:r>
     </w:p>
     <w:p>
@@ -7791,7 +7855,7 @@
                 <w:b/>
                 <w:sz w:val="14"/>
               </w:rPr>
-              <w:t>|Cov−0.90|</w:t>
+              <w:t>Abs. cov. deviation</w:t>
             </w:r>
           </w:p>
         </w:tc>
@@ -10941,7 +11005,7 @@
         <w:t>Table 3</w:t>
       </w:r>
       <w:r>
-        <w:t xml:space="preserve"> Paired comparisons of KinCP with each alternative (GBLUP) on the relatedness-conditional coverage error (Cond. error) and the marginal coverage deviation (|Cov−0.90|). Median diff. is the median paired difference (competitor − KinCP; positive favours KinCP), with its 95% bootstrap confidence interval (CI low, CI high). P is from a two-sided Wilcoxon signed-rank test; P (Holm) is adjusted within each endpoint family (all regimes × baseline competitors). Interval-score comparisons and all ablation comparisons are in File S2.</w:t>
+        <w:t xml:space="preserve"> Paired comparisons of KinCP with each alternative (GBLUP) on the relatedness-conditional coverage error (Cond. error) and the marginal coverage deviation (Abs. cov. deviation). Median diff. is the median paired difference (competitor − KinCP; positive favours KinCP), with its 95% bootstrap confidence interval (CI low, CI high). P is from a two-sided Wilcoxon signed-rank test; P (Holm) is adjusted within each endpoint family (all regimes × baseline competitors). Interval-score comparisons and all ablation comparisons are in File S2.</w:t>
       </w:r>
     </w:p>
     <w:tbl>
@@ -12366,7 +12430,7 @@
               <w:rPr>
                 <w:sz w:val="13"/>
               </w:rPr>
-              <w:t>|Cov−0.90|</w:t>
+              <w:t>Abs. cov. deviation</w:t>
             </w:r>
           </w:p>
         </w:tc>
@@ -12536,7 +12600,7 @@
               <w:rPr>
                 <w:sz w:val="13"/>
               </w:rPr>
-              <w:t>|Cov−0.90|</w:t>
+              <w:t>Abs. cov. deviation</w:t>
             </w:r>
           </w:p>
         </w:tc>
@@ -12706,7 +12770,7 @@
               <w:rPr>
                 <w:sz w:val="13"/>
               </w:rPr>
-              <w:t>|Cov−0.90|</w:t>
+              <w:t>Abs. cov. deviation</w:t>
             </w:r>
           </w:p>
         </w:tc>
@@ -12876,7 +12940,7 @@
               <w:rPr>
                 <w:sz w:val="13"/>
               </w:rPr>
-              <w:t>|Cov−0.90|</w:t>
+              <w:t>Abs. cov. deviation</w:t>
             </w:r>
           </w:p>
         </w:tc>
@@ -13046,7 +13110,7 @@
               <w:rPr>
                 <w:sz w:val="13"/>
               </w:rPr>
-              <w:t>|Cov−0.90|</w:t>
+              <w:t>Abs. cov. deviation</w:t>
             </w:r>
           </w:p>
         </w:tc>
@@ -13216,7 +13280,7 @@
               <w:rPr>
                 <w:sz w:val="13"/>
               </w:rPr>
-              <w:t>|Cov−0.90|</w:t>
+              <w:t>Abs. cov. deviation</w:t>
             </w:r>
           </w:p>
         </w:tc>
@@ -13386,7 +13450,7 @@
               <w:rPr>
                 <w:sz w:val="13"/>
               </w:rPr>
-              <w:t>|Cov−0.90|</w:t>
+              <w:t>Abs. cov. deviation</w:t>
             </w:r>
           </w:p>
         </w:tc>
@@ -14746,7 +14810,7 @@
               <w:rPr>
                 <w:sz w:val="13"/>
               </w:rPr>
-              <w:t>|Cov−0.90|</w:t>
+              <w:t>Abs. cov. deviation</w:t>
             </w:r>
           </w:p>
         </w:tc>
@@ -14916,7 +14980,7 @@
               <w:rPr>
                 <w:sz w:val="13"/>
               </w:rPr>
-              <w:t>|Cov−0.90|</w:t>
+              <w:t>Abs. cov. deviation</w:t>
             </w:r>
           </w:p>
         </w:tc>
@@ -15086,7 +15150,7 @@
               <w:rPr>
                 <w:sz w:val="13"/>
               </w:rPr>
-              <w:t>|Cov−0.90|</w:t>
+              <w:t>Abs. cov. deviation</w:t>
             </w:r>
           </w:p>
         </w:tc>
@@ -15256,7 +15320,7 @@
               <w:rPr>
                 <w:sz w:val="13"/>
               </w:rPr>
-              <w:t>|Cov−0.90|</w:t>
+              <w:t>Abs. cov. deviation</w:t>
             </w:r>
           </w:p>
         </w:tc>
@@ -15426,7 +15490,7 @@
               <w:rPr>
                 <w:sz w:val="13"/>
               </w:rPr>
-              <w:t>|Cov−0.90|</w:t>
+              <w:t>Abs. cov. deviation</w:t>
             </w:r>
           </w:p>
         </w:tc>
@@ -15596,7 +15660,7 @@
               <w:rPr>
                 <w:sz w:val="13"/>
               </w:rPr>
-              <w:t>|Cov−0.90|</w:t>
+              <w:t>Abs. cov. deviation</w:t>
             </w:r>
           </w:p>
         </w:tc>
@@ -15766,7 +15830,7 @@
               <w:rPr>
                 <w:sz w:val="13"/>
               </w:rPr>
-              <w:t>|Cov−0.90|</w:t>
+              <w:t>Abs. cov. deviation</w:t>
             </w:r>
           </w:p>
         </w:tc>
@@ -17126,7 +17190,7 @@
               <w:rPr>
                 <w:sz w:val="13"/>
               </w:rPr>
-              <w:t>|Cov−0.90|</w:t>
+              <w:t>Abs. cov. deviation</w:t>
             </w:r>
           </w:p>
         </w:tc>
@@ -17296,7 +17360,7 @@
               <w:rPr>
                 <w:sz w:val="13"/>
               </w:rPr>
-              <w:t>|Cov−0.90|</w:t>
+              <w:t>Abs. cov. deviation</w:t>
             </w:r>
           </w:p>
         </w:tc>
@@ -17466,7 +17530,7 @@
               <w:rPr>
                 <w:sz w:val="13"/>
               </w:rPr>
-              <w:t>|Cov−0.90|</w:t>
+              <w:t>Abs. cov. deviation</w:t>
             </w:r>
           </w:p>
         </w:tc>
@@ -17636,7 +17700,7 @@
               <w:rPr>
                 <w:sz w:val="13"/>
               </w:rPr>
-              <w:t>|Cov−0.90|</w:t>
+              <w:t>Abs. cov. deviation</w:t>
             </w:r>
           </w:p>
         </w:tc>
@@ -17806,7 +17870,7 @@
               <w:rPr>
                 <w:sz w:val="13"/>
               </w:rPr>
-              <w:t>|Cov−0.90|</w:t>
+              <w:t>Abs. cov. deviation</w:t>
             </w:r>
           </w:p>
         </w:tc>
@@ -17976,7 +18040,7 @@
               <w:rPr>
                 <w:sz w:val="13"/>
               </w:rPr>
-              <w:t>|Cov−0.90|</w:t>
+              <w:t>Abs. cov. deviation</w:t>
             </w:r>
           </w:p>
         </w:tc>
@@ -18146,7 +18210,7 @@
               <w:rPr>
                 <w:sz w:val="13"/>
               </w:rPr>
-              <w:t>|Cov−0.90|</w:t>
+              <w:t>Abs. cov. deviation</w:t>
             </w:r>
           </w:p>
         </w:tc>
@@ -18401,7 +18465,7 @@
                 <w:b/>
                 <w:sz w:val="14"/>
               </w:rPr>
-              <w:t>|Cov−0.90|</w:t>
+              <w:t>Abs. cov. deviation</w:t>
             </w:r>
           </w:p>
         </w:tc>

</xml_diff>

<commit_message>
Review round 7: writing, notation, figure/table fixes, guideline compliance
Co-Authored-By: Claude Opus 5.5 <noreply@anthropic.com>
Claude-Session: https://claude.ai/code/session_01CEw45wY536Kpddzc67ktHR
</commit_message>
<xml_diff>
--- a/Target_Journal_Submission/manuscript/Final_Manuscript.docx
+++ b/Target_Journal_Submission/manuscript/Final_Manuscript.docx
@@ -54,7 +54,7 @@
         <w:t>Keywords:</w:t>
       </w:r>
       <w:r>
-        <w:t xml:space="preserve"> genomic prediction; genomic selection; prediction interval; conformal prediction; prediction error variance; genomic relationship; uncertainty quantification; GBLUP; Genomic Prediction</w:t>
+        <w:t xml:space="preserve"> genomic prediction; genomic selection; prediction interval; conformal prediction; prediction error variance; genomic relationship; uncertainty quantification; GBLUP</w:t>
       </w:r>
     </w:p>
     <w:p>
@@ -67,7 +67,7 @@
     </w:p>
     <w:p>
       <w:r>
-        <w:t>Genomic prediction guides selection in plant and animal breeding, but breeders acting on an individual prediction also need honest uncertainty. Distribution-free conformal prediction intervals assume that calibration individuals are exchangeable with selection candidates; we show that relatedness to the training population breaks this assumption. We measure each candidate's relatedness by the prediction error variance of genomic best linear unbiased prediction and propose kinship-aware conformal prediction, which calibrates on residuals from random and genomic-cluster cross-fitting, normalises them by this variance and localises the conformal quantile in relatedness. We compared it with seven alternatives on 24 traits from barley, common bean, lentil, loblolly pine, eastern oyster, maize, pig, rice, soybean and wheat, under random and cluster-out validation, with three prediction models, and in simulations on real genotypes. Intervals ignoring relatedness over-covered close relatives and under-covered distant candidates; for held-out clusters, split-conformal and cross-validation-plus intervals covered 0.828 and 0.838 of phenotypes at nominal 0.90, and the classical Gaussian interval 0.881. Kinship-aware intervals covered 0.894, with relatedness-conditional coverage error 0.036 against 0.079 for cross-validation-plus and 0.052 for the Gaussian interval, and the smallest or joint-smallest error for all three predictors. The gains were in calibration, not in interval score. Ablation showed that the calibration pool spanning distant relatives was decisive: a parametric calibration fitted to the same pool performed equally well. Prediction intervals for selection candidates should be calibrated along the relatedness axis, at the cost of about ten additional model fits.</w:t>
+        <w:t>Genomic prediction guides selection in plant and animal breeding, but breeders acting on an individual prediction also need honest uncertainty. Distribution-free conformal prediction intervals assume that calibration individuals are exchangeable with selection candidates; we show that relatedness to the training population breaks this assumption. We measure each candidate's relatedness by the prediction error variance of genomic best linear unbiased prediction and propose kinship-aware conformal prediction, which calibrates on residuals from random and genomic-cluster cross-fitting, normalises them by this variance and localises the conformal quantile in relatedness. We compared it with seven alternatives on 24 traits from barley, common bean, lentil, loblolly pine, eastern oyster, maize, pig, rice, soybean and wheat, under random and cluster-out validation, with three prediction models, and in simulations on real genotypes. Intervals ignoring relatedness over-covered close relatives and under-covered distant candidates; for held-out clusters, split-conformal and cross-validation-plus intervals covered 0.828 and 0.838 of phenotypes at nominal 0.90, and the classical Gaussian interval 0.881. Kinship-aware intervals covered 0.894 under cluster-out validation, with relatedness-conditional coverage error 0.036 against 0.079 for cross-validation-plus and 0.052 for the Gaussian interval, and the smallest or joint-smallest error for all three predictors. The gains were in calibration, not in interval score. Ablation showed that the calibration pool spanning distant relatives was decisive: a parametric calibration fitted to the same pool performed equally well. Prediction intervals for selection candidates should be calibrated along the relatedness axis, at the cost of about ten additional model fits.</w:t>
       </w:r>
     </w:p>
     <w:p>
@@ -80,7 +80,7 @@
     </w:p>
     <w:p>
       <w:r>
-        <w:t>Breeders need honest uncertainty for genomic predictions of individual selection candidates. We show that standard distribution-free prediction intervals become unreliable for candidates that are weakly related to the training population, because they are calibrated on close relatives. Using the classical prediction error variance as a measure of relatedness, we propose a kinship-aware calibration that draws calibration residuals from both close and distant relatives. Across ten plant and animal species, three prediction models and a simulation, it restored near-nominal coverage across relatedness levels, whereas standard intervals covered as little as 0.838 of phenotypes on average for new genomic clusters.</w:t>
+        <w:t>Breeders need honest uncertainty for genomic predictions of individual selection candidates. We show that standard distribution-free prediction intervals become unreliable for candidates that are weakly related to the training population, because they are calibrated on close relatives. Using the classical prediction error variance as a measure of relatedness, we propose a kinship-aware calibration that draws calibration residuals from both close and distant relatives. Across ten plant and animal species, three prediction models and a simulation, it restored near-nominal coverage across relatedness levels, whereas standard intervals covered on average only 0.828–0.838 of phenotypes for candidates from new genomic clusters (nominal 0.90).</w:t>
       </w:r>
     </w:p>
     <w:p>
@@ -1129,7 +1129,16 @@
         <w:t>S</w:t>
       </w:r>
       <w:r>
-        <w:t xml:space="preserve"> and a candidate </w:t>
+        <w:t xml:space="preserve"> (the outer training set </w:t>
+      </w:r>
+      <w:r>
+        <w:rPr>
+          <w:i/>
+        </w:rPr>
+        <w:t>T</w:t>
+      </w:r>
+      <w:r>
+        <w:t xml:space="preserve">, or an inner subset of it) and a candidate </w:t>
       </w:r>
       <w:r>
         <w:rPr>
@@ -1624,6 +1633,69 @@
         <w:t>T</w:t>
       </w:r>
       <w:r>
+        <w:t xml:space="preserve">. Here </w:t>
+      </w:r>
+      <w:r>
+        <w:rPr>
+          <w:i/>
+        </w:rPr>
+        <w:t>ŷ</w:t>
+      </w:r>
+      <w:r>
+        <w:t xml:space="preserve">ⱼ^{(−k(i))} is the prediction for </w:t>
+      </w:r>
+      <w:r>
+        <w:rPr>
+          <w:i/>
+        </w:rPr>
+        <w:t>j</w:t>
+      </w:r>
+      <w:r>
+        <w:t xml:space="preserve"> from the model fitted without the fold </w:t>
+      </w:r>
+      <w:r>
+        <w:rPr>
+          <w:i/>
+        </w:rPr>
+        <w:t>k</w:t>
+      </w:r>
+      <w:r>
+        <w:t>(</w:t>
+      </w:r>
+      <w:r>
+        <w:rPr>
+          <w:i/>
+        </w:rPr>
+        <w:t>i</w:t>
+      </w:r>
+      <w:r>
+        <w:t xml:space="preserve">) that contains training individual </w:t>
+      </w:r>
+      <w:r>
+        <w:rPr>
+          <w:i/>
+        </w:rPr>
+        <w:t>i</w:t>
+      </w:r>
+      <w:r>
+        <w:t xml:space="preserve">, and </w:t>
+      </w:r>
+      <w:r>
+        <w:rPr>
+          <w:i/>
+        </w:rPr>
+        <w:t>R</w:t>
+      </w:r>
+      <w:r>
+        <w:t xml:space="preserve">ᵢ is the absolute out-of-fold residual of </w:t>
+      </w:r>
+      <w:r>
+        <w:rPr>
+          <w:i/>
+        </w:rPr>
+        <w:t>i</w:t>
+      </w:r>
+      <w:r>
         <w:t>. The bounds are the ⌊α(</w:t>
       </w:r>
       <w:r>
@@ -2901,7 +2973,7 @@
         <w:t>python run_all.py --mode full</w:t>
       </w:r>
       <w:r>
-        <w:t>) regenerates every result, table and figure from the public data, and every number in this article is inserted automatically from the generated result files. The study design was committed to version control before any model was fitted. Five deviations, all made for compute reasons or found in a pipeline smoke test, are listed in File S1.</w:t>
+        <w:t>) regenerates every result, table and figure from the public data, and every number in this article is inserted automatically from the generated result files. The study design was committed to version control before any model was fitted. File S1 lists all seven deviations from the pre-specified design: five made for compute reasons or found in a pipeline smoke test, and two (the exploratory variants and the robustness analyses requested by internal review) added after the main results had been seen.</w:t>
       </w:r>
     </w:p>
     <w:p>
@@ -3890,7 +3962,7 @@
         <w:t>n</w:t>
       </w:r>
       <w:r>
-        <w:t>²) relationship matrices of GBLUP itself. The overhead is therefore that of a standard five-fold cross-validation run twice, and is small relative to phenotyping or genotyping costs.</w:t>
+        <w:t>²) relationship matrices of GBLUP itself. The overhead is therefore that of a standard five-fold cross-validation run twice, and is small relative to phenotyping or genotyping costs. The pools depend only on the training set, so they are built once and reused for any number of candidate batches. The per-candidate cost of KinCP is then a weighted quantile of the pool scores.</w:t>
       </w:r>
     </w:p>
     <w:p>
@@ -4434,7 +4506,7 @@
         <w:t>No temporal data.</w:t>
       </w:r>
       <w:r>
-        <w:t xml:space="preserve"> Temporal deployment across breeding cycles, which also involves genotype-by-environment and selection effects, could not be studied because the public datasets lack cycle information.</w:t>
+        <w:t xml:space="preserve"> Temporal deployment across breeding cycles, which also involves genotype-by-environment and selection effects, could not be studied because the public datasets lack cycle information. Validation against real pedigree groups was possible only for eastern oyster, whose four F2 families are identified in the data.</w:t>
       </w:r>
     </w:p>
     <w:p>
@@ -43142,7 +43214,7 @@
       <w:r>
         <w:drawing>
           <wp:inline xmlns:a="http://schemas.openxmlformats.org/drawingml/2006/main" xmlns:pic="http://schemas.openxmlformats.org/drawingml/2006/picture">
-            <wp:extent cx="5943600" cy="2042331"/>
+            <wp:extent cx="5943600" cy="2141712"/>
             <wp:docPr id="12" name="Picture 12"/>
             <wp:cNvGraphicFramePr>
               <a:graphicFrameLocks noChangeAspect="1"/>
@@ -43163,7 +43235,7 @@
                   <pic:spPr>
                     <a:xfrm>
                       <a:off x="0" y="0"/>
-                      <a:ext cx="5943600" cy="2042331"/>
+                      <a:ext cx="5943600" cy="2141712"/>
                     </a:xfrm>
                     <a:prstGeom prst="rect"/>
                   </pic:spPr>

</xml_diff>

<commit_message>
Review round 8: competing-researcher attacks (oracle rescaling, group CV+) and narrowed claims
Co-Authored-By: Claude Opus 5.5 <noreply@anthropic.com>
Claude-Session: https://claude.ai/code/session_01CEw45wY536Kpddzc67ktHR
</commit_message>
<xml_diff>
--- a/Target_Journal_Submission/manuscript/Final_Manuscript.docx
+++ b/Target_Journal_Submission/manuscript/Final_Manuscript.docx
@@ -3867,6 +3867,198 @@
         <w:rPr>
           <w:b/>
         </w:rPr>
+        <w:t>Competing explanations.</w:t>
+      </w:r>
+      <w:r>
+        <w:t xml:space="preserve"> Two further analyses asked whether simpler constructions could explain or match KinCP's behaviour.</w:t>
+      </w:r>
+    </w:p>
+    <w:p>
+      <w:r>
+        <w:rPr>
+          <w:i/>
+        </w:rPr>
+        <w:t>Is the gain only in overall width?</w:t>
+      </w:r>
+      <w:r>
+        <w:t xml:space="preserve"> Each method's intervals were rescaled by the single constant that gives exactly 0.90 pooled coverage on the </w:t>
+      </w:r>
+      <w:r>
+        <w:rPr>
+          <w:i/>
+        </w:rPr>
+        <w:t>test</w:t>
+      </w:r>
+      <w:r>
+        <w:t xml:space="preserve"> data. This is an oracle that no real method can use.</w:t>
+      </w:r>
+    </w:p>
+    <w:p>
+      <w:pPr>
+        <w:pStyle w:val="ListBullet"/>
+      </w:pPr>
+      <w:r>
+        <w:rPr>
+          <w:i/>
+        </w:rPr>
+        <w:t>Under R2,</w:t>
+      </w:r>
+      <w:r>
+        <w:t xml:space="preserve"> the required factor was 1.19 for CV+, 1.21 for SCP and 1.06 for Gauss-PEV, but 1.02 for KinCP. After rescaling, conditional errors became similar: 0.030 for KinCP, 0.035 for CV+ (unadjusted </w:t>
+      </w:r>
+      <w:r>
+        <w:rPr>
+          <w:i/>
+        </w:rPr>
+        <w:t>P</w:t>
+      </w:r>
+      <w:r>
+        <w:t xml:space="preserve"> = 0.034) and 0.033 for Gauss-PEV (</w:t>
+      </w:r>
+      <w:r>
+        <w:rPr>
+          <w:i/>
+        </w:rPr>
+        <w:t>P</w:t>
+      </w:r>
+      <w:r>
+        <w:t xml:space="preserve"> = 0.406). Under cluster-out deployment, therefore, the failure of relatedness-blind intervals is mainly one of overall </w:t>
+      </w:r>
+      <w:r>
+        <w:rPr>
+          <w:i/>
+        </w:rPr>
+        <w:t>level</w:t>
+      </w:r>
+      <w:r>
+        <w:t>. KinCP's contribution there is to set this level correctly from genotypes alone, without the candidates' phenotypes that the oracle uses.</w:t>
+      </w:r>
+    </w:p>
+    <w:p>
+      <w:pPr>
+        <w:pStyle w:val="ListBullet"/>
+      </w:pPr>
+      <w:r>
+        <w:rPr>
+          <w:i/>
+        </w:rPr>
+        <w:t>Under R1,</w:t>
+      </w:r>
+      <w:r>
+        <w:t xml:space="preserve"> the oracle-rescaled CV+ still had a higher conditional error than KinCP (0.025 </w:t>
+      </w:r>
+      <w:r>
+        <w:rPr>
+          <w:i/>
+        </w:rPr>
+        <w:t>vs.</w:t>
+      </w:r>
+      <w:r>
+        <w:t xml:space="preserve"> 0.017; </w:t>
+      </w:r>
+      <w:r>
+        <w:rPr>
+          <w:i/>
+        </w:rPr>
+        <w:t>P</w:t>
+      </w:r>
+      <w:r>
+        <w:t xml:space="preserve"> &lt; 0.001). Here KinCP's advantage lies in how the width is distributed across relatedness.</w:t>
+      </w:r>
+    </w:p>
+    <w:p>
+      <w:r>
+        <w:rPr>
+          <w:i/>
+        </w:rPr>
+        <w:t>Would CV+ with cluster folds suffice?</w:t>
+      </w:r>
+      <w:r>
+        <w:t xml:space="preserve"> CV+ was computed with the genomic-cluster folds of pool A ("group CV+") and with both fold schemes combined (GBLUP, R1 first repeat and R2 first seed).</w:t>
+      </w:r>
+    </w:p>
+    <w:p>
+      <w:pPr>
+        <w:pStyle w:val="ListBullet"/>
+      </w:pPr>
+      <w:r>
+        <w:rPr>
+          <w:i/>
+        </w:rPr>
+        <w:t>Under R2,</w:t>
+      </w:r>
+      <w:r>
+        <w:t xml:space="preserve"> group CV+ covered 0.915, and its conditional error (0.042) did not differ significantly from KinCP's (0.037; KinCP better in 15/24 units, </w:t>
+      </w:r>
+      <w:r>
+        <w:rPr>
+          <w:i/>
+        </w:rPr>
+        <w:t>P</w:t>
+      </w:r>
+      <w:r>
+        <w:t xml:space="preserve"> = 0.218).</w:t>
+      </w:r>
+    </w:p>
+    <w:p>
+      <w:pPr>
+        <w:pStyle w:val="ListBullet"/>
+      </w:pPr>
+      <w:r>
+        <w:rPr>
+          <w:i/>
+        </w:rPr>
+        <w:t>Under R1,</w:t>
+      </w:r>
+      <w:r>
+        <w:t xml:space="preserve"> group CV+ was conservative: coverage 0.944, width 2.96 </w:t>
+      </w:r>
+      <w:r>
+        <w:rPr>
+          <w:i/>
+        </w:rPr>
+        <w:t>vs.</w:t>
+      </w:r>
+      <w:r>
+        <w:t xml:space="preserve"> 2.40 SD, conditional error 0.049 </w:t>
+      </w:r>
+      <w:r>
+        <w:rPr>
+          <w:i/>
+        </w:rPr>
+        <w:t>vs.</w:t>
+      </w:r>
+      <w:r>
+        <w:t xml:space="preserve"> 0.023; KinCP better in 21/24 units, </w:t>
+      </w:r>
+      <w:r>
+        <w:rPr>
+          <w:i/>
+        </w:rPr>
+        <w:t>P</w:t>
+      </w:r>
+      <w:r>
+        <w:t xml:space="preserve"> &lt; 0.001.</w:t>
+      </w:r>
+    </w:p>
+    <w:p>
+      <w:pPr>
+        <w:pStyle w:val="ListBullet"/>
+      </w:pPr>
+      <w:r>
+        <w:t>The combined version behaved similarly (R1 coverage 0.935).</w:t>
+      </w:r>
+    </w:p>
+    <w:p>
+      <w:r>
+        <w:t>Group CV+ is thus a reasonable choice when deployment is known to be to new clusters. KinCP, by conditioning on each candidate's relatedness, was calibrated in both regimes without knowing which regime applied.</w:t>
+      </w:r>
+    </w:p>
+    <w:p>
+      <w:r>
+        <w:rPr>
+          <w:b/>
+        </w:rPr>
         <w:t>Near-duplicate genotypes.</w:t>
       </w:r>
       <w:r>
@@ -4331,39 +4523,45 @@
         <w:pStyle w:val="Heading2"/>
       </w:pPr>
       <w:r>
-        <w:t>Relation to classical reliability and accuracy validation</w:t>
+        <w:t>What KinCP adds over simpler fixes</w:t>
       </w:r>
     </w:p>
     <w:p>
       <w:r>
-        <w:t xml:space="preserve">The classical PEV interval was competitive under random cross-validation, which is the regime in which it is usually checked. It lost calibration under cluster-out deployment, mostly for traits with high within-cluster heritability. This complements the LR method of Legarra and Reverter (2018), which validates </w:t>
-      </w:r>
+        <w:t>Two simpler fixes each capture part of KinCP's behaviour.</w:t>
+      </w:r>
+    </w:p>
+    <w:p>
+      <w:pPr>
+        <w:pStyle w:val="ListBullet"/>
+      </w:pPr>
       <w:r>
         <w:rPr>
           <w:i/>
         </w:rPr>
-        <w:t>population-level</w:t>
-      </w:r>
-      <w:r>
-        <w:t xml:space="preserve"> accuracy and dispersion of predictions. Our endpoints assess </w:t>
-      </w:r>
+        <w:t>Rescaling.</w:t>
+      </w:r>
+      <w:r>
+        <w:t xml:space="preserve"> Under cluster-out deployment, relatedness-blind intervals were mainly too narrow overall. A single correct inflation factor would repair most of the problem, but that factor cannot be known without phenotypes of the candidates.</w:t>
+      </w:r>
+    </w:p>
+    <w:p>
+      <w:pPr>
+        <w:pStyle w:val="ListBullet"/>
+      </w:pPr>
       <w:r>
         <w:rPr>
           <w:i/>
         </w:rPr>
-        <w:t>individual-level</w:t>
-      </w:r>
-      <w:r>
-        <w:t xml:space="preserve"> interval calibration conditional on relatedness. Both kinds of validation are needed. Neither replaces a deployment-matched validation design (Werner </w:t>
-      </w:r>
-      <w:r>
-        <w:rPr>
-          <w:i/>
-        </w:rPr>
-        <w:t>et al.</w:t>
-      </w:r>
-      <w:r>
-        <w:t xml:space="preserve"> 2020).</w:t>
+        <w:t>Group CV+.</w:t>
+      </w:r>
+      <w:r>
+        <w:t xml:space="preserve"> CV+ with genomic-cluster folds sets the level appropriately for new clusters but is conservative for close relatives.</w:t>
+      </w:r>
+    </w:p>
+    <w:p>
+      <w:r>
+        <w:t>KinCP combines both kinds of residuals and lets each candidate's relatedness decide which applies. This is why it remained calibrated in both regimes. The comparison also shows that the deployment regime matters: a practitioner who knows candidates will come from new families can use group CV+. One who does not, or whose candidates are a mixture of close and distant relatives, benefits from conditioning on relatedness.</w:t>
       </w:r>
     </w:p>
     <w:p>
@@ -4371,6 +4569,46 @@
         <w:pStyle w:val="Heading2"/>
       </w:pPr>
       <w:r>
+        <w:t>Relation to classical reliability and accuracy validation</w:t>
+      </w:r>
+    </w:p>
+    <w:p>
+      <w:r>
+        <w:t xml:space="preserve">The classical PEV interval was competitive under random cross-validation, which is the regime in which it is usually checked. It lost calibration under cluster-out deployment, mostly for traits with high within-cluster heritability. This complements the LR method of Legarra and Reverter (2018), which validates </w:t>
+      </w:r>
+      <w:r>
+        <w:rPr>
+          <w:i/>
+        </w:rPr>
+        <w:t>population-level</w:t>
+      </w:r>
+      <w:r>
+        <w:t xml:space="preserve"> accuracy and dispersion of predictions. Our endpoints assess </w:t>
+      </w:r>
+      <w:r>
+        <w:rPr>
+          <w:i/>
+        </w:rPr>
+        <w:t>individual-level</w:t>
+      </w:r>
+      <w:r>
+        <w:t xml:space="preserve"> interval calibration conditional on relatedness. Both kinds of validation are needed. Neither replaces a deployment-matched validation design (Werner </w:t>
+      </w:r>
+      <w:r>
+        <w:rPr>
+          <w:i/>
+        </w:rPr>
+        <w:t>et al.</w:t>
+      </w:r>
+      <w:r>
+        <w:t xml:space="preserve"> 2020).</w:t>
+      </w:r>
+    </w:p>
+    <w:p>
+      <w:pPr>
+        <w:pStyle w:val="Heading2"/>
+      </w:pPr>
+      <w:r>
         <w:t>Practical recommendations</w:t>
       </w:r>
     </w:p>
@@ -4399,7 +4637,7 @@
         <w:t>Build the calibration pool by cross-fitting with both random and genomic-cluster folds</w:t>
       </w:r>
       <w:r>
-        <w:t xml:space="preserve"> whenever candidates may come from new families or sub-populations.</w:t>
+        <w:t xml:space="preserve"> whenever candidates may come from new families or sub-populations. If all candidates are known to come from new clusters, CV+ with cluster folds is a simpler alternative.</w:t>
       </w:r>
     </w:p>
     <w:p>
@@ -42755,7 +42993,7 @@
     </w:p>
     <w:p>
       <w:r>
-        <w:t>Alt text: Three panels of line plots, one per validation regime. Split conformal and CV+ fall from about 0.93 coverage for close relatives to about 0.88 for distant ones under random CV, and to about 0.81 to 0.84 under cluster-out validation. KinCP, CalPred-style and Gauss-PEV stay near 0.90 across quintiles.</w:t>
+        <w:t>Alt text: Three panels of line plots, one per validation regime. Under random cross-validation, split conformal and CV+ fall from about 0.92–0.93 coverage for the closest relatives to about 0.88 for the most distant. Under cluster-out validation they lie between about 0.80 and 0.87. KinCP, CalPred-style and Gauss-PEV stay closer to 0.90 across quintiles.</w:t>
       </w:r>
     </w:p>
     <w:p/>

</xml_diff>

<commit_message>
Review round 9 (AE): retitle, methods completeness, conclusions, cover letter
Co-Authored-By: Claude Opus 5.5 <noreply@anthropic.com>
Claude-Session: https://claude.ai/code/session_01CEw45wY536Kpddzc67ktHR
</commit_message>
<xml_diff>
--- a/Target_Journal_Submission/manuscript/Final_Manuscript.docx
+++ b/Target_Journal_Submission/manuscript/Final_Manuscript.docx
@@ -11,7 +11,7 @@
           <w:b/>
           <w:sz w:val="32"/>
         </w:rPr>
-        <w:t>Kinship-aware conformal prediction intervals for genomic prediction across ten plant and animal species</w:t>
+        <w:t>Relatedness-aware calibration of genomic prediction intervals: kinship-aware conformal prediction across ten plant and animal species</w:t>
       </w:r>
     </w:p>
     <w:p>
@@ -22,7 +22,7 @@
         <w:t>Running title:</w:t>
       </w:r>
       <w:r>
-        <w:t xml:space="preserve"> Kinship-aware genomic prediction intervals</w:t>
+        <w:t xml:space="preserve"> Relatedness-aware genomic prediction intervals</w:t>
       </w:r>
     </w:p>
     <w:p>
@@ -2959,6 +2959,117 @@
         <w:pStyle w:val="Heading2"/>
       </w:pPr>
       <w:r>
+        <w:t>Robustness analyses requested by internal review</w:t>
+      </w:r>
+    </w:p>
+    <w:p>
+      <w:r>
+        <w:t>The following analyses were added after the main results had been seen (deviation D7):</w:t>
+      </w:r>
+    </w:p>
+    <w:p>
+      <w:pPr>
+        <w:pStyle w:val="ListBullet"/>
+      </w:pPr>
+      <w:r>
+        <w:t>the granularity and family regimes described above;</w:t>
+      </w:r>
+    </w:p>
+    <w:p>
+      <w:pPr>
+        <w:pStyle w:val="ListBullet"/>
+      </w:pPr>
+      <w:r>
+        <w:t>conditional coverage on quintiles of maximum genomic relationship;</w:t>
+      </w:r>
+    </w:p>
+    <w:p>
+      <w:pPr>
+        <w:pStyle w:val="ListBullet"/>
+      </w:pPr>
+      <w:r>
+        <w:t>species-level paired tests, averaging traits within species (10 units);</w:t>
+      </w:r>
+    </w:p>
+    <w:p>
+      <w:pPr>
+        <w:pStyle w:val="ListBullet"/>
+      </w:pPr>
+      <w:r>
+        <w:t xml:space="preserve">a PEV-calibration diagnostic in the simulation, comparing the realised mean squared error of the genetic-value prediction with σ̂²_g </w:t>
+      </w:r>
+      <w:r>
+        <w:rPr>
+          <w:i/>
+        </w:rPr>
+        <w:t>d</w:t>
+      </w:r>
+      <w:r>
+        <w:t xml:space="preserve"> by quintile of </w:t>
+      </w:r>
+      <w:r>
+        <w:rPr>
+          <w:i/>
+        </w:rPr>
+        <w:t>d</w:t>
+      </w:r>
+      <w:r>
+        <w:t>;</w:t>
+      </w:r>
+    </w:p>
+    <w:p>
+      <w:pPr>
+        <w:pStyle w:val="ListBullet"/>
+      </w:pPr>
+      <w:r>
+        <w:t>a single-thread scaling benchmark on random subsets of the maize genotypes;</w:t>
+      </w:r>
+    </w:p>
+    <w:p>
+      <w:pPr>
+        <w:pStyle w:val="ListBullet"/>
+      </w:pPr>
+      <w:r>
+        <w:t>two competitor analyses:</w:t>
+      </w:r>
+    </w:p>
+    <w:p>
+      <w:r>
+        <w:t xml:space="preserve">  </w:t>
+      </w:r>
+      <w:r>
+        <w:rPr>
+          <w:i/>
+        </w:rPr>
+        <w:t xml:space="preserve"> an </w:t>
+      </w:r>
+      <w:r>
+        <w:t>oracle rescaling</w:t>
+      </w:r>
+      <w:r>
+        <w:rPr>
+          <w:i/>
+        </w:rPr>
+        <w:t xml:space="preserve">, in which each method's intervals were rescaled about their centre by the one constant giving exactly 0.90 pooled coverage on the test data, before recomputing the conditional error;   </w:t>
+      </w:r>
+      <w:r>
+        <w:t xml:space="preserve"> </w:t>
+      </w:r>
+      <w:r>
+        <w:rPr>
+          <w:i/>
+        </w:rPr>
+        <w:t>group CV+</w:t>
+      </w:r>
+      <w:r>
+        <w:t>, i.e. CV+ computed with the genomic-cluster folds of pool A, alone or combined with the random folds (GBLUP, R1 first repeat and R2 first seed).</w:t>
+      </w:r>
+    </w:p>
+    <w:p>
+      <w:pPr>
+        <w:pStyle w:val="Heading2"/>
+      </w:pPr>
+      <w:r>
         <w:t>Software, reproducibility and pre-specification</w:t>
       </w:r>
     </w:p>
@@ -4873,7 +4984,7 @@
     </w:p>
     <w:p>
       <w:r>
-        <w:t>Relatedness to the training population is the variable along which genomic-prediction intervals lose calibration. Kinship-aware conformal prediction uses the GBLUP prediction error variance as a relatedness covariate and calibrates on residuals from random and genomic-cluster cross-fitting. Across ten species and three predictors it restored near-nominal coverage that holds across relatedness levels, at modest computational cost. The calibration design, rather than the choice between conformal and parametric calibration, is what matters most.</w:t>
+        <w:t>Relatedness to the training population is the variable along which genomic-prediction intervals lose calibration. Kinship-aware conformal prediction uses the GBLUP prediction error variance as a relatedness covariate and calibrates on residuals from random and genomic-cluster cross-fitting. Across ten species and three predictors it restored near-nominal coverage that holds across relatedness levels, at modest computational cost. The calibration design, rather than the choice between conformal and parametric calibration, is what matters most. Simpler fixes can match KinCP within a single known deployment regime, such as group CV+ for new clusters. KinCP, by conditioning on each candidate's relatedness, remained calibrated across regimes.</w:t>
       </w:r>
     </w:p>
     <w:p>
@@ -5203,7 +5314,7 @@
         <w:rPr>
           <w:b/>
         </w:rPr>
-        <w:t>"Kinship-aware conformal prediction intervals for genomic prediction across ten plant and animal species"</w:t>
+        <w:t>"Relatedness-aware calibration of genomic prediction intervals: kinship-aware conformal prediction across ten plant and animal species"</w:t>
       </w:r>
       <w:r>
         <w:t xml:space="preserve"> for consideration as an Investigation in GENETICS, in the area of Systems &amp; Computational Genetics (statistical methods / genomic prediction).</w:t>
@@ -5246,7 +5357,7 @@
         <w:pStyle w:val="ListBullet"/>
       </w:pPr>
       <w:r>
-        <w:t>Ablations show that the relatedness-diverse calibration pool, rather than conformalisation itself, is the decisive ingredient. We report this openly and give practical recommendations.</w:t>
+        <w:t>Ablations and competitor analyses show that a relatedness-diverse calibration pool, rather than conformalisation itself, is the decisive ingredient. Within a single known regime, simpler fixes (a parametric calibration on the same pool, or group CV+ for new clusters) perform comparably. We report this openly and give practical recommendations.</w:t>
       </w:r>
     </w:p>
     <w:p>

</xml_diff>

<commit_message>
Review round 10: final adversarial review and fixes
Co-Authored-By: Claude Opus 5.5 <noreply@anthropic.com>
Claude-Session: https://claude.ai/code/session_01CEw45wY536Kpddzc67ktHR
</commit_message>
<xml_diff>
--- a/Target_Journal_Submission/manuscript/Final_Manuscript.docx
+++ b/Target_Journal_Submission/manuscript/Final_Manuscript.docx
@@ -3282,8 +3282,10 @@
         <w:t>vs.</w:t>
       </w:r>
       <w:r>
-        <w:t xml:space="preserve"> 2.46 phenotypic SD for CV+), as required to reach coverage. </w:t>
-      </w:r>
+        <w:t xml:space="preserve"> 2.46 phenotypic SD for CV+), as required to reach coverage.</w:t>
+      </w:r>
+    </w:p>
+    <w:p>
       <w:r>
         <w:rPr>
           <w:b/>
@@ -3300,7 +3302,7 @@
         <w:t>not</w:t>
       </w:r>
       <w:r>
-        <w:t xml:space="preserve"> better than the main alternatives. The mean scores were 3.91 for KinCP and 4.06 for CV+ under R2. The Holm-adjusted </w:t>
+        <w:t xml:space="preserve"> better than the main alternatives. The mean scores were 3.91 for KinCP and 4.06 for CV+ under R2. Holm-adjusted </w:t>
       </w:r>
       <w:r>
         <w:rPr>
@@ -3309,7 +3311,34 @@
         <w:t>P</w:t>
       </w:r>
       <w:r>
-        <w:t>-values were = 0.983 against CV+, = 1.000 against Gauss-PEV and = 1.000 against CalPred-style on pool A. KinCP was significantly better only than SCP (</w:t>
+        <w:t xml:space="preserve">-values were: against CV+, </w:t>
+      </w:r>
+      <w:r>
+        <w:rPr>
+          <w:i/>
+        </w:rPr>
+        <w:t>P</w:t>
+      </w:r>
+      <w:r>
+        <w:t xml:space="preserve"> = 0.983; against Gauss-PEV, </w:t>
+      </w:r>
+      <w:r>
+        <w:rPr>
+          <w:i/>
+        </w:rPr>
+        <w:t>P</w:t>
+      </w:r>
+      <w:r>
+        <w:t xml:space="preserve"> = 1.000; against CalPred-style on pool A, </w:t>
+      </w:r>
+      <w:r>
+        <w:rPr>
+          <w:i/>
+        </w:rPr>
+        <w:t>P</w:t>
+      </w:r>
+      <w:r>
+        <w:t xml:space="preserve"> = 1.000. KinCP was significantly better only than SCP (</w:t>
       </w:r>
       <w:r>
         <w:rPr>
@@ -4192,7 +4221,7 @@
         <w:t>Cost</w:t>
       </w:r>
       <w:r>
-        <w:t xml:space="preserve"> (Table 7; Figure 8). Building KinCP's two calibration pools requires ten additional model fits per training set. For the kernel models these inner fits reuse the outer-fold variance ratio and need only a Cholesky factorisation, whereas the single outer fit includes REML with an eigendecomposition. The median cost of both pools relative to one outer fit was 1.9× for GBLUP, 1.3× for RKHS and 8.3× for LightGBM. For maize (about 3,500 training individuals), one GBLUP fit took 10.6 s on one CPU thread and both pools 7.7 s. Computing all interval methods from the pools took at most 6.27 s per fold. In a controlled benchmark on maize genotypes (Figure 8), with 3,500 training individuals on one thread:</w:t>
+        <w:t xml:space="preserve"> (Table 7; Figure 8). Building KinCP's two calibration pools requires ten additional model fits per training set. For the kernel models these inner fits reuse the outer-fold variance ratio and need only a Cholesky factorisation, whereas the single outer fit includes REML with an eigendecomposition. The median cost of both pools relative to one outer fit was 1.9× for GBLUP, 1.3× for RKHS and 8.3× for LightGBM. These ratios come from the main runs, in which four jobs shared four cores. Computing all interval methods from the pools, including every sensitivity variant, took at most 6.27 s per fold. In a controlled benchmark on maize genotypes (Figure 8), with 3,500 training individuals on one thread:</w:t>
       </w:r>
     </w:p>
     <w:p>
@@ -4229,7 +4258,7 @@
     </w:p>
     <w:p>
       <w:r>
-        <w:t xml:space="preserve">Pool time grew with training-set size to the power 2.0, and memory to the power 1.7. These exponents follow the dense </w:t>
+        <w:t xml:space="preserve">Over this range, pool time grew with training-set size to the power 2.0 and memory to the power 1.7. This is below the asymptotic </w:t>
       </w:r>
       <w:r>
         <w:rPr>
@@ -4247,7 +4276,7 @@
         <w:t>n</w:t>
       </w:r>
       <w:r>
-        <w:t xml:space="preserve">³) factorisations and </w:t>
+        <w:t xml:space="preserve">³) cost of dense factorisations and </w:t>
       </w:r>
       <w:r>
         <w:rPr>
@@ -4265,7 +4294,16 @@
         <w:t>n</w:t>
       </w:r>
       <w:r>
-        <w:t>²) relationship matrices of GBLUP itself. The overhead is therefore that of a standard five-fold cross-validation run twice, and is small relative to phenotyping or genotyping costs. The pools depend only on the training set, so they are built once and reused for any number of candidate batches. The per-candidate cost of KinCP is then a weighted quantile of the pool scores.</w:t>
+        <w:t xml:space="preserve">²) memory of relationship matrices, which dominate only at larger </w:t>
+      </w:r>
+      <w:r>
+        <w:rPr>
+          <w:i/>
+        </w:rPr>
+        <w:t>n</w:t>
+      </w:r>
+      <w:r>
+        <w:t>. KinCP therefore scales like GBLUP itself. The overhead is therefore that of a standard five-fold cross-validation run twice, and is small relative to phenotyping or genotyping costs. The pools depend only on the training set, so they are built once and reused for any number of candidate batches. The per-candidate cost of KinCP is then a weighted quantile of the pool scores.</w:t>
       </w:r>
     </w:p>
     <w:p>
@@ -4449,7 +4487,7 @@
         <w:pStyle w:val="ListBullet"/>
       </w:pPr>
       <w:r>
-        <w:t>conformal intervals calibrated on random hold-outs were too narrow for weakly related candidates and too wide for close relatives;</w:t>
+        <w:t>conformal intervals calibrated on random hold-outs were too wide for close relatives and, along the PEV-based relatedness covariate, too narrow for weakly related candidates;</w:t>
       </w:r>
     </w:p>
     <w:p>
@@ -4685,7 +4723,7 @@
     </w:p>
     <w:p>
       <w:r>
-        <w:t xml:space="preserve">The classical PEV interval was competitive under random cross-validation, which is the regime in which it is usually checked. It lost calibration under cluster-out deployment, mostly for traits with high within-cluster heritability. This complements the LR method of Legarra and Reverter (2018), which validates </w:t>
+        <w:t xml:space="preserve">The classical PEV interval was competitive under random cross-validation, which is the regime in which it is usually checked. It lost calibration under cluster-out deployment. In an exploratory analysis the loss was largest for traits with high REML heritability. This complements the LR method of Legarra and Reverter (2018), which validates </w:t>
       </w:r>
       <w:r>
         <w:rPr>

</xml_diff>

<commit_message>
Cover letter DOCX, DOCX schema order for line numbering, run_all builds references/PDF, reproducibility fixes
Co-Authored-By: Claude Opus 5.5 <noreply@anthropic.com>
Claude-Session: https://claude.ai/code/session_01CEw45wY536Kpddzc67ktHR
</commit_message>
<xml_diff>
--- a/Target_Journal_Submission/manuscript/Final_Manuscript.docx
+++ b/Target_Journal_Submission/manuscript/Final_Manuscript.docx
@@ -494,7 +494,7 @@
         <w:pStyle w:val="Heading1"/>
       </w:pPr>
       <w:r>
-        <w:t>Materials and methods</w:t>
+        <w:t>Materials and Methods</w:t>
       </w:r>
     </w:p>
     <w:p>
@@ -5379,7 +5379,7 @@
         <w:pStyle w:val="ListBullet"/>
       </w:pPr>
       <w:r>
-        <w:t>Relatedness-blind conformal intervals (split conformal, CV+) over-cover close relatives and under-cover distant candidates. For candidates from held-out genomic clusters their mean coverage of nominal 90% intervals fell to 0.828–0.838.</w:t>
+        <w:t>Relatedness-blind conformal intervals (split conformal, CV+) over-cover close relatives and, along the PEV-based relatedness covariate, under-cover distant candidates. For candidates from held-out genomic clusters, their mean coverage of nominal 90% intervals fell to 0.828–0.838.</w:t>
       </w:r>
     </w:p>
     <w:p>
@@ -5424,16 +5424,7 @@
         <w:t>et al.</w:t>
       </w:r>
       <w:r>
-        <w:t xml:space="preserve"> 2013) with modern distribution-free inference. It continues the journal's recent genomic-prediction methods literature, for example Gibbs </w:t>
-      </w:r>
-      <w:r>
-        <w:rPr>
-          <w:i/>
-        </w:rPr>
-        <w:t>et al.</w:t>
-      </w:r>
-      <w:r>
-        <w:t xml:space="preserve"> 2025 and Ahlinder and Waldmann 2026.</w:t>
+        <w:t xml:space="preserve"> 2013) with modern distribution-free inference. It continues the journal's recent genomic-prediction methods literature, for example Gibbs, Paril and Fournier-Level (2025, doi:10.1093/genetics/iyaf003) and Ahlinder and Waldmann (2026, doi:10.1093/genetics/iyag205).</w:t>
       </w:r>
     </w:p>
     <w:p>
@@ -43654,9 +43645,9 @@
       <w:footerReference w:type="default" r:id="rId9"/>
       <w:pgSz w:w="12240" w:h="15840"/>
       <w:pgMar w:top="1440" w:right="1440" w:bottom="1440" w:left="1440" w:header="720" w:footer="720" w:gutter="0"/>
+      <w:lnNumType w:countBy="1" w:restart="continuous" w:distance="360"/>
       <w:cols w:space="720"/>
       <w:docGrid w:linePitch="360"/>
-      <w:lnNumType w:countBy="1" w:restart="continuous" w:distance="360"/>
     </w:sectPr>
   </w:body>
 </w:document>

</xml_diff>

<commit_message>
Manuscript: PLOS Genetics title, S1-S3 File citations, supporting information section
Replace the reference to statistics_species.csv with S2 File, sheet
S4_stats_species (flagged by the PLOS Genetics editorial office), use PLOS
'S1/S2/S3 File' naming, and add a Supporting information section.

Co-Authored-By: Claude Opus 5.5 <noreply@anthropic.com>
Claude-Session: https://claude.ai/code/session_01CEw45wY536Kpddzc67ktHR
</commit_message>
<xml_diff>
--- a/Target_Journal_Submission/manuscript/Final_Manuscript.docx
+++ b/Target_Journal_Submission/manuscript/Final_Manuscript.docx
@@ -11,7 +11,7 @@
           <w:b/>
           <w:sz w:val="32"/>
         </w:rPr>
-        <w:t>Relatedness-aware calibration of genomic prediction intervals: kinship-aware conformal prediction across ten plant and animal species</w:t>
+        <w:t>Prediction intervals for genomic selection must account for relatedness: kinship-aware calibration across ten plant and animal species</w:t>
       </w:r>
     </w:p>
     <w:p>
@@ -486,7 +486,7 @@
     </w:p>
     <w:p>
       <w:r>
-        <w:t>The design, endpoints and statistical tests were fixed before any model was fitted (File S1).</w:t>
+        <w:t>The design, endpoints and statistical tests were fixed before any model was fitted (S1 File).</w:t>
       </w:r>
     </w:p>
     <w:p>
@@ -2269,7 +2269,7 @@
         <w:t>d</w:t>
       </w:r>
       <w:r>
-        <w:t xml:space="preserve"> (File S1, deviation D1). The floor depends only on genotype-derived covariates, never on outcomes.</w:t>
+        <w:t xml:space="preserve"> (S1 File, deviation D1). The floor depends only on genotype-derived covariates, never on outcomes.</w:t>
       </w:r>
     </w:p>
     <w:p>
@@ -2905,7 +2905,7 @@
     </w:p>
     <w:p>
       <w:r>
-        <w:t>Two variants were added after the main results had been seen, and are reported separately as exploratory (File S1, deviation D6). Both were run with GBLUP for R1 (first repeat) and R2 (first seed) on all units.</w:t>
+        <w:t>Two variants were added after the main results had been seen, and are reported separately as exploratory (S1 File, deviation D6). Both were run with GBLUP for R1 (first repeat) and R2 (first seed) on all units.</w:t>
       </w:r>
     </w:p>
     <w:p>
@@ -3084,7 +3084,7 @@
         <w:t>python run_all.py --mode full</w:t>
       </w:r>
       <w:r>
-        <w:t>) regenerates every result, table and figure from the public data, and every number in this article is inserted automatically from the generated result files. The study design was committed to version control before any model was fitted. File S1 lists all seven deviations from the pre-specified design: five made for compute reasons or found in a pipeline smoke test, and two (the exploratory variants and the robustness analyses requested by internal review) added after the main results had been seen.</w:t>
+        <w:t>) regenerates every result, table and figure from the public data, and every number in this article is inserted automatically from the generated result files. The study design was committed to version control before any model was fitted. S1 File lists all seven deviations from the pre-specified design: five made for compute reasons or found in a pipeline smoke test, and two (the exploratory variants and the robustness analyses requested by internal review) added after the main results had been seen.</w:t>
       </w:r>
     </w:p>
     <w:p>
@@ -3517,7 +3517,7 @@
         <w:t>P</w:t>
       </w:r>
       <w:r>
-        <w:t xml:space="preserve"> = 0.070). With 10 units and Holm adjustment over 21 comparisons, these species-level tests have limited power (Supplementary file statistics_species.csv).</w:t>
+        <w:t xml:space="preserve"> = 0.070). With 10 units and Holm adjustment over 21 comparisons, these species-level tests have limited power (S2 File, sheet S4_stats_species).</w:t>
       </w:r>
     </w:p>
     <w:p>
@@ -4202,7 +4202,7 @@
         <w:t>Near-duplicate genotypes.</w:t>
       </w:r>
       <w:r>
-        <w:t xml:space="preserve"> Removing near-duplicates did not change the conclusions (File S2, Table S_dedup). Under R2 KinCP covered 0.892 and CV+ 0.845; under R1 the figures were 0.902 and 0.904.</w:t>
+        <w:t xml:space="preserve"> Removing near-duplicates did not change the conclusions (S2 File, sheet S7_dedup). Under R2 KinCP covered 0.892 and CV+ 0.845; under R1 the figures were 0.902 and 0.904.</w:t>
       </w:r>
     </w:p>
     <w:p>
@@ -5044,7 +5044,7 @@
         <w:t>et al.</w:t>
       </w:r>
       <w:r>
-        <w:t xml:space="preserve"> 2025; Zenodo record 15348871, https://zenodo.org/records/15348871, CC-BY 4.0). The complete code, configuration, per-job results and the scripts that regenerate every table, figure and number in this article are provided as File S3. They will be deposited on Zenodo with a DOI upon acceptance [DOI to be inserted]. File S1 contains the pre-specified study design and the log of deviations. File S2 contains supplementary tables, including the per-unit results for every method, base predictor and regime.</w:t>
+        <w:t xml:space="preserve"> 2025; Zenodo record 15348871, https://zenodo.org/records/15348871, CC-BY 4.0). The complete code, configuration, per-job results and the scripts that regenerate every table, figure and number in this article are provided as S3 File. They will be deposited on Zenodo with a DOI upon acceptance [DOI to be inserted]. S1 File contains the pre-specified study design and the log of deviations. S2 File contains supplementary tables, including the per-unit results for every method, base predictor and regime.</w:t>
       </w:r>
     </w:p>
     <w:p>
@@ -5327,6 +5327,47 @@
     <w:p>
       <w:r>
         <w:t>Zhao K, Tung CW, Eizenga GC, Wright MH, Ali ML, Price AH, Norton GJ, Islam MR, Reynolds A, Mezey J, et al. 2011. Genome-wide association mapping reveals a rich genetic architecture of complex traits in Oryza sativa. Nature Communications. 2(1):467. doi:10.1038/ncomms1467</w:t>
+      </w:r>
+    </w:p>
+    <w:p>
+      <w:pPr>
+        <w:pStyle w:val="Heading1"/>
+      </w:pPr>
+      <w:r>
+        <w:t>Supporting information</w:t>
+      </w:r>
+    </w:p>
+    <w:p>
+      <w:r>
+        <w:rPr>
+          <w:b/>
+        </w:rPr>
+        <w:t>S1 File. Pre-specified study design and log of deviations.</w:t>
+      </w:r>
+      <w:r>
+        <w:t xml:space="preserve"> The design, endpoints and statistical tests fixed before any model was fitted, followed by deviations D1–D7 from that design (PDF).</w:t>
+      </w:r>
+    </w:p>
+    <w:p>
+      <w:r>
+        <w:rPr>
+          <w:b/>
+        </w:rPr>
+        <w:t>S2 File. Supplementary tables.</w:t>
+      </w:r>
+      <w:r>
+        <w:t xml:space="preserve"> Excel workbook with a README sheet and 15 machine-generated tables. Sheets include S1_all_units (per-unit results for every method, base predictor and regime), S2–S3 (paired tests for each base predictor), S4_stats_species (species-level paired tests), S5_maxkin_endpoint (conditional coverage on maximum genomic relationship), S6_oracle_rescaling, S7_dedup (near-duplicate removal), S8_simulation, S9_pev_calibration, S10_sensitivity, S11_runtime, S12_scaling, S13_selection, S14_error_units and S15_robustness_units (XLSX).</w:t>
+      </w:r>
+    </w:p>
+    <w:p>
+      <w:r>
+        <w:rPr>
+          <w:b/>
+        </w:rPr>
+        <w:t>S3 File. Source code.</w:t>
+      </w:r>
+      <w:r>
+        <w:t xml:space="preserve"> Complete analysis code: package, experiment runner, scripts, tests and configuration (ZIP).</w:t>
       </w:r>
     </w:p>
     <w:p>
@@ -11686,7 +11727,7 @@
         <w:t>Table 3</w:t>
       </w:r>
       <w:r>
-        <w:t xml:space="preserve"> Paired comparisons of KinCP with each alternative (GBLUP) on the relatedness-conditional coverage error (Cond. error) and the marginal coverage deviation (Abs. cov. deviation). Median diff. is the median paired difference (competitor − KinCP; positive favours KinCP), with its 95% bootstrap confidence interval (CI low, CI high). P is from a two-sided Wilcoxon signed-rank test; P (Holm) is adjusted within each endpoint family (all regimes × baseline competitors). Interval-score comparisons and all ablation comparisons are in File S2.</w:t>
+        <w:t xml:space="preserve"> Paired comparisons of KinCP with each alternative (GBLUP) on the relatedness-conditional coverage error (Cond. error) and the marginal coverage deviation (Abs. cov. deviation). Median diff. is the median paired difference (competitor − KinCP; positive favours KinCP), with its 95% bootstrap confidence interval (CI low, CI high). P is from a two-sided Wilcoxon signed-rank test; P (Holm) is adjusted within each endpoint family (all regimes × baseline competitors). Interval-score comparisons and all ablation comparisons are in S2 File.</w:t>
       </w:r>
     </w:p>
     <w:tbl>

</xml_diff>